<commit_message>
ATS-optimized resume: recruiter-friendly, all 5 portfolio projects, Java Full Stack keywords
Made-with: Cursor
</commit_message>
<xml_diff>
--- a/public/resume.docx
+++ b/public/resume.docx
@@ -60,14 +60,17 @@
         <w:spacing w:after="200"/>
       </w:pPr>
       <w:r>
-        <w:t xml:space="preserve">Java Full Stack Developer with 5+ years of experience building scalable enterprise applications. </w:t>
-      </w:r>
-      <w:r>
-        <w:rPr>
-          <w:i w:val="false"/>
-          <w:iCs w:val="false"/>
-        </w:rPr>
-        <w:t xml:space="preserve">Proficient in </w:t>
+        <w:t xml:space="preserve">Results-driven </w:t>
+      </w:r>
+      <w:r>
+        <w:rPr>
+          <w:b/>
+          <w:bCs/>
+        </w:rPr>
+        <w:t xml:space="preserve">Java Full Stack Developer</w:t>
+      </w:r>
+      <w:r>
+        <w:t xml:space="preserve"> with 5+ years of experience designing and delivering scalable enterprise applications. Expert in </w:t>
       </w:r>
       <w:r>
         <w:rPr>
@@ -77,10 +80,6 @@
         <w:t xml:space="preserve">Java</w:t>
       </w:r>
       <w:r>
-        <w:rPr>
-          <w:i w:val="false"/>
-          <w:iCs w:val="false"/>
-        </w:rPr>
         <w:t xml:space="preserve">, </w:t>
       </w:r>
       <w:r>
@@ -91,10 +90,6 @@
         <w:t xml:space="preserve">Spring Boot</w:t>
       </w:r>
       <w:r>
-        <w:rPr>
-          <w:i w:val="false"/>
-          <w:iCs w:val="false"/>
-        </w:rPr>
         <w:t xml:space="preserve">, </w:t>
       </w:r>
       <w:r>
@@ -105,10 +100,6 @@
         <w:t xml:space="preserve">Microservices</w:t>
       </w:r>
       <w:r>
-        <w:rPr>
-          <w:i w:val="false"/>
-          <w:iCs w:val="false"/>
-        </w:rPr>
         <w:t xml:space="preserve">, </w:t>
       </w:r>
       <w:r>
@@ -116,13 +107,9 @@
           <w:b/>
           <w:bCs/>
         </w:rPr>
-        <w:t xml:space="preserve"> REST APIs</w:t>
-      </w:r>
-      <w:r>
-        <w:rPr>
-          <w:i w:val="false"/>
-          <w:iCs w:val="false"/>
-        </w:rPr>
+        <w:t xml:space="preserve">REST APIs</w:t>
+      </w:r>
+      <w:r>
         <w:t xml:space="preserve">, </w:t>
       </w:r>
       <w:r>
@@ -133,38 +120,6 @@
         <w:t xml:space="preserve">React</w:t>
       </w:r>
       <w:r>
-        <w:rPr>
-          <w:i w:val="false"/>
-          <w:iCs w:val="false"/>
-        </w:rPr>
-        <w:t xml:space="preserve">, </w:t>
-      </w:r>
-      <w:r>
-        <w:rPr>
-          <w:b/>
-          <w:bCs/>
-        </w:rPr>
-        <w:t xml:space="preserve">Docker</w:t>
-      </w:r>
-      <w:r>
-        <w:rPr>
-          <w:i w:val="false"/>
-          <w:iCs w:val="false"/>
-        </w:rPr>
-        <w:t xml:space="preserve">, </w:t>
-      </w:r>
-      <w:r>
-        <w:rPr>
-          <w:b/>
-          <w:bCs/>
-        </w:rPr>
-        <w:t xml:space="preserve">Kubernetes</w:t>
-      </w:r>
-      <w:r>
-        <w:rPr>
-          <w:i w:val="false"/>
-          <w:iCs w:val="false"/>
-        </w:rPr>
         <w:t xml:space="preserve">, and </w:t>
       </w:r>
       <w:r>
@@ -175,7 +130,7 @@
         <w:t xml:space="preserve">AWS</w:t>
       </w:r>
       <w:r>
-        <w:t xml:space="preserve">. Delivered backend services, cloud-native systems, and modern web interfaces for financial services, restaurant tech, and energy sectors. AWS Certified DevOps Engineer – Professional, Solutions Architect – Associate, and HashiCorp Terraform Associate. Strong focus on system design, API development, CI/CD, and infrastructure as code.</w:t>
+        <w:t xml:space="preserve"> cloud platforms. Proven track record building high-performance backend services, RESTful APIs, and modern React/Angular interfaces for financial services, fintech, and enterprise sectors. AWS Certified DevOps Engineer – Professional, Solutions Architect – Associate, and HashiCorp Terraform Associate. Passionate about clean code, system design, CI/CD automation, and infrastructure as code. Strong collaborator in Agile/Scrum teams.</w:t>
       </w:r>
     </w:p>
     <w:p>
@@ -202,17 +157,7 @@
         <w:t xml:space="preserve">Backend:</w:t>
       </w:r>
       <w:r>
-        <w:t xml:space="preserve"> Java, Java 17, Spring Boot, Spring MVC, Spring Security, Spring Data JPA, Hibernate, Microservices, RESTful APIs, Event-Driven Architecture | </w:t>
-      </w:r>
-      <w:r>
-        <w:rPr>
-          <w:b/>
-          <w:bCs/>
-        </w:rPr>
-        <w:t xml:space="preserve">Messaging &amp; Data:</w:t>
-      </w:r>
-      <w:r>
-        <w:t xml:space="preserve"> Redis, RabbitMQ, Kafka, ETL Pipelines, Data Integration, Data Validation, SQL Optimization | </w:t>
+        <w:t xml:space="preserve"> Java, Java 11/17, Spring Boot, Spring MVC, Spring Security, Spring Data JPA, Hibernate, Microservices, RESTful APIs, Event-Driven Architecture | </w:t>
       </w:r>
       <w:r>
         <w:rPr>
@@ -222,7 +167,7 @@
         <w:t xml:space="preserve">Frontend:</w:t>
       </w:r>
       <w:r>
-        <w:t xml:space="preserve"> React, Angular 17, JavaScript, HTML5, CSS3 | </w:t>
+        <w:t xml:space="preserve"> React, Angular 17, JavaScript, TypeScript, HTML5, CSS3 | </w:t>
       </w:r>
       <w:r>
         <w:rPr>
@@ -232,7 +177,7 @@
         <w:t xml:space="preserve">Cloud &amp; DevOps:</w:t>
       </w:r>
       <w:r>
-        <w:t xml:space="preserve"> AWS (ECS, EC2, ECR), Docker, Kubernetes, Terraform, CI/CD, Bitbucket Pipelines, Jenkins | </w:t>
+        <w:t xml:space="preserve"> AWS (ECS, EC2, ECR, S3), Docker, Kubernetes, Terraform, CI/CD, Bitbucket Pipelines, Jenkins | </w:t>
       </w:r>
       <w:r>
         <w:rPr>
@@ -242,17 +187,27 @@
         <w:t xml:space="preserve">Databases:</w:t>
       </w:r>
       <w:r>
-        <w:t xml:space="preserve"> Oracle, SQL, MySQL, PostgreSQL, MongoDB | </w:t>
-      </w:r>
-      <w:r>
-        <w:rPr>
-          <w:b/>
-          <w:bCs/>
-        </w:rPr>
-        <w:t xml:space="preserve">Other:</w:t>
-      </w:r>
-      <w:r>
-        <w:t xml:space="preserve"> Agile, Git, Data Workflows, GitHub Copilot</w:t>
+        <w:t xml:space="preserve"> Oracle, MySQL, PostgreSQL, MongoDB, SQL | </w:t>
+      </w:r>
+      <w:r>
+        <w:rPr>
+          <w:b/>
+          <w:bCs/>
+        </w:rPr>
+        <w:t xml:space="preserve">Messaging:</w:t>
+      </w:r>
+      <w:r>
+        <w:t xml:space="preserve"> Redis, RabbitMQ, Kafka, ETL Pipelines | </w:t>
+      </w:r>
+      <w:r>
+        <w:rPr>
+          <w:b/>
+          <w:bCs/>
+        </w:rPr>
+        <w:t xml:space="preserve">Tools:</w:t>
+      </w:r>
+      <w:r>
+        <w:t xml:space="preserve"> Git, Agile/Scrum, JIRA, GitHub Copilot</w:t>
       </w:r>
     </w:p>
     <w:p>
@@ -879,7 +834,7 @@
         <w:spacing w:after="120" w:before="240"/>
       </w:pPr>
       <w:r>
-        <w:t xml:space="preserve">Key Projects</w:t>
+        <w:t xml:space="preserve">Portfolio Projects</w:t>
       </w:r>
     </w:p>
     <w:p>
@@ -898,7 +853,26 @@
         <w:t xml:space="preserve">Retirement Investment Management Platform</w:t>
       </w:r>
       <w:r>
-        <w:t xml:space="preserve"> — Spring Boot, JWT, React. Secure financial services for retirement planning and portfolio management.</w:t>
+        <w:t xml:space="preserve"> — Spring Boot, JWT, React. Secure financial services for retirement planning and portfolio management. github.com/sivaganesh1407/retirement-investment-management-platform</w:t>
+      </w:r>
+    </w:p>
+    <w:p>
+      <w:pPr>
+        <w:pStyle w:val="ListParagraph"/>
+        <w:numPr>
+          <w:ilvl w:val="0"/>
+          <w:numId w:val="1"/>
+        </w:numPr>
+      </w:pPr>
+      <w:r>
+        <w:rPr>
+          <w:b/>
+          <w:bCs/>
+        </w:rPr>
+        <w:t xml:space="preserve">Investment Portfolio Manager</w:t>
+      </w:r>
+      <w:r>
+        <w:t xml:space="preserve"> — Spring Boot, React. Full-stack investment portfolio management for tracking assets and analyzing financial data. github.com/sivaganesh1407/sivaganesh1407-investment-portfolio-manager</w:t>
       </w:r>
     </w:p>
     <w:p>
@@ -917,7 +891,7 @@
         <w:t xml:space="preserve">Smart Restaurant Platform</w:t>
       </w:r>
       <w:r>
-        <w:t xml:space="preserve"> — Spring Boot, React, MySQL. Full-stack menu, orders, inventory, and sales analytics.</w:t>
+        <w:t xml:space="preserve"> — Spring Boot, React, MySQL. Full-stack menu, orders, inventory, and sales analytics. github.com/sivaganesh1407/smart-restaurant-platform</w:t>
       </w:r>
     </w:p>
     <w:p>
@@ -936,7 +910,41 @@
         <w:t xml:space="preserve">User Management Service</w:t>
       </w:r>
       <w:r>
-        <w:t xml:space="preserve"> — Spring Boot, JPA, H2. REST API for user management and authentication.</w:t>
+        <w:t xml:space="preserve"> — Spring Boot, JPA, H2. REST API for user management and authentication. github.com/sivaganesh1407/user-management-service</w:t>
+      </w:r>
+    </w:p>
+    <w:p>
+      <w:pPr>
+        <w:pStyle w:val="ListParagraph"/>
+        <w:numPr>
+          <w:ilvl w:val="0"/>
+          <w:numId w:val="1"/>
+        </w:numPr>
+      </w:pPr>
+      <w:r>
+        <w:rPr>
+          <w:b/>
+          <w:bCs/>
+        </w:rPr>
+        <w:t xml:space="preserve">Restaurant Order Service</w:t>
+      </w:r>
+      <w:r>
+        <w:t xml:space="preserve"> — Spring Boot, Microservices. Microservice for restaurant order management and integration. github.com/sivaganesh1407/restaurant-order-service</w:t>
+      </w:r>
+    </w:p>
+    <w:p>
+      <w:pPr>
+        <w:spacing w:before="120"/>
+      </w:pPr>
+      <w:r>
+        <w:rPr>
+          <w:b/>
+          <w:bCs/>
+        </w:rPr>
+        <w:t xml:space="preserve">Portfolio:</w:t>
+      </w:r>
+      <w:r>
+        <w:t xml:space="preserve"> sivaganesh1407.vercel.app</w:t>
       </w:r>
     </w:p>
     <w:sectPr>

</xml_diff>

<commit_message>
Revert resume to original format: Professional Summary, Technical Skills order, Key Projects (3)
Made-with: Cursor
</commit_message>
<xml_diff>
--- a/public/resume.docx
+++ b/public/resume.docx
@@ -60,17 +60,14 @@
         <w:spacing w:after="200"/>
       </w:pPr>
       <w:r>
-        <w:t xml:space="preserve">Results-driven </w:t>
-      </w:r>
-      <w:r>
-        <w:rPr>
-          <w:b/>
-          <w:bCs/>
-        </w:rPr>
-        <w:t xml:space="preserve">Java Full Stack Developer</w:t>
-      </w:r>
-      <w:r>
-        <w:t xml:space="preserve"> with 5+ years of experience designing and delivering scalable enterprise applications. Expert in </w:t>
+        <w:t xml:space="preserve">Java Full Stack Developer with 5+ years of experience building scalable enterprise applications. </w:t>
+      </w:r>
+      <w:r>
+        <w:rPr>
+          <w:i w:val="false"/>
+          <w:iCs w:val="false"/>
+        </w:rPr>
+        <w:t xml:space="preserve">Proficient in </w:t>
       </w:r>
       <w:r>
         <w:rPr>
@@ -80,6 +77,10 @@
         <w:t xml:space="preserve">Java</w:t>
       </w:r>
       <w:r>
+        <w:rPr>
+          <w:i w:val="false"/>
+          <w:iCs w:val="false"/>
+        </w:rPr>
         <w:t xml:space="preserve">, </w:t>
       </w:r>
       <w:r>
@@ -90,6 +91,10 @@
         <w:t xml:space="preserve">Spring Boot</w:t>
       </w:r>
       <w:r>
+        <w:rPr>
+          <w:i w:val="false"/>
+          <w:iCs w:val="false"/>
+        </w:rPr>
         <w:t xml:space="preserve">, </w:t>
       </w:r>
       <w:r>
@@ -100,6 +105,10 @@
         <w:t xml:space="preserve">Microservices</w:t>
       </w:r>
       <w:r>
+        <w:rPr>
+          <w:i w:val="false"/>
+          <w:iCs w:val="false"/>
+        </w:rPr>
         <w:t xml:space="preserve">, </w:t>
       </w:r>
       <w:r>
@@ -107,9 +116,13 @@
           <w:b/>
           <w:bCs/>
         </w:rPr>
-        <w:t xml:space="preserve">REST APIs</w:t>
-      </w:r>
-      <w:r>
+        <w:t xml:space="preserve"> REST APIs</w:t>
+      </w:r>
+      <w:r>
+        <w:rPr>
+          <w:i w:val="false"/>
+          <w:iCs w:val="false"/>
+        </w:rPr>
         <w:t xml:space="preserve">, </w:t>
       </w:r>
       <w:r>
@@ -120,6 +133,38 @@
         <w:t xml:space="preserve">React</w:t>
       </w:r>
       <w:r>
+        <w:rPr>
+          <w:i w:val="false"/>
+          <w:iCs w:val="false"/>
+        </w:rPr>
+        <w:t xml:space="preserve">, </w:t>
+      </w:r>
+      <w:r>
+        <w:rPr>
+          <w:b/>
+          <w:bCs/>
+        </w:rPr>
+        <w:t xml:space="preserve">Docker</w:t>
+      </w:r>
+      <w:r>
+        <w:rPr>
+          <w:i w:val="false"/>
+          <w:iCs w:val="false"/>
+        </w:rPr>
+        <w:t xml:space="preserve">, </w:t>
+      </w:r>
+      <w:r>
+        <w:rPr>
+          <w:b/>
+          <w:bCs/>
+        </w:rPr>
+        <w:t xml:space="preserve">Kubernetes</w:t>
+      </w:r>
+      <w:r>
+        <w:rPr>
+          <w:i w:val="false"/>
+          <w:iCs w:val="false"/>
+        </w:rPr>
         <w:t xml:space="preserve">, and </w:t>
       </w:r>
       <w:r>
@@ -130,7 +175,7 @@
         <w:t xml:space="preserve">AWS</w:t>
       </w:r>
       <w:r>
-        <w:t xml:space="preserve"> cloud platforms. Proven track record building high-performance backend services, RESTful APIs, and modern React/Angular interfaces for financial services, fintech, and enterprise sectors. AWS Certified DevOps Engineer – Professional, Solutions Architect – Associate, and HashiCorp Terraform Associate. Passionate about clean code, system design, CI/CD automation, and infrastructure as code. Strong collaborator in Agile/Scrum teams.</w:t>
+        <w:t xml:space="preserve">. Delivered backend services, cloud-native systems, and modern web interfaces for financial services, restaurant tech, and energy sectors. AWS Certified DevOps Engineer – Professional, Solutions Architect – Associate, and HashiCorp Terraform Associate. Strong focus on system design, API development, CI/CD, and infrastructure as code.</w:t>
       </w:r>
     </w:p>
     <w:p>
@@ -157,7 +202,17 @@
         <w:t xml:space="preserve">Backend:</w:t>
       </w:r>
       <w:r>
-        <w:t xml:space="preserve"> Java, Java 11/17, Spring Boot, Spring MVC, Spring Security, Spring Data JPA, Hibernate, Microservices, RESTful APIs, Event-Driven Architecture | </w:t>
+        <w:t xml:space="preserve"> Java, Java 17, Spring Boot, Spring MVC, Spring Security, Spring Data JPA, Hibernate, Microservices, RESTful APIs, Event-Driven Architecture | </w:t>
+      </w:r>
+      <w:r>
+        <w:rPr>
+          <w:b/>
+          <w:bCs/>
+        </w:rPr>
+        <w:t xml:space="preserve">Messaging &amp; Data:</w:t>
+      </w:r>
+      <w:r>
+        <w:t xml:space="preserve"> Redis, RabbitMQ, Kafka, ETL Pipelines, Data Integration, Data Validation, SQL Optimization | </w:t>
       </w:r>
       <w:r>
         <w:rPr>
@@ -167,7 +222,7 @@
         <w:t xml:space="preserve">Frontend:</w:t>
       </w:r>
       <w:r>
-        <w:t xml:space="preserve"> React, Angular 17, JavaScript, TypeScript, HTML5, CSS3 | </w:t>
+        <w:t xml:space="preserve"> React, Angular 17, JavaScript, HTML5, CSS3 | </w:t>
       </w:r>
       <w:r>
         <w:rPr>
@@ -177,7 +232,7 @@
         <w:t xml:space="preserve">Cloud &amp; DevOps:</w:t>
       </w:r>
       <w:r>
-        <w:t xml:space="preserve"> AWS (ECS, EC2, ECR, S3), Docker, Kubernetes, Terraform, CI/CD, Bitbucket Pipelines, Jenkins | </w:t>
+        <w:t xml:space="preserve"> AWS (ECS, EC2, ECR), Docker, Kubernetes, Terraform, CI/CD, Bitbucket Pipelines, Jenkins | </w:t>
       </w:r>
       <w:r>
         <w:rPr>
@@ -187,27 +242,17 @@
         <w:t xml:space="preserve">Databases:</w:t>
       </w:r>
       <w:r>
-        <w:t xml:space="preserve"> Oracle, MySQL, PostgreSQL, MongoDB, SQL | </w:t>
-      </w:r>
-      <w:r>
-        <w:rPr>
-          <w:b/>
-          <w:bCs/>
-        </w:rPr>
-        <w:t xml:space="preserve">Messaging:</w:t>
-      </w:r>
-      <w:r>
-        <w:t xml:space="preserve"> Redis, RabbitMQ, Kafka, ETL Pipelines | </w:t>
-      </w:r>
-      <w:r>
-        <w:rPr>
-          <w:b/>
-          <w:bCs/>
-        </w:rPr>
-        <w:t xml:space="preserve">Tools:</w:t>
-      </w:r>
-      <w:r>
-        <w:t xml:space="preserve"> Git, Agile/Scrum, JIRA, GitHub Copilot</w:t>
+        <w:t xml:space="preserve"> Oracle, SQL, MySQL, PostgreSQL, MongoDB | </w:t>
+      </w:r>
+      <w:r>
+        <w:rPr>
+          <w:b/>
+          <w:bCs/>
+        </w:rPr>
+        <w:t xml:space="preserve">Other:</w:t>
+      </w:r>
+      <w:r>
+        <w:t xml:space="preserve"> Agile, Git, Data Workflows, GitHub Copilot</w:t>
       </w:r>
     </w:p>
     <w:p>
@@ -834,7 +879,7 @@
         <w:spacing w:after="120" w:before="240"/>
       </w:pPr>
       <w:r>
-        <w:t xml:space="preserve">Portfolio Projects</w:t>
+        <w:t xml:space="preserve">Key Projects</w:t>
       </w:r>
     </w:p>
     <w:p>
@@ -853,26 +898,7 @@
         <w:t xml:space="preserve">Retirement Investment Management Platform</w:t>
       </w:r>
       <w:r>
-        <w:t xml:space="preserve"> — Spring Boot, JWT, React. Secure financial services for retirement planning and portfolio management. github.com/sivaganesh1407/retirement-investment-management-platform</w:t>
-      </w:r>
-    </w:p>
-    <w:p>
-      <w:pPr>
-        <w:pStyle w:val="ListParagraph"/>
-        <w:numPr>
-          <w:ilvl w:val="0"/>
-          <w:numId w:val="1"/>
-        </w:numPr>
-      </w:pPr>
-      <w:r>
-        <w:rPr>
-          <w:b/>
-          <w:bCs/>
-        </w:rPr>
-        <w:t xml:space="preserve">Investment Portfolio Manager</w:t>
-      </w:r>
-      <w:r>
-        <w:t xml:space="preserve"> — Spring Boot, React. Full-stack investment portfolio management for tracking assets and analyzing financial data. github.com/sivaganesh1407/sivaganesh1407-investment-portfolio-manager</w:t>
+        <w:t xml:space="preserve"> — Spring Boot, JWT, React. Secure financial services for retirement planning and portfolio management.</w:t>
       </w:r>
     </w:p>
     <w:p>
@@ -891,7 +917,7 @@
         <w:t xml:space="preserve">Smart Restaurant Platform</w:t>
       </w:r>
       <w:r>
-        <w:t xml:space="preserve"> — Spring Boot, React, MySQL. Full-stack menu, orders, inventory, and sales analytics. github.com/sivaganesh1407/smart-restaurant-platform</w:t>
+        <w:t xml:space="preserve"> — Spring Boot, React, MySQL. Full-stack menu, orders, inventory, and sales analytics.</w:t>
       </w:r>
     </w:p>
     <w:p>
@@ -910,41 +936,7 @@
         <w:t xml:space="preserve">User Management Service</w:t>
       </w:r>
       <w:r>
-        <w:t xml:space="preserve"> — Spring Boot, JPA, H2. REST API for user management and authentication. github.com/sivaganesh1407/user-management-service</w:t>
-      </w:r>
-    </w:p>
-    <w:p>
-      <w:pPr>
-        <w:pStyle w:val="ListParagraph"/>
-        <w:numPr>
-          <w:ilvl w:val="0"/>
-          <w:numId w:val="1"/>
-        </w:numPr>
-      </w:pPr>
-      <w:r>
-        <w:rPr>
-          <w:b/>
-          <w:bCs/>
-        </w:rPr>
-        <w:t xml:space="preserve">Restaurant Order Service</w:t>
-      </w:r>
-      <w:r>
-        <w:t xml:space="preserve"> — Spring Boot, Microservices. Microservice for restaurant order management and integration. github.com/sivaganesh1407/restaurant-order-service</w:t>
-      </w:r>
-    </w:p>
-    <w:p>
-      <w:pPr>
-        <w:spacing w:before="120"/>
-      </w:pPr>
-      <w:r>
-        <w:rPr>
-          <w:b/>
-          <w:bCs/>
-        </w:rPr>
-        <w:t xml:space="preserve">Portfolio:</w:t>
-      </w:r>
-      <w:r>
-        <w:t xml:space="preserve"> sivaganesh1407.vercel.app</w:t>
+        <w:t xml:space="preserve"> — Spring Boot, JPA, H2. REST API for user management and authentication.</w:t>
       </w:r>
     </w:p>
     <w:sectPr>

</xml_diff>

<commit_message>
Use custom resume: Siva_Ganesh_Golla_Resume-2.pdf and resume.docx, remove prebuild
Made-with: Cursor
</commit_message>
<xml_diff>
--- a/public/resume.docx
+++ b/public/resume.docx
@@ -60,14 +60,17 @@
         <w:spacing w:after="200"/>
       </w:pPr>
       <w:r>
-        <w:t xml:space="preserve">Java Full Stack Developer with 5+ years of experience building scalable enterprise applications. </w:t>
-      </w:r>
-      <w:r>
-        <w:rPr>
-          <w:i w:val="false"/>
-          <w:iCs w:val="false"/>
-        </w:rPr>
-        <w:t xml:space="preserve">Proficient in </w:t>
+        <w:t xml:space="preserve">Results-driven </w:t>
+      </w:r>
+      <w:r>
+        <w:rPr>
+          <w:b/>
+          <w:bCs/>
+        </w:rPr>
+        <w:t xml:space="preserve">Java Full Stack Developer</w:t>
+      </w:r>
+      <w:r>
+        <w:t xml:space="preserve"> with 5+ years of experience designing and delivering scalable enterprise applications. Expert in </w:t>
       </w:r>
       <w:r>
         <w:rPr>
@@ -77,10 +80,6 @@
         <w:t xml:space="preserve">Java</w:t>
       </w:r>
       <w:r>
-        <w:rPr>
-          <w:i w:val="false"/>
-          <w:iCs w:val="false"/>
-        </w:rPr>
         <w:t xml:space="preserve">, </w:t>
       </w:r>
       <w:r>
@@ -91,10 +90,6 @@
         <w:t xml:space="preserve">Spring Boot</w:t>
       </w:r>
       <w:r>
-        <w:rPr>
-          <w:i w:val="false"/>
-          <w:iCs w:val="false"/>
-        </w:rPr>
         <w:t xml:space="preserve">, </w:t>
       </w:r>
       <w:r>
@@ -105,10 +100,6 @@
         <w:t xml:space="preserve">Microservices</w:t>
       </w:r>
       <w:r>
-        <w:rPr>
-          <w:i w:val="false"/>
-          <w:iCs w:val="false"/>
-        </w:rPr>
         <w:t xml:space="preserve">, </w:t>
       </w:r>
       <w:r>
@@ -116,13 +107,9 @@
           <w:b/>
           <w:bCs/>
         </w:rPr>
-        <w:t xml:space="preserve"> REST APIs</w:t>
-      </w:r>
-      <w:r>
-        <w:rPr>
-          <w:i w:val="false"/>
-          <w:iCs w:val="false"/>
-        </w:rPr>
+        <w:t xml:space="preserve">REST APIs</w:t>
+      </w:r>
+      <w:r>
         <w:t xml:space="preserve">, </w:t>
       </w:r>
       <w:r>
@@ -133,38 +120,6 @@
         <w:t xml:space="preserve">React</w:t>
       </w:r>
       <w:r>
-        <w:rPr>
-          <w:i w:val="false"/>
-          <w:iCs w:val="false"/>
-        </w:rPr>
-        <w:t xml:space="preserve">, </w:t>
-      </w:r>
-      <w:r>
-        <w:rPr>
-          <w:b/>
-          <w:bCs/>
-        </w:rPr>
-        <w:t xml:space="preserve">Docker</w:t>
-      </w:r>
-      <w:r>
-        <w:rPr>
-          <w:i w:val="false"/>
-          <w:iCs w:val="false"/>
-        </w:rPr>
-        <w:t xml:space="preserve">, </w:t>
-      </w:r>
-      <w:r>
-        <w:rPr>
-          <w:b/>
-          <w:bCs/>
-        </w:rPr>
-        <w:t xml:space="preserve">Kubernetes</w:t>
-      </w:r>
-      <w:r>
-        <w:rPr>
-          <w:i w:val="false"/>
-          <w:iCs w:val="false"/>
-        </w:rPr>
         <w:t xml:space="preserve">, and </w:t>
       </w:r>
       <w:r>
@@ -175,7 +130,7 @@
         <w:t xml:space="preserve">AWS</w:t>
       </w:r>
       <w:r>
-        <w:t xml:space="preserve">. Delivered backend services, cloud-native systems, and modern web interfaces for financial services, restaurant tech, and energy sectors. AWS Certified DevOps Engineer – Professional, Solutions Architect – Associate, and HashiCorp Terraform Associate. Strong focus on system design, API development, CI/CD, and infrastructure as code.</w:t>
+        <w:t xml:space="preserve"> cloud platforms. Proven track record building high-performance backend services, RESTful APIs, and modern React/Angular interfaces for financial services, fintech, and enterprise sectors. AWS Certified DevOps Engineer – Professional, Solutions Architect – Associate, and HashiCorp Terraform Associate. Passionate about clean code, system design, CI/CD automation, and infrastructure as code. Strong collaborator in Agile/Scrum teams.</w:t>
       </w:r>
     </w:p>
     <w:p>
@@ -202,17 +157,7 @@
         <w:t xml:space="preserve">Backend:</w:t>
       </w:r>
       <w:r>
-        <w:t xml:space="preserve"> Java, Java 17, Spring Boot, Spring MVC, Spring Security, Spring Data JPA, Hibernate, Microservices, RESTful APIs, Event-Driven Architecture | </w:t>
-      </w:r>
-      <w:r>
-        <w:rPr>
-          <w:b/>
-          <w:bCs/>
-        </w:rPr>
-        <w:t xml:space="preserve">Messaging &amp; Data:</w:t>
-      </w:r>
-      <w:r>
-        <w:t xml:space="preserve"> Redis, RabbitMQ, Kafka, ETL Pipelines, Data Integration, Data Validation, SQL Optimization | </w:t>
+        <w:t xml:space="preserve"> Java, Java 11/17, Spring Boot, Spring MVC, Spring Security, Spring Data JPA, Hibernate, Microservices, RESTful APIs, Event-Driven Architecture | </w:t>
       </w:r>
       <w:r>
         <w:rPr>
@@ -222,7 +167,7 @@
         <w:t xml:space="preserve">Frontend:</w:t>
       </w:r>
       <w:r>
-        <w:t xml:space="preserve"> React, Angular 17, JavaScript, HTML5, CSS3 | </w:t>
+        <w:t xml:space="preserve"> React, Angular 17, JavaScript, TypeScript, HTML5, CSS3 | </w:t>
       </w:r>
       <w:r>
         <w:rPr>
@@ -232,7 +177,7 @@
         <w:t xml:space="preserve">Cloud &amp; DevOps:</w:t>
       </w:r>
       <w:r>
-        <w:t xml:space="preserve"> AWS (ECS, EC2, ECR), Docker, Kubernetes, Terraform, CI/CD, Bitbucket Pipelines, Jenkins | </w:t>
+        <w:t xml:space="preserve"> AWS (ECS, EC2, ECR, S3), Docker, Kubernetes, Terraform, CI/CD, Bitbucket Pipelines, Jenkins | </w:t>
       </w:r>
       <w:r>
         <w:rPr>
@@ -242,17 +187,27 @@
         <w:t xml:space="preserve">Databases:</w:t>
       </w:r>
       <w:r>
-        <w:t xml:space="preserve"> Oracle, SQL, MySQL, PostgreSQL, MongoDB | </w:t>
-      </w:r>
-      <w:r>
-        <w:rPr>
-          <w:b/>
-          <w:bCs/>
-        </w:rPr>
-        <w:t xml:space="preserve">Other:</w:t>
-      </w:r>
-      <w:r>
-        <w:t xml:space="preserve"> Agile, Git, Data Workflows, GitHub Copilot</w:t>
+        <w:t xml:space="preserve"> Oracle, MySQL, PostgreSQL, MongoDB, SQL | </w:t>
+      </w:r>
+      <w:r>
+        <w:rPr>
+          <w:b/>
+          <w:bCs/>
+        </w:rPr>
+        <w:t xml:space="preserve">Messaging:</w:t>
+      </w:r>
+      <w:r>
+        <w:t xml:space="preserve"> Redis, RabbitMQ, Kafka, ETL Pipelines | </w:t>
+      </w:r>
+      <w:r>
+        <w:rPr>
+          <w:b/>
+          <w:bCs/>
+        </w:rPr>
+        <w:t xml:space="preserve">Tools:</w:t>
+      </w:r>
+      <w:r>
+        <w:t xml:space="preserve"> Git, Agile/Scrum, JIRA, GitHub Copilot</w:t>
       </w:r>
     </w:p>
     <w:p>
@@ -879,7 +834,7 @@
         <w:spacing w:after="120" w:before="240"/>
       </w:pPr>
       <w:r>
-        <w:t xml:space="preserve">Key Projects</w:t>
+        <w:t xml:space="preserve">Portfolio Projects</w:t>
       </w:r>
     </w:p>
     <w:p>
@@ -898,7 +853,26 @@
         <w:t xml:space="preserve">Retirement Investment Management Platform</w:t>
       </w:r>
       <w:r>
-        <w:t xml:space="preserve"> — Spring Boot, JWT, React. Secure financial services for retirement planning and portfolio management.</w:t>
+        <w:t xml:space="preserve"> — Spring Boot, JWT, React. Secure financial services for retirement planning and portfolio management. github.com/sivaganesh1407/retirement-investment-management-platform</w:t>
+      </w:r>
+    </w:p>
+    <w:p>
+      <w:pPr>
+        <w:pStyle w:val="ListParagraph"/>
+        <w:numPr>
+          <w:ilvl w:val="0"/>
+          <w:numId w:val="1"/>
+        </w:numPr>
+      </w:pPr>
+      <w:r>
+        <w:rPr>
+          <w:b/>
+          <w:bCs/>
+        </w:rPr>
+        <w:t xml:space="preserve">Investment Portfolio Manager</w:t>
+      </w:r>
+      <w:r>
+        <w:t xml:space="preserve"> — Spring Boot, React. Full-stack investment portfolio management for tracking assets and analyzing financial data. github.com/sivaganesh1407/sivaganesh1407-investment-portfolio-manager</w:t>
       </w:r>
     </w:p>
     <w:p>
@@ -917,7 +891,7 @@
         <w:t xml:space="preserve">Smart Restaurant Platform</w:t>
       </w:r>
       <w:r>
-        <w:t xml:space="preserve"> — Spring Boot, React, MySQL. Full-stack menu, orders, inventory, and sales analytics.</w:t>
+        <w:t xml:space="preserve"> — Spring Boot, React, MySQL. Full-stack menu, orders, inventory, and sales analytics. github.com/sivaganesh1407/smart-restaurant-platform</w:t>
       </w:r>
     </w:p>
     <w:p>
@@ -936,7 +910,41 @@
         <w:t xml:space="preserve">User Management Service</w:t>
       </w:r>
       <w:r>
-        <w:t xml:space="preserve"> — Spring Boot, JPA, H2. REST API for user management and authentication.</w:t>
+        <w:t xml:space="preserve"> — Spring Boot, JPA, H2. REST API for user management and authentication. github.com/sivaganesh1407/user-management-service</w:t>
+      </w:r>
+    </w:p>
+    <w:p>
+      <w:pPr>
+        <w:pStyle w:val="ListParagraph"/>
+        <w:numPr>
+          <w:ilvl w:val="0"/>
+          <w:numId w:val="1"/>
+        </w:numPr>
+      </w:pPr>
+      <w:r>
+        <w:rPr>
+          <w:b/>
+          <w:bCs/>
+        </w:rPr>
+        <w:t xml:space="preserve">Restaurant Order Service</w:t>
+      </w:r>
+      <w:r>
+        <w:t xml:space="preserve"> — Spring Boot, Microservices. Microservice for restaurant order management and integration. github.com/sivaganesh1407/restaurant-order-service</w:t>
+      </w:r>
+    </w:p>
+    <w:p>
+      <w:pPr>
+        <w:spacing w:before="120"/>
+      </w:pPr>
+      <w:r>
+        <w:rPr>
+          <w:b/>
+          <w:bCs/>
+        </w:rPr>
+        <w:t xml:space="preserve">Portfolio:</w:t>
+      </w:r>
+      <w:r>
+        <w:t xml:space="preserve"> sivaganesh1407.vercel.app</w:t>
       </w:r>
     </w:p>
     <w:sectPr>

</xml_diff>

<commit_message>
Fix resume.docx: add page breaks before sections, keepLines for job blocks to prevent cutoff
Made-with: Cursor
</commit_message>
<xml_diff>
--- a/public/resume.docx
+++ b/public/resume.docx
@@ -60,17 +60,14 @@
         <w:spacing w:after="200"/>
       </w:pPr>
       <w:r>
-        <w:t xml:space="preserve">Results-driven </w:t>
-      </w:r>
-      <w:r>
-        <w:rPr>
-          <w:b/>
-          <w:bCs/>
-        </w:rPr>
-        <w:t xml:space="preserve">Java Full Stack Developer</w:t>
-      </w:r>
-      <w:r>
-        <w:t xml:space="preserve"> with 5+ years of experience designing and delivering scalable enterprise applications. Expert in </w:t>
+        <w:t xml:space="preserve">Java Full Stack Developer with 5+ years of experience building scalable enterprise applications. </w:t>
+      </w:r>
+      <w:r>
+        <w:rPr>
+          <w:i w:val="false"/>
+          <w:iCs w:val="false"/>
+        </w:rPr>
+        <w:t xml:space="preserve">Proficient in </w:t>
       </w:r>
       <w:r>
         <w:rPr>
@@ -80,6 +77,10 @@
         <w:t xml:space="preserve">Java</w:t>
       </w:r>
       <w:r>
+        <w:rPr>
+          <w:i w:val="false"/>
+          <w:iCs w:val="false"/>
+        </w:rPr>
         <w:t xml:space="preserve">, </w:t>
       </w:r>
       <w:r>
@@ -90,6 +91,10 @@
         <w:t xml:space="preserve">Spring Boot</w:t>
       </w:r>
       <w:r>
+        <w:rPr>
+          <w:i w:val="false"/>
+          <w:iCs w:val="false"/>
+        </w:rPr>
         <w:t xml:space="preserve">, </w:t>
       </w:r>
       <w:r>
@@ -100,6 +105,10 @@
         <w:t xml:space="preserve">Microservices</w:t>
       </w:r>
       <w:r>
+        <w:rPr>
+          <w:i w:val="false"/>
+          <w:iCs w:val="false"/>
+        </w:rPr>
         <w:t xml:space="preserve">, </w:t>
       </w:r>
       <w:r>
@@ -107,9 +116,13 @@
           <w:b/>
           <w:bCs/>
         </w:rPr>
-        <w:t xml:space="preserve">REST APIs</w:t>
-      </w:r>
-      <w:r>
+        <w:t xml:space="preserve"> REST APIs</w:t>
+      </w:r>
+      <w:r>
+        <w:rPr>
+          <w:i w:val="false"/>
+          <w:iCs w:val="false"/>
+        </w:rPr>
         <w:t xml:space="preserve">, </w:t>
       </w:r>
       <w:r>
@@ -120,6 +133,38 @@
         <w:t xml:space="preserve">React</w:t>
       </w:r>
       <w:r>
+        <w:rPr>
+          <w:i w:val="false"/>
+          <w:iCs w:val="false"/>
+        </w:rPr>
+        <w:t xml:space="preserve">, </w:t>
+      </w:r>
+      <w:r>
+        <w:rPr>
+          <w:b/>
+          <w:bCs/>
+        </w:rPr>
+        <w:t xml:space="preserve">Docker</w:t>
+      </w:r>
+      <w:r>
+        <w:rPr>
+          <w:i w:val="false"/>
+          <w:iCs w:val="false"/>
+        </w:rPr>
+        <w:t xml:space="preserve">, </w:t>
+      </w:r>
+      <w:r>
+        <w:rPr>
+          <w:b/>
+          <w:bCs/>
+        </w:rPr>
+        <w:t xml:space="preserve">Kubernetes</w:t>
+      </w:r>
+      <w:r>
+        <w:rPr>
+          <w:i w:val="false"/>
+          <w:iCs w:val="false"/>
+        </w:rPr>
         <w:t xml:space="preserve">, and </w:t>
       </w:r>
       <w:r>
@@ -130,7 +175,7 @@
         <w:t xml:space="preserve">AWS</w:t>
       </w:r>
       <w:r>
-        <w:t xml:space="preserve"> cloud platforms. Proven track record building high-performance backend services, RESTful APIs, and modern React/Angular interfaces for financial services, fintech, and enterprise sectors. AWS Certified DevOps Engineer – Professional, Solutions Architect – Associate, and HashiCorp Terraform Associate. Passionate about clean code, system design, CI/CD automation, and infrastructure as code. Strong collaborator in Agile/Scrum teams.</w:t>
+        <w:t xml:space="preserve">. Delivered backend services, cloud-native systems, and modern web interfaces for financial services, restaurant tech, and energy sectors. AWS Certified DevOps Engineer – Professional, Solutions Architect – Associate, and HashiCorp Terraform Associate. Strong focus on system design, API development, CI/CD, and infrastructure as code.</w:t>
       </w:r>
     </w:p>
     <w:p>
@@ -157,7 +202,17 @@
         <w:t xml:space="preserve">Backend:</w:t>
       </w:r>
       <w:r>
-        <w:t xml:space="preserve"> Java, Java 11/17, Spring Boot, Spring MVC, Spring Security, Spring Data JPA, Hibernate, Microservices, RESTful APIs, Event-Driven Architecture | </w:t>
+        <w:t xml:space="preserve"> Java, Java 17, Spring Boot, Spring MVC, Spring Security, Spring Data JPA, Hibernate, Microservices, RESTful APIs, Event-Driven Architecture | </w:t>
+      </w:r>
+      <w:r>
+        <w:rPr>
+          <w:b/>
+          <w:bCs/>
+        </w:rPr>
+        <w:t xml:space="preserve">Messaging &amp; Data:</w:t>
+      </w:r>
+      <w:r>
+        <w:t xml:space="preserve"> Redis, RabbitMQ, Kafka, ETL Pipelines, Data Integration, Data Validation, SQL Optimization | </w:t>
       </w:r>
       <w:r>
         <w:rPr>
@@ -167,7 +222,7 @@
         <w:t xml:space="preserve">Frontend:</w:t>
       </w:r>
       <w:r>
-        <w:t xml:space="preserve"> React, Angular 17, JavaScript, TypeScript, HTML5, CSS3 | </w:t>
+        <w:t xml:space="preserve"> React, Angular 17, JavaScript, HTML5, CSS3 | </w:t>
       </w:r>
       <w:r>
         <w:rPr>
@@ -177,7 +232,7 @@
         <w:t xml:space="preserve">Cloud &amp; DevOps:</w:t>
       </w:r>
       <w:r>
-        <w:t xml:space="preserve"> AWS (ECS, EC2, ECR, S3), Docker, Kubernetes, Terraform, CI/CD, Bitbucket Pipelines, Jenkins | </w:t>
+        <w:t xml:space="preserve"> AWS (ECS, EC2, ECR), Docker, Kubernetes, Terraform, CI/CD, Bitbucket Pipelines, Jenkins | </w:t>
       </w:r>
       <w:r>
         <w:rPr>
@@ -187,32 +242,23 @@
         <w:t xml:space="preserve">Databases:</w:t>
       </w:r>
       <w:r>
-        <w:t xml:space="preserve"> Oracle, MySQL, PostgreSQL, MongoDB, SQL | </w:t>
-      </w:r>
-      <w:r>
-        <w:rPr>
-          <w:b/>
-          <w:bCs/>
-        </w:rPr>
-        <w:t xml:space="preserve">Messaging:</w:t>
-      </w:r>
-      <w:r>
-        <w:t xml:space="preserve"> Redis, RabbitMQ, Kafka, ETL Pipelines | </w:t>
-      </w:r>
-      <w:r>
-        <w:rPr>
-          <w:b/>
-          <w:bCs/>
-        </w:rPr>
-        <w:t xml:space="preserve">Tools:</w:t>
-      </w:r>
-      <w:r>
-        <w:t xml:space="preserve"> Git, Agile/Scrum, JIRA, GitHub Copilot</w:t>
+        <w:t xml:space="preserve"> Oracle, SQL, MySQL, PostgreSQL, MongoDB | </w:t>
+      </w:r>
+      <w:r>
+        <w:rPr>
+          <w:b/>
+          <w:bCs/>
+        </w:rPr>
+        <w:t xml:space="preserve">Other:</w:t>
+      </w:r>
+      <w:r>
+        <w:t xml:space="preserve"> Agile, Git, Data Workflows, GitHub Copilot</w:t>
       </w:r>
     </w:p>
     <w:p>
       <w:pPr>
         <w:pStyle w:val="Heading2"/>
+        <w:pageBreakBefore/>
         <w:pBdr>
           <w:bottom w:val="single" w:color="333333" w:sz="6" w:space="1"/>
         </w:pBdr>
@@ -224,6 +270,7 @@
     </w:p>
     <w:p>
       <w:pPr>
+        <w:keepLines/>
         <w:spacing w:after="80"/>
       </w:pPr>
       <w:r>
@@ -319,6 +366,7 @@
     </w:p>
     <w:p>
       <w:pPr>
+        <w:keepLines/>
         <w:spacing w:after="80"/>
       </w:pPr>
       <w:r>
@@ -402,6 +450,7 @@
     </w:p>
     <w:p>
       <w:pPr>
+        <w:keepLines/>
         <w:spacing w:after="80"/>
       </w:pPr>
       <w:r>
@@ -461,6 +510,7 @@
     </w:p>
     <w:p>
       <w:pPr>
+        <w:keepLines/>
         <w:spacing w:after="80"/>
       </w:pPr>
       <w:r>
@@ -580,6 +630,7 @@
     </w:p>
     <w:p>
       <w:pPr>
+        <w:keepLines/>
         <w:spacing w:after="80"/>
       </w:pPr>
       <w:r>
@@ -700,6 +751,7 @@
     <w:p>
       <w:pPr>
         <w:pStyle w:val="Heading2"/>
+        <w:pageBreakBefore/>
         <w:pBdr>
           <w:bottom w:val="single" w:color="333333" w:sz="6" w:space="1"/>
         </w:pBdr>
@@ -770,6 +822,7 @@
     <w:p>
       <w:pPr>
         <w:pStyle w:val="Heading2"/>
+        <w:pageBreakBefore/>
         <w:pBdr>
           <w:bottom w:val="single" w:color="333333" w:sz="6" w:space="1"/>
         </w:pBdr>
@@ -828,13 +881,14 @@
     <w:p>
       <w:pPr>
         <w:pStyle w:val="Heading2"/>
+        <w:pageBreakBefore/>
         <w:pBdr>
           <w:bottom w:val="single" w:color="333333" w:sz="6" w:space="1"/>
         </w:pBdr>
         <w:spacing w:after="120" w:before="240"/>
       </w:pPr>
       <w:r>
-        <w:t xml:space="preserve">Portfolio Projects</w:t>
+        <w:t xml:space="preserve">Key Projects</w:t>
       </w:r>
     </w:p>
     <w:p>
@@ -853,26 +907,7 @@
         <w:t xml:space="preserve">Retirement Investment Management Platform</w:t>
       </w:r>
       <w:r>
-        <w:t xml:space="preserve"> — Spring Boot, JWT, React. Secure financial services for retirement planning and portfolio management. github.com/sivaganesh1407/retirement-investment-management-platform</w:t>
-      </w:r>
-    </w:p>
-    <w:p>
-      <w:pPr>
-        <w:pStyle w:val="ListParagraph"/>
-        <w:numPr>
-          <w:ilvl w:val="0"/>
-          <w:numId w:val="1"/>
-        </w:numPr>
-      </w:pPr>
-      <w:r>
-        <w:rPr>
-          <w:b/>
-          <w:bCs/>
-        </w:rPr>
-        <w:t xml:space="preserve">Investment Portfolio Manager</w:t>
-      </w:r>
-      <w:r>
-        <w:t xml:space="preserve"> — Spring Boot, React. Full-stack investment portfolio management for tracking assets and analyzing financial data. github.com/sivaganesh1407/sivaganesh1407-investment-portfolio-manager</w:t>
+        <w:t xml:space="preserve"> — Spring Boot, JWT, React. Secure financial services for retirement planning and portfolio management.</w:t>
       </w:r>
     </w:p>
     <w:p>
@@ -891,7 +926,7 @@
         <w:t xml:space="preserve">Smart Restaurant Platform</w:t>
       </w:r>
       <w:r>
-        <w:t xml:space="preserve"> — Spring Boot, React, MySQL. Full-stack menu, orders, inventory, and sales analytics. github.com/sivaganesh1407/smart-restaurant-platform</w:t>
+        <w:t xml:space="preserve"> — Spring Boot, React, MySQL. Full-stack menu, orders, inventory, and sales analytics.</w:t>
       </w:r>
     </w:p>
     <w:p>
@@ -910,41 +945,7 @@
         <w:t xml:space="preserve">User Management Service</w:t>
       </w:r>
       <w:r>
-        <w:t xml:space="preserve"> — Spring Boot, JPA, H2. REST API for user management and authentication. github.com/sivaganesh1407/user-management-service</w:t>
-      </w:r>
-    </w:p>
-    <w:p>
-      <w:pPr>
-        <w:pStyle w:val="ListParagraph"/>
-        <w:numPr>
-          <w:ilvl w:val="0"/>
-          <w:numId w:val="1"/>
-        </w:numPr>
-      </w:pPr>
-      <w:r>
-        <w:rPr>
-          <w:b/>
-          <w:bCs/>
-        </w:rPr>
-        <w:t xml:space="preserve">Restaurant Order Service</w:t>
-      </w:r>
-      <w:r>
-        <w:t xml:space="preserve"> — Spring Boot, Microservices. Microservice for restaurant order management and integration. github.com/sivaganesh1407/restaurant-order-service</w:t>
-      </w:r>
-    </w:p>
-    <w:p>
-      <w:pPr>
-        <w:spacing w:before="120"/>
-      </w:pPr>
-      <w:r>
-        <w:rPr>
-          <w:b/>
-          <w:bCs/>
-        </w:rPr>
-        <w:t xml:space="preserve">Portfolio:</w:t>
-      </w:r>
-      <w:r>
-        <w:t xml:space="preserve"> sivaganesh1407.vercel.app</w:t>
+        <w:t xml:space="preserve"> — Spring Boot, JPA, H2. REST API for user management and authentication.</w:t>
       </w:r>
     </w:p>
     <w:sectPr>

</xml_diff>

<commit_message>
ATS format: reduce spacing, margins in PDF and Word resumes, no extra space
Made-with: Cursor
</commit_message>
<xml_diff>
--- a/public/resume.docx
+++ b/public/resume.docx
@@ -32,7 +32,7 @@
     </w:p>
     <w:p>
       <w:pPr>
-        <w:spacing w:after="200"/>
+        <w:spacing w:after="120"/>
         <w:jc w:val="center"/>
       </w:pPr>
       <w:r>
@@ -49,7 +49,7 @@
         <w:pBdr>
           <w:bottom w:val="single" w:color="333333" w:sz="6" w:space="1"/>
         </w:pBdr>
-        <w:spacing w:after="120" w:before="240"/>
+        <w:spacing w:after="80" w:before="120"/>
       </w:pPr>
       <w:r>
         <w:t xml:space="preserve">Professional Summary</w:t>
@@ -57,7 +57,7 @@
     </w:p>
     <w:p>
       <w:pPr>
-        <w:spacing w:after="200"/>
+        <w:spacing w:after="120"/>
       </w:pPr>
       <w:r>
         <w:t xml:space="preserve">Java Full Stack Developer with 5+ years of experience building scalable enterprise applications. </w:t>
@@ -184,7 +184,7 @@
         <w:pBdr>
           <w:bottom w:val="single" w:color="333333" w:sz="6" w:space="1"/>
         </w:pBdr>
-        <w:spacing w:after="120" w:before="240"/>
+        <w:spacing w:after="80" w:before="120"/>
       </w:pPr>
       <w:r>
         <w:t xml:space="preserve">Technical Skills</w:t>
@@ -192,7 +192,7 @@
     </w:p>
     <w:p>
       <w:pPr>
-        <w:spacing w:after="200"/>
+        <w:spacing w:after="120"/>
       </w:pPr>
       <w:r>
         <w:rPr>
@@ -258,14 +258,109 @@
     <w:p>
       <w:pPr>
         <w:pStyle w:val="Heading2"/>
-        <w:pageBreakBefore/>
         <w:pBdr>
           <w:bottom w:val="single" w:color="333333" w:sz="6" w:space="1"/>
         </w:pBdr>
-        <w:spacing w:after="120" w:before="240"/>
+        <w:spacing w:after="80" w:before="120"/>
       </w:pPr>
       <w:r>
         <w:t xml:space="preserve">Professional Experience</w:t>
+      </w:r>
+    </w:p>
+    <w:p>
+      <w:pPr>
+        <w:keepLines/>
+        <w:spacing w:after="60"/>
+      </w:pPr>
+      <w:r>
+        <w:rPr>
+          <w:b/>
+          <w:bCs/>
+        </w:rPr>
+        <w:t xml:space="preserve">Full Stack Engineer</w:t>
+      </w:r>
+      <w:r>
+        <w:t xml:space="preserve">, Mad Mobile</w:t>
+      </w:r>
+      <w:r>
+        <w:rPr>
+          <w:i/>
+          <w:iCs/>
+        </w:rPr>
+        <w:t xml:space="preserve">	Nov 2025 – Present</w:t>
+      </w:r>
+    </w:p>
+    <w:p>
+      <w:pPr>
+        <w:pStyle w:val="ListParagraph"/>
+        <w:numPr>
+          <w:ilvl w:val="0"/>
+          <w:numId w:val="1"/>
+        </w:numPr>
+      </w:pPr>
+      <w:r>
+        <w:t xml:space="preserve">• Modernized legacy Spring MVC systems by designing and developing scalable Java 17 / Spring Boot microservices to improve performance, reliability, and deployment flexibility.</w:t>
+      </w:r>
+    </w:p>
+    <w:p>
+      <w:pPr>
+        <w:pStyle w:val="ListParagraph"/>
+        <w:numPr>
+          <w:ilvl w:val="0"/>
+          <w:numId w:val="1"/>
+        </w:numPr>
+      </w:pPr>
+      <w:r>
+        <w:t xml:space="preserve">• Built event-driven architectures using Redis, RabbitMQ, and Kafka for asynchronous processing, real-time communication, and distributed system scalability.</w:t>
+      </w:r>
+    </w:p>
+    <w:p>
+      <w:pPr>
+        <w:pStyle w:val="ListParagraph"/>
+        <w:numPr>
+          <w:ilvl w:val="0"/>
+          <w:numId w:val="1"/>
+        </w:numPr>
+      </w:pPr>
+      <w:r>
+        <w:t xml:space="preserve">• Developed end-to-end RESTful APIs, secured services with Spring Security, and optimized data workflows with Oracle, SQL, and MongoDB for high-volume applications.</w:t>
+      </w:r>
+    </w:p>
+    <w:p>
+      <w:pPr>
+        <w:pStyle w:val="ListParagraph"/>
+        <w:numPr>
+          <w:ilvl w:val="0"/>
+          <w:numId w:val="1"/>
+        </w:numPr>
+      </w:pPr>
+      <w:r>
+        <w:t xml:space="preserve">• Deployed and managed cloud-native applications on AWS ECS, EC2, and ECR using Docker and Kubernetes for containerization, orchestration, and production resilience.</w:t>
+      </w:r>
+    </w:p>
+    <w:p>
+      <w:pPr>
+        <w:pStyle w:val="ListParagraph"/>
+        <w:numPr>
+          <w:ilvl w:val="0"/>
+          <w:numId w:val="1"/>
+        </w:numPr>
+      </w:pPr>
+      <w:r>
+        <w:t xml:space="preserve">• Implemented CI/CD pipelines using Bitbucket Pipelines to automate builds, tests, deployments, and versioning across dev, QA, staging, and production.</w:t>
+      </w:r>
+    </w:p>
+    <w:p>
+      <w:pPr>
+        <w:pStyle w:val="ListParagraph"/>
+        <w:numPr>
+          <w:ilvl w:val="0"/>
+          <w:numId w:val="1"/>
+        </w:numPr>
+        <w:spacing w:after="80"/>
+      </w:pPr>
+      <w:r>
+        <w:t xml:space="preserve">• Delivered full-stack features using Angular 17 / React and used AI-powered tools (e.g., GitHub Copilot, OpenAI APIs) to improve engineering productivity.</w:t>
       </w:r>
     </w:p>
     <w:p>
@@ -278,90 +373,78 @@
           <w:b/>
           <w:bCs/>
         </w:rPr>
-        <w:t xml:space="preserve">Full Stack Engineer</w:t>
-      </w:r>
-      <w:r>
-        <w:t xml:space="preserve">, Mad Mobile</w:t>
+        <w:t xml:space="preserve">Java Full Stack Developer</w:t>
+      </w:r>
+      <w:r>
+        <w:t xml:space="preserve">, Corebridge Financial</w:t>
       </w:r>
       <w:r>
         <w:rPr>
           <w:i/>
           <w:iCs/>
         </w:rPr>
-        <w:t xml:space="preserve">	Nov 2025 – Present</w:t>
-      </w:r>
-    </w:p>
-    <w:p>
-      <w:pPr>
-        <w:pStyle w:val="ListParagraph"/>
-        <w:numPr>
-          <w:ilvl w:val="0"/>
-          <w:numId w:val="1"/>
-        </w:numPr>
-      </w:pPr>
-      <w:r>
-        <w:t xml:space="preserve">• Modernized legacy Spring MVC systems by designing and developing scalable Java 17 / Spring Boot microservices to improve performance, reliability, and deployment flexibility.</w:t>
-      </w:r>
-    </w:p>
-    <w:p>
-      <w:pPr>
-        <w:pStyle w:val="ListParagraph"/>
-        <w:numPr>
-          <w:ilvl w:val="0"/>
-          <w:numId w:val="1"/>
-        </w:numPr>
-      </w:pPr>
-      <w:r>
-        <w:t xml:space="preserve">• Built event-driven architectures using Redis, RabbitMQ, and Kafka for asynchronous processing, real-time communication, and distributed system scalability.</w:t>
-      </w:r>
-    </w:p>
-    <w:p>
-      <w:pPr>
-        <w:pStyle w:val="ListParagraph"/>
-        <w:numPr>
-          <w:ilvl w:val="0"/>
-          <w:numId w:val="1"/>
-        </w:numPr>
-      </w:pPr>
-      <w:r>
-        <w:t xml:space="preserve">• Developed end-to-end RESTful APIs, secured services with Spring Security, and optimized data workflows with Oracle, SQL, and MongoDB for high-volume applications.</w:t>
-      </w:r>
-    </w:p>
-    <w:p>
-      <w:pPr>
-        <w:pStyle w:val="ListParagraph"/>
-        <w:numPr>
-          <w:ilvl w:val="0"/>
-          <w:numId w:val="1"/>
-        </w:numPr>
-      </w:pPr>
-      <w:r>
-        <w:t xml:space="preserve">• Deployed and managed cloud-native applications on AWS ECS, EC2, and ECR using Docker and Kubernetes for containerization, orchestration, and production resilience.</w:t>
-      </w:r>
-    </w:p>
-    <w:p>
-      <w:pPr>
-        <w:pStyle w:val="ListParagraph"/>
-        <w:numPr>
-          <w:ilvl w:val="0"/>
-          <w:numId w:val="1"/>
-        </w:numPr>
-      </w:pPr>
-      <w:r>
-        <w:t xml:space="preserve">• Implemented CI/CD pipelines using Bitbucket Pipelines to automate builds, tests, deployments, and versioning across dev, QA, staging, and production.</w:t>
-      </w:r>
-    </w:p>
-    <w:p>
-      <w:pPr>
-        <w:pStyle w:val="ListParagraph"/>
-        <w:numPr>
-          <w:ilvl w:val="0"/>
-          <w:numId w:val="1"/>
-        </w:numPr>
-        <w:spacing w:after="120"/>
-      </w:pPr>
-      <w:r>
-        <w:t xml:space="preserve">• Delivered full-stack features using Angular 17 / React and used AI-powered tools (e.g., GitHub Copilot, OpenAI APIs) to improve engineering productivity.</w:t>
+        <w:t xml:space="preserve">	Feb 2025 – Oct 2025</w:t>
+      </w:r>
+    </w:p>
+    <w:p>
+      <w:pPr>
+        <w:pStyle w:val="ListParagraph"/>
+        <w:numPr>
+          <w:ilvl w:val="0"/>
+          <w:numId w:val="1"/>
+        </w:numPr>
+      </w:pPr>
+      <w:r>
+        <w:t xml:space="preserve">• Developed and maintained Java / Spring Boot applications for retirement, life insurance, and asset management workflows, supporting secure data processing and business logic.</w:t>
+      </w:r>
+    </w:p>
+    <w:p>
+      <w:pPr>
+        <w:pStyle w:val="ListParagraph"/>
+        <w:numPr>
+          <w:ilvl w:val="0"/>
+          <w:numId w:val="1"/>
+        </w:numPr>
+      </w:pPr>
+      <w:r>
+        <w:t xml:space="preserve">• Built RESTful APIs for customer portals, agent dashboards, and internal admin systems, enabling reliable data exchange between front-end and back-end services.</w:t>
+      </w:r>
+    </w:p>
+    <w:p>
+      <w:pPr>
+        <w:pStyle w:val="ListParagraph"/>
+        <w:numPr>
+          <w:ilvl w:val="0"/>
+          <w:numId w:val="1"/>
+        </w:numPr>
+      </w:pPr>
+      <w:r>
+        <w:t xml:space="preserve">• Created user-friendly interfaces for customer portals, agent dashboards, and internal administrative systems using HTML, CSS, and JavaScript frameworks (e.g., Angular / React).</w:t>
+      </w:r>
+    </w:p>
+    <w:p>
+      <w:pPr>
+        <w:pStyle w:val="ListParagraph"/>
+        <w:numPr>
+          <w:ilvl w:val="0"/>
+          <w:numId w:val="1"/>
+        </w:numPr>
+      </w:pPr>
+      <w:r>
+        <w:t xml:space="preserve">• Implemented input validation and data checks on forms and user interactions to ensure data accuracy and consistency across financial workflows.</w:t>
+      </w:r>
+    </w:p>
+    <w:p>
+      <w:pPr>
+        <w:pStyle w:val="ListParagraph"/>
+        <w:numPr>
+          <w:ilvl w:val="0"/>
+          <w:numId w:val="1"/>
+        </w:numPr>
+        <w:spacing w:after="80"/>
+      </w:pPr>
+      <w:r>
+        <w:t xml:space="preserve">• Collaborated with cross-functional teams in an Agile environment to deliver features across development, QA, and production for financial services applications.</w:t>
       </w:r>
     </w:p>
     <w:p>
@@ -377,75 +460,51 @@
         <w:t xml:space="preserve">Java Full Stack Developer</w:t>
       </w:r>
       <w:r>
-        <w:t xml:space="preserve">, Corebridge Financial</w:t>
+        <w:t xml:space="preserve">, ConocoPhillips</w:t>
       </w:r>
       <w:r>
         <w:rPr>
           <w:i/>
           <w:iCs/>
         </w:rPr>
-        <w:t xml:space="preserve">	Feb 2025 – Oct 2025</w:t>
-      </w:r>
-    </w:p>
-    <w:p>
-      <w:pPr>
-        <w:pStyle w:val="ListParagraph"/>
-        <w:numPr>
-          <w:ilvl w:val="0"/>
-          <w:numId w:val="1"/>
-        </w:numPr>
-      </w:pPr>
-      <w:r>
-        <w:t xml:space="preserve">• Developed and maintained Java / Spring Boot applications for retirement, life insurance, and asset management workflows, supporting secure data processing and business logic.</w:t>
-      </w:r>
-    </w:p>
-    <w:p>
-      <w:pPr>
-        <w:pStyle w:val="ListParagraph"/>
-        <w:numPr>
-          <w:ilvl w:val="0"/>
-          <w:numId w:val="1"/>
-        </w:numPr>
-      </w:pPr>
-      <w:r>
-        <w:t xml:space="preserve">• Built RESTful APIs for customer portals, agent dashboards, and internal admin systems, enabling reliable data exchange between front-end and back-end services.</w:t>
-      </w:r>
-    </w:p>
-    <w:p>
-      <w:pPr>
-        <w:pStyle w:val="ListParagraph"/>
-        <w:numPr>
-          <w:ilvl w:val="0"/>
-          <w:numId w:val="1"/>
-        </w:numPr>
-      </w:pPr>
-      <w:r>
-        <w:t xml:space="preserve">• Created user-friendly interfaces for customer portals, agent dashboards, and internal administrative systems using HTML, CSS, and JavaScript frameworks (e.g., Angular / React).</w:t>
-      </w:r>
-    </w:p>
-    <w:p>
-      <w:pPr>
-        <w:pStyle w:val="ListParagraph"/>
-        <w:numPr>
-          <w:ilvl w:val="0"/>
-          <w:numId w:val="1"/>
-        </w:numPr>
-      </w:pPr>
-      <w:r>
-        <w:t xml:space="preserve">• Implemented input validation and data checks on forms and user interactions to ensure data accuracy and consistency across financial workflows.</w:t>
-      </w:r>
-    </w:p>
-    <w:p>
-      <w:pPr>
-        <w:pStyle w:val="ListParagraph"/>
-        <w:numPr>
-          <w:ilvl w:val="0"/>
-          <w:numId w:val="1"/>
-        </w:numPr>
-        <w:spacing w:after="120"/>
-      </w:pPr>
-      <w:r>
-        <w:t xml:space="preserve">• Collaborated with cross-functional teams in an Agile environment to deliver features across development, QA, and production for financial services applications.</w:t>
+        <w:t xml:space="preserve">	Feb 2024 – Dec 2024</w:t>
+      </w:r>
+    </w:p>
+    <w:p>
+      <w:pPr>
+        <w:pStyle w:val="ListParagraph"/>
+        <w:numPr>
+          <w:ilvl w:val="0"/>
+          <w:numId w:val="1"/>
+        </w:numPr>
+      </w:pPr>
+      <w:r>
+        <w:t xml:space="preserve">• Implemented server-side logic using Java and frameworks like Spring Boot to handle complex company calculations, data processing, and transactions.</w:t>
+      </w:r>
+    </w:p>
+    <w:p>
+      <w:pPr>
+        <w:pStyle w:val="ListParagraph"/>
+        <w:numPr>
+          <w:ilvl w:val="0"/>
+          <w:numId w:val="1"/>
+        </w:numPr>
+      </w:pPr>
+      <w:r>
+        <w:t xml:space="preserve">• Designed and developed RESTful APIs for data exchange between front-end and back-end components.</w:t>
+      </w:r>
+    </w:p>
+    <w:p>
+      <w:pPr>
+        <w:pStyle w:val="ListParagraph"/>
+        <w:numPr>
+          <w:ilvl w:val="0"/>
+          <w:numId w:val="1"/>
+        </w:numPr>
+        <w:spacing w:after="80"/>
+      </w:pPr>
+      <w:r>
+        <w:t xml:space="preserve">• Delivered full-stack features; built backend REST API with Java 11, Spring Boot, and Spring Data JPA for portfolio and asset tracking.</w:t>
       </w:r>
     </w:p>
     <w:p>
@@ -458,54 +517,114 @@
           <w:b/>
           <w:bCs/>
         </w:rPr>
-        <w:t xml:space="preserve">Java Full Stack Developer</w:t>
-      </w:r>
-      <w:r>
-        <w:t xml:space="preserve">, ConocoPhillips</w:t>
+        <w:t xml:space="preserve">System Engineer</w:t>
+      </w:r>
+      <w:r>
+        <w:t xml:space="preserve">, Infosys</w:t>
       </w:r>
       <w:r>
         <w:rPr>
           <w:i/>
           <w:iCs/>
         </w:rPr>
-        <w:t xml:space="preserve">	Feb 2024 – Dec 2024</w:t>
-      </w:r>
-    </w:p>
-    <w:p>
-      <w:pPr>
-        <w:pStyle w:val="ListParagraph"/>
-        <w:numPr>
-          <w:ilvl w:val="0"/>
-          <w:numId w:val="1"/>
-        </w:numPr>
-      </w:pPr>
-      <w:r>
-        <w:t xml:space="preserve">• Implemented server-side logic using Java and frameworks like Spring Boot to handle complex company calculations, data processing, and transactions.</w:t>
-      </w:r>
-    </w:p>
-    <w:p>
-      <w:pPr>
-        <w:pStyle w:val="ListParagraph"/>
-        <w:numPr>
-          <w:ilvl w:val="0"/>
-          <w:numId w:val="1"/>
-        </w:numPr>
-      </w:pPr>
-      <w:r>
-        <w:t xml:space="preserve">• Designed and developed RESTful APIs for data exchange between front-end and back-end components.</w:t>
-      </w:r>
-    </w:p>
-    <w:p>
-      <w:pPr>
-        <w:pStyle w:val="ListParagraph"/>
-        <w:numPr>
-          <w:ilvl w:val="0"/>
-          <w:numId w:val="1"/>
-        </w:numPr>
-        <w:spacing w:after="120"/>
-      </w:pPr>
-      <w:r>
-        <w:t xml:space="preserve">• Delivered full-stack features; built backend REST API with Java 11, Spring Boot, and Spring Data JPA for portfolio and asset tracking.</w:t>
+        <w:t xml:space="preserve">	Jun 2021 – Jun 2022</w:t>
+      </w:r>
+    </w:p>
+    <w:p>
+      <w:pPr>
+        <w:pStyle w:val="ListParagraph"/>
+        <w:numPr>
+          <w:ilvl w:val="0"/>
+          <w:numId w:val="1"/>
+        </w:numPr>
+      </w:pPr>
+      <w:r>
+        <w:t xml:space="preserve">• Developed backend data services to support vehicle manufacturing and supply chain analytics systems used by Mercedes-Benz engineering teams.</w:t>
+      </w:r>
+    </w:p>
+    <w:p>
+      <w:pPr>
+        <w:pStyle w:val="ListParagraph"/>
+        <w:numPr>
+          <w:ilvl w:val="0"/>
+          <w:numId w:val="1"/>
+        </w:numPr>
+      </w:pPr>
+      <w:r>
+        <w:t xml:space="preserve">• Built ETL pipelines integrating vehicle production data, dealer management systems, and enterprise operational databases.</w:t>
+      </w:r>
+    </w:p>
+    <w:p>
+      <w:pPr>
+        <w:pStyle w:val="ListParagraph"/>
+        <w:numPr>
+          <w:ilvl w:val="0"/>
+          <w:numId w:val="1"/>
+        </w:numPr>
+      </w:pPr>
+      <w:r>
+        <w:t xml:space="preserve">• Designed data workflows to process automotive manufacturing metrics, vehicle configuration data, and production line performance reports.</w:t>
+      </w:r>
+    </w:p>
+    <w:p>
+      <w:pPr>
+        <w:pStyle w:val="ListParagraph"/>
+        <w:numPr>
+          <w:ilvl w:val="0"/>
+          <w:numId w:val="1"/>
+        </w:numPr>
+      </w:pPr>
+      <w:r>
+        <w:t xml:space="preserve">• Optimized SQL queries used in automotive analytics dashboards that monitor vehicle production efficiency and logistics performance.</w:t>
+      </w:r>
+    </w:p>
+    <w:p>
+      <w:pPr>
+        <w:pStyle w:val="ListParagraph"/>
+        <w:numPr>
+          <w:ilvl w:val="0"/>
+          <w:numId w:val="1"/>
+        </w:numPr>
+      </w:pPr>
+      <w:r>
+        <w:t xml:space="preserve">• Implemented data validation and transformation processes to ensure accurate integration of vehicle inventory and distribution data.</w:t>
+      </w:r>
+    </w:p>
+    <w:p>
+      <w:pPr>
+        <w:pStyle w:val="ListParagraph"/>
+        <w:numPr>
+          <w:ilvl w:val="0"/>
+          <w:numId w:val="1"/>
+        </w:numPr>
+      </w:pPr>
+      <w:r>
+        <w:t xml:space="preserve">• Supported enterprise systems that process dealer network sales data and vehicle delivery tracking across regional markets.</w:t>
+      </w:r>
+    </w:p>
+    <w:p>
+      <w:pPr>
+        <w:pStyle w:val="ListParagraph"/>
+        <w:numPr>
+          <w:ilvl w:val="0"/>
+          <w:numId w:val="1"/>
+        </w:numPr>
+      </w:pPr>
+      <w:r>
+        <w:t xml:space="preserve">• Participated in Agile development cycles delivering data integration features for automotive operations and engineering teams.</w:t>
+      </w:r>
+    </w:p>
+    <w:p>
+      <w:pPr>
+        <w:pStyle w:val="ListParagraph"/>
+        <w:numPr>
+          <w:ilvl w:val="0"/>
+          <w:numId w:val="1"/>
+        </w:numPr>
+        <w:spacing w:after="80"/>
+      </w:pPr>
+      <w:r>
+        <w:t xml:space="preserve">• Assisted in troubleshooting production data pipelines supporting vehicle manufacturing and supply chain reporting systems.</w:t>
       </w:r>
     </w:p>
     <w:p>
@@ -518,101 +637,101 @@
           <w:b/>
           <w:bCs/>
         </w:rPr>
-        <w:t xml:space="preserve">System Engineer</w:t>
-      </w:r>
-      <w:r>
-        <w:t xml:space="preserve">, Infosys</w:t>
+        <w:t xml:space="preserve">Associate System Engineer</w:t>
+      </w:r>
+      <w:r>
+        <w:t xml:space="preserve">, Elder Pharmaceuticals</w:t>
       </w:r>
       <w:r>
         <w:rPr>
           <w:i/>
           <w:iCs/>
         </w:rPr>
-        <w:t xml:space="preserve">	Jun 2021 – Jun 2022</w:t>
-      </w:r>
-    </w:p>
-    <w:p>
-      <w:pPr>
-        <w:pStyle w:val="ListParagraph"/>
-        <w:numPr>
-          <w:ilvl w:val="0"/>
-          <w:numId w:val="1"/>
-        </w:numPr>
-      </w:pPr>
-      <w:r>
-        <w:t xml:space="preserve">• Developed backend data services to support vehicle manufacturing and supply chain analytics systems used by Mercedes-Benz engineering teams.</w:t>
-      </w:r>
-    </w:p>
-    <w:p>
-      <w:pPr>
-        <w:pStyle w:val="ListParagraph"/>
-        <w:numPr>
-          <w:ilvl w:val="0"/>
-          <w:numId w:val="1"/>
-        </w:numPr>
-      </w:pPr>
-      <w:r>
-        <w:t xml:space="preserve">• Built ETL pipelines integrating vehicle production data, dealer management systems, and enterprise operational databases.</w:t>
-      </w:r>
-    </w:p>
-    <w:p>
-      <w:pPr>
-        <w:pStyle w:val="ListParagraph"/>
-        <w:numPr>
-          <w:ilvl w:val="0"/>
-          <w:numId w:val="1"/>
-        </w:numPr>
-      </w:pPr>
-      <w:r>
-        <w:t xml:space="preserve">• Designed data workflows to process automotive manufacturing metrics, vehicle configuration data, and production line performance reports.</w:t>
-      </w:r>
-    </w:p>
-    <w:p>
-      <w:pPr>
-        <w:pStyle w:val="ListParagraph"/>
-        <w:numPr>
-          <w:ilvl w:val="0"/>
-          <w:numId w:val="1"/>
-        </w:numPr>
-      </w:pPr>
-      <w:r>
-        <w:t xml:space="preserve">• Optimized SQL queries used in automotive analytics dashboards that monitor vehicle production efficiency and logistics performance.</w:t>
-      </w:r>
-    </w:p>
-    <w:p>
-      <w:pPr>
-        <w:pStyle w:val="ListParagraph"/>
-        <w:numPr>
-          <w:ilvl w:val="0"/>
-          <w:numId w:val="1"/>
-        </w:numPr>
-      </w:pPr>
-      <w:r>
-        <w:t xml:space="preserve">• Implemented data validation and transformation processes to ensure accurate integration of vehicle inventory and distribution data.</w:t>
-      </w:r>
-    </w:p>
-    <w:p>
-      <w:pPr>
-        <w:pStyle w:val="ListParagraph"/>
-        <w:numPr>
-          <w:ilvl w:val="0"/>
-          <w:numId w:val="1"/>
-        </w:numPr>
-      </w:pPr>
-      <w:r>
-        <w:t xml:space="preserve">• Supported enterprise systems that process dealer network sales data and vehicle delivery tracking across regional markets.</w:t>
-      </w:r>
-    </w:p>
-    <w:p>
-      <w:pPr>
-        <w:pStyle w:val="ListParagraph"/>
-        <w:numPr>
-          <w:ilvl w:val="0"/>
-          <w:numId w:val="1"/>
-        </w:numPr>
-      </w:pPr>
-      <w:r>
-        <w:t xml:space="preserve">• Participated in Agile development cycles delivering data integration features for automotive operations and engineering teams.</w:t>
+        <w:t xml:space="preserve">	Jun 2019 – May 2021</w:t>
+      </w:r>
+    </w:p>
+    <w:p>
+      <w:pPr>
+        <w:pStyle w:val="ListParagraph"/>
+        <w:numPr>
+          <w:ilvl w:val="0"/>
+          <w:numId w:val="1"/>
+        </w:numPr>
+      </w:pPr>
+      <w:r>
+        <w:t xml:space="preserve">• Developed data integration processes to manage drug manufacturing, batch production, and pharmaceutical inventory data used in internal reporting systems.</w:t>
+      </w:r>
+    </w:p>
+    <w:p>
+      <w:pPr>
+        <w:pStyle w:val="ListParagraph"/>
+        <w:numPr>
+          <w:ilvl w:val="0"/>
+          <w:numId w:val="1"/>
+        </w:numPr>
+      </w:pPr>
+      <w:r>
+        <w:t xml:space="preserve">• Built ETL workflows to consolidate laboratory testing data and quality control results from multiple pharmaceutical systems into centralized databases.</w:t>
+      </w:r>
+    </w:p>
+    <w:p>
+      <w:pPr>
+        <w:pStyle w:val="ListParagraph"/>
+        <w:numPr>
+          <w:ilvl w:val="0"/>
+          <w:numId w:val="1"/>
+        </w:numPr>
+      </w:pPr>
+      <w:r>
+        <w:t xml:space="preserve">• Supported data pipelines used for pharmaceutical product lifecycle management, ensuring accurate tracking of medicine batches and manufacturing records.</w:t>
+      </w:r>
+    </w:p>
+    <w:p>
+      <w:pPr>
+        <w:pStyle w:val="ListParagraph"/>
+        <w:numPr>
+          <w:ilvl w:val="0"/>
+          <w:numId w:val="1"/>
+        </w:numPr>
+      </w:pPr>
+      <w:r>
+        <w:t xml:space="preserve">• Implemented data validation logic to maintain accuracy of clinical and drug safety datasets used for regulatory and compliance reporting.</w:t>
+      </w:r>
+    </w:p>
+    <w:p>
+      <w:pPr>
+        <w:pStyle w:val="ListParagraph"/>
+        <w:numPr>
+          <w:ilvl w:val="0"/>
+          <w:numId w:val="1"/>
+        </w:numPr>
+      </w:pPr>
+      <w:r>
+        <w:t xml:space="preserve">• Assisted in integrating sales and distribution data for pharmaceutical products, helping track medicine supply across distributors and healthcare providers.</w:t>
+      </w:r>
+    </w:p>
+    <w:p>
+      <w:pPr>
+        <w:pStyle w:val="ListParagraph"/>
+        <w:numPr>
+          <w:ilvl w:val="0"/>
+          <w:numId w:val="1"/>
+        </w:numPr>
+      </w:pPr>
+      <w:r>
+        <w:t xml:space="preserve">• Created SQL-based reports supporting drug production monitoring, inventory tracking, and product performance analytics.</w:t>
+      </w:r>
+    </w:p>
+    <w:p>
+      <w:pPr>
+        <w:pStyle w:val="ListParagraph"/>
+        <w:numPr>
+          <w:ilvl w:val="0"/>
+          <w:numId w:val="1"/>
+        </w:numPr>
+      </w:pPr>
+      <w:r>
+        <w:t xml:space="preserve">• Supported data systems used for pharmacovigilance and adverse event reporting, helping maintain reliable pharmaceutical safety data.</w:t>
       </w:r>
     </w:p>
     <w:p>
@@ -625,137 +744,16 @@
         <w:spacing w:after="120"/>
       </w:pPr>
       <w:r>
-        <w:t xml:space="preserve">• Assisted in troubleshooting production data pipelines supporting vehicle manufacturing and supply chain reporting systems.</w:t>
-      </w:r>
-    </w:p>
-    <w:p>
-      <w:pPr>
-        <w:keepLines/>
-        <w:spacing w:after="80"/>
-      </w:pPr>
-      <w:r>
-        <w:rPr>
-          <w:b/>
-          <w:bCs/>
-        </w:rPr>
-        <w:t xml:space="preserve">Associate System Engineer</w:t>
-      </w:r>
-      <w:r>
-        <w:t xml:space="preserve">, Elder Pharmaceuticals</w:t>
-      </w:r>
-      <w:r>
-        <w:rPr>
-          <w:i/>
-          <w:iCs/>
-        </w:rPr>
-        <w:t xml:space="preserve">	Jun 2019 – May 2021</w:t>
-      </w:r>
-    </w:p>
-    <w:p>
-      <w:pPr>
-        <w:pStyle w:val="ListParagraph"/>
-        <w:numPr>
-          <w:ilvl w:val="0"/>
-          <w:numId w:val="1"/>
-        </w:numPr>
-      </w:pPr>
-      <w:r>
-        <w:t xml:space="preserve">• Developed data integration processes to manage drug manufacturing, batch production, and pharmaceutical inventory data used in internal reporting systems.</w:t>
-      </w:r>
-    </w:p>
-    <w:p>
-      <w:pPr>
-        <w:pStyle w:val="ListParagraph"/>
-        <w:numPr>
-          <w:ilvl w:val="0"/>
-          <w:numId w:val="1"/>
-        </w:numPr>
-      </w:pPr>
-      <w:r>
-        <w:t xml:space="preserve">• Built ETL workflows to consolidate laboratory testing data and quality control results from multiple pharmaceutical systems into centralized databases.</w:t>
-      </w:r>
-    </w:p>
-    <w:p>
-      <w:pPr>
-        <w:pStyle w:val="ListParagraph"/>
-        <w:numPr>
-          <w:ilvl w:val="0"/>
-          <w:numId w:val="1"/>
-        </w:numPr>
-      </w:pPr>
-      <w:r>
-        <w:t xml:space="preserve">• Supported data pipelines used for pharmaceutical product lifecycle management, ensuring accurate tracking of medicine batches and manufacturing records.</w:t>
-      </w:r>
-    </w:p>
-    <w:p>
-      <w:pPr>
-        <w:pStyle w:val="ListParagraph"/>
-        <w:numPr>
-          <w:ilvl w:val="0"/>
-          <w:numId w:val="1"/>
-        </w:numPr>
-      </w:pPr>
-      <w:r>
-        <w:t xml:space="preserve">• Implemented data validation logic to maintain accuracy of clinical and drug safety datasets used for regulatory and compliance reporting.</w:t>
-      </w:r>
-    </w:p>
-    <w:p>
-      <w:pPr>
-        <w:pStyle w:val="ListParagraph"/>
-        <w:numPr>
-          <w:ilvl w:val="0"/>
-          <w:numId w:val="1"/>
-        </w:numPr>
-      </w:pPr>
-      <w:r>
-        <w:t xml:space="preserve">• Assisted in integrating sales and distribution data for pharmaceutical products, helping track medicine supply across distributors and healthcare providers.</w:t>
-      </w:r>
-    </w:p>
-    <w:p>
-      <w:pPr>
-        <w:pStyle w:val="ListParagraph"/>
-        <w:numPr>
-          <w:ilvl w:val="0"/>
-          <w:numId w:val="1"/>
-        </w:numPr>
-      </w:pPr>
-      <w:r>
-        <w:t xml:space="preserve">• Created SQL-based reports supporting drug production monitoring, inventory tracking, and product performance analytics.</w:t>
-      </w:r>
-    </w:p>
-    <w:p>
-      <w:pPr>
-        <w:pStyle w:val="ListParagraph"/>
-        <w:numPr>
-          <w:ilvl w:val="0"/>
-          <w:numId w:val="1"/>
-        </w:numPr>
-      </w:pPr>
-      <w:r>
-        <w:t xml:space="preserve">• Supported data systems used for pharmacovigilance and adverse event reporting, helping maintain reliable pharmaceutical safety data.</w:t>
-      </w:r>
-    </w:p>
-    <w:p>
-      <w:pPr>
-        <w:pStyle w:val="ListParagraph"/>
-        <w:numPr>
-          <w:ilvl w:val="0"/>
-          <w:numId w:val="1"/>
-        </w:numPr>
-        <w:spacing w:after="120"/>
-      </w:pPr>
-      <w:r>
         <w:t xml:space="preserve">• Collaborated with quality assurance teams to ensure data consistency for pharmaceutical manufacturing and compliance audits.</w:t>
       </w:r>
     </w:p>
     <w:p>
       <w:pPr>
         <w:pStyle w:val="Heading2"/>
-        <w:pageBreakBefore/>
         <w:pBdr>
           <w:bottom w:val="single" w:color="333333" w:sz="6" w:space="1"/>
         </w:pBdr>
-        <w:spacing w:after="120" w:before="240"/>
+        <w:spacing w:after="80" w:before="120"/>
       </w:pPr>
       <w:r>
         <w:t xml:space="preserve">Certifications</w:t>
@@ -806,7 +804,7 @@
           <w:ilvl w:val="0"/>
           <w:numId w:val="1"/>
         </w:numPr>
-        <w:spacing w:after="200"/>
+        <w:spacing w:after="120"/>
       </w:pPr>
       <w:r>
         <w:rPr>
@@ -822,11 +820,10 @@
     <w:p>
       <w:pPr>
         <w:pStyle w:val="Heading2"/>
-        <w:pageBreakBefore/>
         <w:pBdr>
           <w:bottom w:val="single" w:color="333333" w:sz="6" w:space="1"/>
         </w:pBdr>
-        <w:spacing w:after="120" w:before="240"/>
+        <w:spacing w:after="80" w:before="120"/>
       </w:pPr>
       <w:r>
         <w:t xml:space="preserve">Education</w:t>
@@ -834,7 +831,7 @@
     </w:p>
     <w:p>
       <w:pPr>
-        <w:spacing w:after="80"/>
+        <w:spacing w:after="60"/>
       </w:pPr>
       <w:r>
         <w:rPr>
@@ -857,7 +854,7 @@
     </w:p>
     <w:p>
       <w:pPr>
-        <w:spacing w:after="80"/>
+        <w:spacing w:after="60"/>
       </w:pPr>
       <w:r>
         <w:rPr>
@@ -881,11 +878,10 @@
     <w:p>
       <w:pPr>
         <w:pStyle w:val="Heading2"/>
-        <w:pageBreakBefore/>
         <w:pBdr>
           <w:bottom w:val="single" w:color="333333" w:sz="6" w:space="1"/>
         </w:pBdr>
-        <w:spacing w:after="120" w:before="240"/>
+        <w:spacing w:after="80" w:before="120"/>
       </w:pPr>
       <w:r>
         <w:t xml:space="preserve">Key Projects</w:t>
@@ -950,7 +946,7 @@
     </w:p>
     <w:sectPr>
       <w:pgSz w:w="11906" w:h="16838" w:orient="portrait"/>
-      <w:pgMar w:top="720" w:right="720" w:bottom="720" w:left="720" w:header="708" w:footer="708" w:gutter="0"/>
+      <w:pgMar w:top="576" w:right="576" w:bottom="576" w:left="576" w:header="708" w:footer="708" w:gutter="0"/>
       <w:pgNumType/>
       <w:docGrid w:linePitch="360"/>
     </w:sectPr>

</xml_diff>

<commit_message>
Add clickable links: email (mailto), LinkedIn, GitHub in resume header
Made-with: Cursor
</commit_message>
<xml_diff>
--- a/public/resume.docx
+++ b/public/resume.docx
@@ -40,8 +40,52 @@
           <w:sz w:val="20"/>
           <w:szCs w:val="20"/>
         </w:rPr>
-        <w:t xml:space="preserve">Tampa, FL, USA | gsg1499@gmail.com | linkedin.com/in/ganeshg7 | github.com/sivaganesh1407</w:t>
-      </w:r>
+        <w:t xml:space="preserve">Tampa, FL, USA | </w:t>
+      </w:r>
+      <w:hyperlink w:history="1" r:id="rIdcii1yijem_bdhqi8jnjp_">
+        <w:r>
+          <w:rPr>
+            <w:rStyle w:val="Hyperlink"/>
+            <w:sz w:val="20"/>
+            <w:szCs w:val="20"/>
+          </w:rPr>
+          <w:t xml:space="preserve">gsg1499@gmail.com</w:t>
+        </w:r>
+      </w:hyperlink>
+      <w:r>
+        <w:rPr>
+          <w:sz w:val="20"/>
+          <w:szCs w:val="20"/>
+        </w:rPr>
+        <w:t xml:space="preserve"> | </w:t>
+      </w:r>
+      <w:hyperlink w:history="1" r:id="rIdfpzpzsckyzur7yi2sdozq">
+        <w:r>
+          <w:rPr>
+            <w:rStyle w:val="Hyperlink"/>
+            <w:sz w:val="20"/>
+            <w:szCs w:val="20"/>
+          </w:rPr>
+          <w:t xml:space="preserve">linkedin.com/in/ganeshg7</w:t>
+        </w:r>
+      </w:hyperlink>
+      <w:r>
+        <w:rPr>
+          <w:sz w:val="20"/>
+          <w:szCs w:val="20"/>
+        </w:rPr>
+        <w:t xml:space="preserve"> | </w:t>
+      </w:r>
+      <w:hyperlink w:history="1" r:id="rIdd5lrpohgv-uhd4c-cyzts">
+        <w:r>
+          <w:rPr>
+            <w:rStyle w:val="Hyperlink"/>
+            <w:sz w:val="20"/>
+            <w:szCs w:val="20"/>
+          </w:rPr>
+          <w:t xml:space="preserve">github.com/sivaganesh1407</w:t>
+        </w:r>
+      </w:hyperlink>
     </w:p>
     <w:p>
       <w:pPr>

</xml_diff>

<commit_message>
Fix contact line: clean layout, bullet separators, no overlap
Made-with: Cursor
</commit_message>
<xml_diff>
--- a/public/resume.docx
+++ b/public/resume.docx
@@ -40,9 +40,9 @@
           <w:sz w:val="20"/>
           <w:szCs w:val="20"/>
         </w:rPr>
-        <w:t xml:space="preserve">Tampa, FL, USA | </w:t>
-      </w:r>
-      <w:hyperlink w:history="1" r:id="rIdcii1yijem_bdhqi8jnjp_">
+        <w:t xml:space="preserve">Tampa, FL, USA  •  </w:t>
+      </w:r>
+      <w:hyperlink w:history="1" r:id="rIdopmxhudpgi2rq6nvv647y">
         <w:r>
           <w:rPr>
             <w:rStyle w:val="Hyperlink"/>
@@ -57,9 +57,9 @@
           <w:sz w:val="20"/>
           <w:szCs w:val="20"/>
         </w:rPr>
-        <w:t xml:space="preserve"> | </w:t>
-      </w:r>
-      <w:hyperlink w:history="1" r:id="rIdfpzpzsckyzur7yi2sdozq">
+        <w:t xml:space="preserve">  •  </w:t>
+      </w:r>
+      <w:hyperlink w:history="1" r:id="rIdwqleymlcpe0-hbozqjx6o">
         <w:r>
           <w:rPr>
             <w:rStyle w:val="Hyperlink"/>
@@ -74,9 +74,9 @@
           <w:sz w:val="20"/>
           <w:szCs w:val="20"/>
         </w:rPr>
-        <w:t xml:space="preserve"> | </w:t>
-      </w:r>
-      <w:hyperlink w:history="1" r:id="rIdd5lrpohgv-uhd4c-cyzts">
+        <w:t xml:space="preserve">  •  </w:t>
+      </w:r>
+      <w:hyperlink w:history="1" r:id="rIdsubunvtho4-a3-icra0x8">
         <w:r>
           <w:rPr>
             <w:rStyle w:val="Hyperlink"/>

</xml_diff>

<commit_message>
Update resume Technical Skills to match portfolio experience
Made-with: Cursor
</commit_message>
<xml_diff>
--- a/public/resume.docx
+++ b/public/resume.docx
@@ -42,7 +42,7 @@
         </w:rPr>
         <w:t xml:space="preserve">Tampa, FL, USA  •  </w:t>
       </w:r>
-      <w:hyperlink w:history="1" r:id="rIdopmxhudpgi2rq6nvv647y">
+      <w:hyperlink w:history="1" r:id="rIdm3gu8pouys7dmkcuq8od8">
         <w:r>
           <w:rPr>
             <w:rStyle w:val="Hyperlink"/>
@@ -59,7 +59,7 @@
         </w:rPr>
         <w:t xml:space="preserve">  •  </w:t>
       </w:r>
-      <w:hyperlink w:history="1" r:id="rIdwqleymlcpe0-hbozqjx6o">
+      <w:hyperlink w:history="1" r:id="rId4utx1qpkvwqehyctzik13">
         <w:r>
           <w:rPr>
             <w:rStyle w:val="Hyperlink"/>
@@ -76,7 +76,7 @@
         </w:rPr>
         <w:t xml:space="preserve">  •  </w:t>
       </w:r>
-      <w:hyperlink w:history="1" r:id="rIdsubunvtho4-a3-icra0x8">
+      <w:hyperlink w:history="1" r:id="rIdxxmccpzrogpfnukkq4nqh">
         <w:r>
           <w:rPr>
             <w:rStyle w:val="Hyperlink"/>
@@ -243,40 +243,40 @@
           <w:b/>
           <w:bCs/>
         </w:rPr>
+        <w:t xml:space="preserve">Languages &amp; Frameworks:</w:t>
+      </w:r>
+      <w:r>
+        <w:t xml:space="preserve"> Java, Spring Boot, Spring MVC, Hibernate, JavaScript, TypeScript | </w:t>
+      </w:r>
+      <w:r>
+        <w:rPr>
+          <w:b/>
+          <w:bCs/>
+        </w:rPr>
+        <w:t xml:space="preserve">Frontend:</w:t>
+      </w:r>
+      <w:r>
+        <w:t xml:space="preserve"> React, Angular, Vue.js, HTML5, CSS3, Bootstrap | </w:t>
+      </w:r>
+      <w:r>
+        <w:rPr>
+          <w:b/>
+          <w:bCs/>
+        </w:rPr>
         <w:t xml:space="preserve">Backend:</w:t>
       </w:r>
       <w:r>
-        <w:t xml:space="preserve"> Java, Java 17, Spring Boot, Spring MVC, Spring Security, Spring Data JPA, Hibernate, Microservices, RESTful APIs, Event-Driven Architecture | </w:t>
-      </w:r>
-      <w:r>
-        <w:rPr>
-          <w:b/>
-          <w:bCs/>
-        </w:rPr>
-        <w:t xml:space="preserve">Messaging &amp; Data:</w:t>
-      </w:r>
-      <w:r>
-        <w:t xml:space="preserve"> Redis, RabbitMQ, Kafka, ETL Pipelines, Data Integration, Data Validation, SQL Optimization | </w:t>
-      </w:r>
-      <w:r>
-        <w:rPr>
-          <w:b/>
-          <w:bCs/>
-        </w:rPr>
-        <w:t xml:space="preserve">Frontend:</w:t>
-      </w:r>
-      <w:r>
-        <w:t xml:space="preserve"> React, Angular 17, JavaScript, HTML5, CSS3 | </w:t>
-      </w:r>
-      <w:r>
-        <w:rPr>
-          <w:b/>
-          <w:bCs/>
-        </w:rPr>
-        <w:t xml:space="preserve">Cloud &amp; DevOps:</w:t>
-      </w:r>
-      <w:r>
-        <w:t xml:space="preserve"> AWS (ECS, EC2, ECR), Docker, Kubernetes, Terraform, CI/CD, Bitbucket Pipelines, Jenkins | </w:t>
+        <w:t xml:space="preserve"> Node.js, RESTful APIs, Microservices, JAX-RS, JDBC, Servlets | </w:t>
+      </w:r>
+      <w:r>
+        <w:rPr>
+          <w:b/>
+          <w:bCs/>
+        </w:rPr>
+        <w:t xml:space="preserve">CI/CD &amp; DevOps:</w:t>
+      </w:r>
+      <w:r>
+        <w:t xml:space="preserve"> Jenkins, GitLab, Docker, Kubernetes, Maven, Git, Bitbucket | </w:t>
       </w:r>
       <w:r>
         <w:rPr>
@@ -286,17 +286,87 @@
         <w:t xml:space="preserve">Databases:</w:t>
       </w:r>
       <w:r>
-        <w:t xml:space="preserve"> Oracle, SQL, MySQL, PostgreSQL, MongoDB | </w:t>
-      </w:r>
-      <w:r>
-        <w:rPr>
-          <w:b/>
-          <w:bCs/>
-        </w:rPr>
-        <w:t xml:space="preserve">Other:</w:t>
-      </w:r>
-      <w:r>
-        <w:t xml:space="preserve"> Agile, Git, Data Workflows, GitHub Copilot</w:t>
+        <w:t xml:space="preserve"> SQL, PL/SQL, Oracle, MongoDB, MySQL, PostgreSQL | </w:t>
+      </w:r>
+      <w:r>
+        <w:rPr>
+          <w:b/>
+          <w:bCs/>
+        </w:rPr>
+        <w:t xml:space="preserve">Testing:</w:t>
+      </w:r>
+      <w:r>
+        <w:t xml:space="preserve"> JUnit, Mockito, Selenium, Postman, Karma, Cypress, Jasmine | </w:t>
+      </w:r>
+      <w:r>
+        <w:rPr>
+          <w:b/>
+          <w:bCs/>
+        </w:rPr>
+        <w:t xml:space="preserve">Cloud:</w:t>
+      </w:r>
+      <w:r>
+        <w:t xml:space="preserve"> AWS (EC2, S3, RDS), Azure, Google Cloud, AWS Lambda | </w:t>
+      </w:r>
+      <w:r>
+        <w:rPr>
+          <w:b/>
+          <w:bCs/>
+        </w:rPr>
+        <w:t xml:space="preserve">Monitoring:</w:t>
+      </w:r>
+      <w:r>
+        <w:t xml:space="preserve"> ELK Stack, Prometheus, Grafana | </w:t>
+      </w:r>
+      <w:r>
+        <w:rPr>
+          <w:b/>
+          <w:bCs/>
+        </w:rPr>
+        <w:t xml:space="preserve">API &amp; Data:</w:t>
+      </w:r>
+      <w:r>
+        <w:t xml:space="preserve"> API Gateway, Apigee, Swagger, JSON, XML, YAML | </w:t>
+      </w:r>
+      <w:r>
+        <w:rPr>
+          <w:b/>
+          <w:bCs/>
+        </w:rPr>
+        <w:t xml:space="preserve">Project &amp; Config:</w:t>
+      </w:r>
+      <w:r>
+        <w:t xml:space="preserve"> JIRA, Asana, Trello, Chef, Ansible, Confluence | </w:t>
+      </w:r>
+      <w:r>
+        <w:rPr>
+          <w:b/>
+          <w:bCs/>
+        </w:rPr>
+        <w:t xml:space="preserve">Architecture:</w:t>
+      </w:r>
+      <w:r>
+        <w:t xml:space="preserve"> Microservices, MVC, RESTful, SOAP, Monolithic | </w:t>
+      </w:r>
+      <w:r>
+        <w:rPr>
+          <w:b/>
+          <w:bCs/>
+        </w:rPr>
+        <w:t xml:space="preserve">Java:</w:t>
+      </w:r>
+      <w:r>
+        <w:t xml:space="preserve"> EJB, J2EE, JSP, JSTL, JNDI, JMS, JAXB | </w:t>
+      </w:r>
+      <w:r>
+        <w:rPr>
+          <w:b/>
+          <w:bCs/>
+        </w:rPr>
+        <w:t xml:space="preserve">IDEs:</w:t>
+      </w:r>
+      <w:r>
+        <w:t xml:space="preserve"> IntelliJ IDEA, VSCode, Eclipse</w:t>
       </w:r>
     </w:p>
     <w:p>

</xml_diff>

<commit_message>
Unify resume content: single source of truth, ATS format for PDF and DOCX
Made-with: Cursor
</commit_message>
<xml_diff>
--- a/public/resume.docx
+++ b/public/resume.docx
@@ -9,6 +9,7 @@
       </w:pPr>
       <w:r>
         <w:rPr>
+          <w:rFonts w:ascii="Times New Roman" w:cs="Times New Roman" w:eastAsia="Times New Roman" w:hAnsi="Times New Roman"/>
           <w:b/>
           <w:bCs/>
           <w:sz w:val="44"/>
@@ -24,6 +25,7 @@
       </w:pPr>
       <w:r>
         <w:rPr>
+          <w:rFonts w:ascii="Times New Roman" w:cs="Times New Roman" w:eastAsia="Times New Roman" w:hAnsi="Times New Roman"/>
           <w:sz w:val="24"/>
           <w:szCs w:val="24"/>
         </w:rPr>
@@ -37,15 +39,17 @@
       </w:pPr>
       <w:r>
         <w:rPr>
+          <w:rFonts w:ascii="Times New Roman" w:cs="Times New Roman" w:eastAsia="Times New Roman" w:hAnsi="Times New Roman"/>
           <w:sz w:val="20"/>
           <w:szCs w:val="20"/>
         </w:rPr>
         <w:t xml:space="preserve">Tampa, FL, USA  •  </w:t>
       </w:r>
-      <w:hyperlink w:history="1" r:id="rIdm3gu8pouys7dmkcuq8od8">
+      <w:hyperlink w:history="1" r:id="rIdso3kugpc9z2uheiatgjcx">
         <w:r>
           <w:rPr>
             <w:rStyle w:val="Hyperlink"/>
+            <w:rFonts w:ascii="Times New Roman" w:cs="Times New Roman" w:eastAsia="Times New Roman" w:hAnsi="Times New Roman"/>
             <w:sz w:val="20"/>
             <w:szCs w:val="20"/>
           </w:rPr>
@@ -54,15 +58,17 @@
       </w:hyperlink>
       <w:r>
         <w:rPr>
+          <w:rFonts w:ascii="Times New Roman" w:cs="Times New Roman" w:eastAsia="Times New Roman" w:hAnsi="Times New Roman"/>
           <w:sz w:val="20"/>
           <w:szCs w:val="20"/>
         </w:rPr>
         <w:t xml:space="preserve">  •  </w:t>
       </w:r>
-      <w:hyperlink w:history="1" r:id="rId4utx1qpkvwqehyctzik13">
+      <w:hyperlink w:history="1" r:id="rId059hhryflqiq2fp37_ygn">
         <w:r>
           <w:rPr>
             <w:rStyle w:val="Hyperlink"/>
+            <w:rFonts w:ascii="Times New Roman" w:cs="Times New Roman" w:eastAsia="Times New Roman" w:hAnsi="Times New Roman"/>
             <w:sz w:val="20"/>
             <w:szCs w:val="20"/>
           </w:rPr>
@@ -71,15 +77,17 @@
       </w:hyperlink>
       <w:r>
         <w:rPr>
+          <w:rFonts w:ascii="Times New Roman" w:cs="Times New Roman" w:eastAsia="Times New Roman" w:hAnsi="Times New Roman"/>
           <w:sz w:val="20"/>
           <w:szCs w:val="20"/>
         </w:rPr>
         <w:t xml:space="preserve">  •  </w:t>
       </w:r>
-      <w:hyperlink w:history="1" r:id="rIdxxmccpzrogpfnukkq4nqh">
+      <w:hyperlink w:history="1" r:id="rIdxwanumcb7ahzmpj_yoc--">
         <w:r>
           <w:rPr>
             <w:rStyle w:val="Hyperlink"/>
+            <w:rFonts w:ascii="Times New Roman" w:cs="Times New Roman" w:eastAsia="Times New Roman" w:hAnsi="Times New Roman"/>
             <w:sz w:val="20"/>
             <w:szCs w:val="20"/>
           </w:rPr>
@@ -89,13 +97,17 @@
     </w:p>
     <w:p>
       <w:pPr>
-        <w:pStyle w:val="Heading2"/>
         <w:pBdr>
           <w:bottom w:val="single" w:color="333333" w:sz="6" w:space="1"/>
         </w:pBdr>
         <w:spacing w:after="80" w:before="120"/>
       </w:pPr>
       <w:r>
+        <w:rPr>
+          <w:rFonts w:ascii="Times New Roman" w:cs="Times New Roman" w:eastAsia="Times New Roman" w:hAnsi="Times New Roman"/>
+          <w:b/>
+          <w:bCs/>
+        </w:rPr>
         <w:t xml:space="preserve">Professional Summary</w:t>
       </w:r>
     </w:p>
@@ -104,133 +116,25 @@
         <w:spacing w:after="120"/>
       </w:pPr>
       <w:r>
-        <w:t xml:space="preserve">Java Full Stack Developer with 5+ years of experience building scalable enterprise applications. </w:t>
-      </w:r>
-      <w:r>
-        <w:rPr>
-          <w:i w:val="false"/>
-          <w:iCs w:val="false"/>
-        </w:rPr>
-        <w:t xml:space="preserve">Proficient in </w:t>
-      </w:r>
-      <w:r>
-        <w:rPr>
-          <w:b/>
-          <w:bCs/>
-        </w:rPr>
-        <w:t xml:space="preserve">Java</w:t>
-      </w:r>
-      <w:r>
-        <w:rPr>
-          <w:i w:val="false"/>
-          <w:iCs w:val="false"/>
-        </w:rPr>
-        <w:t xml:space="preserve">, </w:t>
-      </w:r>
-      <w:r>
-        <w:rPr>
-          <w:b/>
-          <w:bCs/>
-        </w:rPr>
-        <w:t xml:space="preserve">Spring Boot</w:t>
-      </w:r>
-      <w:r>
-        <w:rPr>
-          <w:i w:val="false"/>
-          <w:iCs w:val="false"/>
-        </w:rPr>
-        <w:t xml:space="preserve">, </w:t>
-      </w:r>
-      <w:r>
-        <w:rPr>
-          <w:b/>
-          <w:bCs/>
-        </w:rPr>
-        <w:t xml:space="preserve">Microservices</w:t>
-      </w:r>
-      <w:r>
-        <w:rPr>
-          <w:i w:val="false"/>
-          <w:iCs w:val="false"/>
-        </w:rPr>
-        <w:t xml:space="preserve">, </w:t>
-      </w:r>
-      <w:r>
-        <w:rPr>
-          <w:b/>
-          <w:bCs/>
-        </w:rPr>
-        <w:t xml:space="preserve"> REST APIs</w:t>
-      </w:r>
-      <w:r>
-        <w:rPr>
-          <w:i w:val="false"/>
-          <w:iCs w:val="false"/>
-        </w:rPr>
-        <w:t xml:space="preserve">, </w:t>
-      </w:r>
-      <w:r>
-        <w:rPr>
-          <w:b/>
-          <w:bCs/>
-        </w:rPr>
-        <w:t xml:space="preserve">React</w:t>
-      </w:r>
-      <w:r>
-        <w:rPr>
-          <w:i w:val="false"/>
-          <w:iCs w:val="false"/>
-        </w:rPr>
-        <w:t xml:space="preserve">, </w:t>
-      </w:r>
-      <w:r>
-        <w:rPr>
-          <w:b/>
-          <w:bCs/>
-        </w:rPr>
-        <w:t xml:space="preserve">Docker</w:t>
-      </w:r>
-      <w:r>
-        <w:rPr>
-          <w:i w:val="false"/>
-          <w:iCs w:val="false"/>
-        </w:rPr>
-        <w:t xml:space="preserve">, </w:t>
-      </w:r>
-      <w:r>
-        <w:rPr>
-          <w:b/>
-          <w:bCs/>
-        </w:rPr>
-        <w:t xml:space="preserve">Kubernetes</w:t>
-      </w:r>
-      <w:r>
-        <w:rPr>
-          <w:i w:val="false"/>
-          <w:iCs w:val="false"/>
-        </w:rPr>
-        <w:t xml:space="preserve">, and </w:t>
-      </w:r>
-      <w:r>
-        <w:rPr>
-          <w:b/>
-          <w:bCs/>
-        </w:rPr>
-        <w:t xml:space="preserve">AWS</w:t>
-      </w:r>
-      <w:r>
-        <w:t xml:space="preserve">. Delivered backend services, cloud-native systems, and modern web interfaces for financial services, restaurant tech, and energy sectors. AWS Certified DevOps Engineer – Professional, Solutions Architect – Associate, and HashiCorp Terraform Associate. Strong focus on system design, API development, CI/CD, and infrastructure as code.</w:t>
-      </w:r>
-    </w:p>
-    <w:p>
-      <w:pPr>
-        <w:pStyle w:val="Heading2"/>
+        <w:rPr>
+          <w:rFonts w:ascii="Times New Roman" w:cs="Times New Roman" w:eastAsia="Times New Roman" w:hAnsi="Times New Roman"/>
+        </w:rPr>
+        <w:t xml:space="preserve">Java Full Stack Developer with 5+ years of experience building scalable enterprise applications. Proficient in Java, Spring Boot, Microservices, REST APIs, React, Docker, Kubernetes, and AWS. Delivered backend services, cloud-native systems, and modern web interfaces for financial services, restaurant tech, and energy sectors. AWS Certified DevOps Engineer – Professional, Solutions Architect – Associate, and HashiCorp Terraform Associate. Strong focus on system design, API development, CI/CD, and infrastructure as code.</w:t>
+      </w:r>
+    </w:p>
+    <w:p>
+      <w:pPr>
         <w:pBdr>
           <w:bottom w:val="single" w:color="333333" w:sz="6" w:space="1"/>
         </w:pBdr>
         <w:spacing w:after="80" w:before="120"/>
       </w:pPr>
       <w:r>
+        <w:rPr>
+          <w:rFonts w:ascii="Times New Roman" w:cs="Times New Roman" w:eastAsia="Times New Roman" w:hAnsi="Times New Roman"/>
+          <w:b/>
+          <w:bCs/>
+        </w:rPr>
         <w:t xml:space="preserve">Technical Skills</w:t>
       </w:r>
     </w:p>
@@ -240,144 +144,24 @@
       </w:pPr>
       <w:r>
         <w:rPr>
-          <w:b/>
-          <w:bCs/>
-        </w:rPr>
-        <w:t xml:space="preserve">Languages &amp; Frameworks:</w:t>
-      </w:r>
-      <w:r>
-        <w:t xml:space="preserve"> Java, Spring Boot, Spring MVC, Hibernate, JavaScript, TypeScript | </w:t>
-      </w:r>
-      <w:r>
-        <w:rPr>
-          <w:b/>
-          <w:bCs/>
-        </w:rPr>
-        <w:t xml:space="preserve">Frontend:</w:t>
-      </w:r>
-      <w:r>
-        <w:t xml:space="preserve"> React, Angular, Vue.js, HTML5, CSS3, Bootstrap | </w:t>
-      </w:r>
-      <w:r>
-        <w:rPr>
-          <w:b/>
-          <w:bCs/>
-        </w:rPr>
-        <w:t xml:space="preserve">Backend:</w:t>
-      </w:r>
-      <w:r>
-        <w:t xml:space="preserve"> Node.js, RESTful APIs, Microservices, JAX-RS, JDBC, Servlets | </w:t>
-      </w:r>
-      <w:r>
-        <w:rPr>
-          <w:b/>
-          <w:bCs/>
-        </w:rPr>
-        <w:t xml:space="preserve">CI/CD &amp; DevOps:</w:t>
-      </w:r>
-      <w:r>
-        <w:t xml:space="preserve"> Jenkins, GitLab, Docker, Kubernetes, Maven, Git, Bitbucket | </w:t>
-      </w:r>
-      <w:r>
-        <w:rPr>
-          <w:b/>
-          <w:bCs/>
-        </w:rPr>
-        <w:t xml:space="preserve">Databases:</w:t>
-      </w:r>
-      <w:r>
-        <w:t xml:space="preserve"> SQL, PL/SQL, Oracle, MongoDB, MySQL, PostgreSQL | </w:t>
-      </w:r>
-      <w:r>
-        <w:rPr>
-          <w:b/>
-          <w:bCs/>
-        </w:rPr>
-        <w:t xml:space="preserve">Testing:</w:t>
-      </w:r>
-      <w:r>
-        <w:t xml:space="preserve"> JUnit, Mockito, Selenium, Postman, Karma, Cypress, Jasmine | </w:t>
-      </w:r>
-      <w:r>
-        <w:rPr>
-          <w:b/>
-          <w:bCs/>
-        </w:rPr>
-        <w:t xml:space="preserve">Cloud:</w:t>
-      </w:r>
-      <w:r>
-        <w:t xml:space="preserve"> AWS (EC2, S3, RDS), Azure, Google Cloud, AWS Lambda | </w:t>
-      </w:r>
-      <w:r>
-        <w:rPr>
-          <w:b/>
-          <w:bCs/>
-        </w:rPr>
-        <w:t xml:space="preserve">Monitoring:</w:t>
-      </w:r>
-      <w:r>
-        <w:t xml:space="preserve"> ELK Stack, Prometheus, Grafana | </w:t>
-      </w:r>
-      <w:r>
-        <w:rPr>
-          <w:b/>
-          <w:bCs/>
-        </w:rPr>
-        <w:t xml:space="preserve">API &amp; Data:</w:t>
-      </w:r>
-      <w:r>
-        <w:t xml:space="preserve"> API Gateway, Apigee, Swagger, JSON, XML, YAML | </w:t>
-      </w:r>
-      <w:r>
-        <w:rPr>
-          <w:b/>
-          <w:bCs/>
-        </w:rPr>
-        <w:t xml:space="preserve">Project &amp; Config:</w:t>
-      </w:r>
-      <w:r>
-        <w:t xml:space="preserve"> JIRA, Asana, Trello, Chef, Ansible, Confluence | </w:t>
-      </w:r>
-      <w:r>
-        <w:rPr>
-          <w:b/>
-          <w:bCs/>
-        </w:rPr>
-        <w:t xml:space="preserve">Architecture:</w:t>
-      </w:r>
-      <w:r>
-        <w:t xml:space="preserve"> Microservices, MVC, RESTful, SOAP, Monolithic | </w:t>
-      </w:r>
-      <w:r>
-        <w:rPr>
-          <w:b/>
-          <w:bCs/>
-        </w:rPr>
-        <w:t xml:space="preserve">Java:</w:t>
-      </w:r>
-      <w:r>
-        <w:t xml:space="preserve"> EJB, J2EE, JSP, JSTL, JNDI, JMS, JAXB | </w:t>
-      </w:r>
-      <w:r>
-        <w:rPr>
-          <w:b/>
-          <w:bCs/>
-        </w:rPr>
-        <w:t xml:space="preserve">IDEs:</w:t>
-      </w:r>
-      <w:r>
-        <w:t xml:space="preserve"> IntelliJ IDEA, VSCode, Eclipse</w:t>
-      </w:r>
-    </w:p>
-    <w:p>
-      <w:pPr>
-        <w:pStyle w:val="Heading2"/>
+          <w:rFonts w:ascii="Times New Roman" w:cs="Times New Roman" w:eastAsia="Times New Roman" w:hAnsi="Times New Roman"/>
+        </w:rPr>
+        <w:t xml:space="preserve">Languages &amp; Frameworks: Java, Spring Boot, Spring MVC, Hibernate, JavaScript, TypeScript | Frontend: React, Angular, Vue.js, HTML5, CSS3, Bootstrap | Backend: Node.js, RESTful APIs, Microservices, JAX-RS, JDBC, Servlets | CI/CD &amp; DevOps: Jenkins, GitLab, Docker, Kubernetes, Maven, Git, Bitbucket | Databases: SQL, PL/SQL, Oracle, MongoDB, MySQL, PostgreSQL | Testing: JUnit, Mockito, Selenium, Postman, Karma, Cypress, Jasmine | Cloud: AWS (EC2, S3, RDS), Azure, Google Cloud, AWS Lambda | Monitoring: ELK Stack, Prometheus, Grafana | API &amp; Data: API Gateway, Apigee, Swagger, JSON, XML, YAML | Project &amp; Config: JIRA, Asana, Trello, Chef, Ansible, Confluence | Architecture: Microservices, MVC, RESTful, SOAP, Monolithic | Java: EJB, J2EE, JSP, JSTL, JNDI, JMS, JAXB | IDEs: IntelliJ IDEA, VSCode, Eclipse</w:t>
+      </w:r>
+    </w:p>
+    <w:p>
+      <w:pPr>
         <w:pBdr>
           <w:bottom w:val="single" w:color="333333" w:sz="6" w:space="1"/>
         </w:pBdr>
         <w:spacing w:after="80" w:before="120"/>
       </w:pPr>
       <w:r>
+        <w:rPr>
+          <w:rFonts w:ascii="Times New Roman" w:cs="Times New Roman" w:eastAsia="Times New Roman" w:hAnsi="Times New Roman"/>
+          <w:b/>
+          <w:bCs/>
+        </w:rPr>
         <w:t xml:space="preserve">Professional Experience</w:t>
       </w:r>
     </w:p>
@@ -388,16 +172,21 @@
       </w:pPr>
       <w:r>
         <w:rPr>
+          <w:rFonts w:ascii="Times New Roman" w:cs="Times New Roman" w:eastAsia="Times New Roman" w:hAnsi="Times New Roman"/>
           <w:b/>
           <w:bCs/>
         </w:rPr>
         <w:t xml:space="preserve">Full Stack Engineer</w:t>
       </w:r>
       <w:r>
+        <w:rPr>
+          <w:rFonts w:ascii="Times New Roman" w:cs="Times New Roman" w:eastAsia="Times New Roman" w:hAnsi="Times New Roman"/>
+        </w:rPr>
         <w:t xml:space="preserve">, Mad Mobile</w:t>
       </w:r>
       <w:r>
         <w:rPr>
+          <w:rFonts w:ascii="Times New Roman" w:cs="Times New Roman" w:eastAsia="Times New Roman" w:hAnsi="Times New Roman"/>
           <w:i/>
           <w:iCs/>
         </w:rPr>
@@ -411,8 +200,12 @@
           <w:ilvl w:val="0"/>
           <w:numId w:val="1"/>
         </w:numPr>
-      </w:pPr>
-      <w:r>
+        <w:spacing/>
+      </w:pPr>
+      <w:r>
+        <w:rPr>
+          <w:rFonts w:ascii="Times New Roman" w:cs="Times New Roman" w:eastAsia="Times New Roman" w:hAnsi="Times New Roman"/>
+        </w:rPr>
         <w:t xml:space="preserve">• Modernized legacy Spring MVC systems by designing and developing scalable Java 17 / Spring Boot microservices to improve performance, reliability, and deployment flexibility.</w:t>
       </w:r>
     </w:p>
@@ -423,8 +216,12 @@
           <w:ilvl w:val="0"/>
           <w:numId w:val="1"/>
         </w:numPr>
-      </w:pPr>
-      <w:r>
+        <w:spacing/>
+      </w:pPr>
+      <w:r>
+        <w:rPr>
+          <w:rFonts w:ascii="Times New Roman" w:cs="Times New Roman" w:eastAsia="Times New Roman" w:hAnsi="Times New Roman"/>
+        </w:rPr>
         <w:t xml:space="preserve">• Built event-driven architecture using Redis, RabbitMQ, and Kafka handling high-volume real-time transactions.</w:t>
       </w:r>
     </w:p>
@@ -435,8 +232,12 @@
           <w:ilvl w:val="0"/>
           <w:numId w:val="1"/>
         </w:numPr>
-      </w:pPr>
-      <w:r>
+        <w:spacing/>
+      </w:pPr>
+      <w:r>
+        <w:rPr>
+          <w:rFonts w:ascii="Times New Roman" w:cs="Times New Roman" w:eastAsia="Times New Roman" w:hAnsi="Times New Roman"/>
+        </w:rPr>
         <w:t xml:space="preserve">• Developed end-to-end RESTful APIs, secured services with Spring Security, and optimized data workflows with Oracle, SQL, and MongoDB for high-volume applications.</w:t>
       </w:r>
     </w:p>
@@ -447,8 +248,12 @@
           <w:ilvl w:val="0"/>
           <w:numId w:val="1"/>
         </w:numPr>
-      </w:pPr>
-      <w:r>
+        <w:spacing/>
+      </w:pPr>
+      <w:r>
+        <w:rPr>
+          <w:rFonts w:ascii="Times New Roman" w:cs="Times New Roman" w:eastAsia="Times New Roman" w:hAnsi="Times New Roman"/>
+        </w:rPr>
         <w:t xml:space="preserve">• Deployed and managed cloud-native applications on AWS ECS, EC2, and ECR using Docker and Kubernetes for containerization, orchestration, and production resilience.</w:t>
       </w:r>
     </w:p>
@@ -459,8 +264,12 @@
           <w:ilvl w:val="0"/>
           <w:numId w:val="1"/>
         </w:numPr>
-      </w:pPr>
-      <w:r>
+        <w:spacing/>
+      </w:pPr>
+      <w:r>
+        <w:rPr>
+          <w:rFonts w:ascii="Times New Roman" w:cs="Times New Roman" w:eastAsia="Times New Roman" w:hAnsi="Times New Roman"/>
+        </w:rPr>
         <w:t xml:space="preserve">• Implemented CI/CD pipelines using Bitbucket Pipelines to automate builds, tests, deployments, and versioning across dev, QA, staging, and production.</w:t>
       </w:r>
     </w:p>
@@ -474,26 +283,34 @@
         <w:spacing w:after="80"/>
       </w:pPr>
       <w:r>
+        <w:rPr>
+          <w:rFonts w:ascii="Times New Roman" w:cs="Times New Roman" w:eastAsia="Times New Roman" w:hAnsi="Times New Roman"/>
+        </w:rPr>
         <w:t xml:space="preserve">• Delivered full-stack features using Angular 17 / React and used AI-powered tools (e.g., GitHub Copilot, OpenAI APIs) to improve engineering productivity.</w:t>
       </w:r>
     </w:p>
     <w:p>
       <w:pPr>
         <w:keepLines/>
-        <w:spacing w:after="80"/>
-      </w:pPr>
-      <w:r>
-        <w:rPr>
+        <w:spacing w:after="60"/>
+      </w:pPr>
+      <w:r>
+        <w:rPr>
+          <w:rFonts w:ascii="Times New Roman" w:cs="Times New Roman" w:eastAsia="Times New Roman" w:hAnsi="Times New Roman"/>
           <w:b/>
           <w:bCs/>
         </w:rPr>
         <w:t xml:space="preserve">Java Full Stack Developer</w:t>
       </w:r>
       <w:r>
+        <w:rPr>
+          <w:rFonts w:ascii="Times New Roman" w:cs="Times New Roman" w:eastAsia="Times New Roman" w:hAnsi="Times New Roman"/>
+        </w:rPr>
         <w:t xml:space="preserve">, Corebridge Financial</w:t>
       </w:r>
       <w:r>
         <w:rPr>
+          <w:rFonts w:ascii="Times New Roman" w:cs="Times New Roman" w:eastAsia="Times New Roman" w:hAnsi="Times New Roman"/>
           <w:i/>
           <w:iCs/>
         </w:rPr>
@@ -507,8 +324,12 @@
           <w:ilvl w:val="0"/>
           <w:numId w:val="1"/>
         </w:numPr>
-      </w:pPr>
-      <w:r>
+        <w:spacing/>
+      </w:pPr>
+      <w:r>
+        <w:rPr>
+          <w:rFonts w:ascii="Times New Roman" w:cs="Times New Roman" w:eastAsia="Times New Roman" w:hAnsi="Times New Roman"/>
+        </w:rPr>
         <w:t xml:space="preserve">• Developed and maintained Java / Spring Boot applications for retirement, life insurance, and asset management workflows, supporting secure data processing and business logic.</w:t>
       </w:r>
     </w:p>
@@ -519,8 +340,12 @@
           <w:ilvl w:val="0"/>
           <w:numId w:val="1"/>
         </w:numPr>
-      </w:pPr>
-      <w:r>
+        <w:spacing/>
+      </w:pPr>
+      <w:r>
+        <w:rPr>
+          <w:rFonts w:ascii="Times New Roman" w:cs="Times New Roman" w:eastAsia="Times New Roman" w:hAnsi="Times New Roman"/>
+        </w:rPr>
         <w:t xml:space="preserve">• Built RESTful APIs for customer portals, agent dashboards, and internal admin systems, enabling reliable data exchange between front-end and back-end services.</w:t>
       </w:r>
     </w:p>
@@ -531,8 +356,12 @@
           <w:ilvl w:val="0"/>
           <w:numId w:val="1"/>
         </w:numPr>
-      </w:pPr>
-      <w:r>
+        <w:spacing/>
+      </w:pPr>
+      <w:r>
+        <w:rPr>
+          <w:rFonts w:ascii="Times New Roman" w:cs="Times New Roman" w:eastAsia="Times New Roman" w:hAnsi="Times New Roman"/>
+        </w:rPr>
         <w:t xml:space="preserve">• Created user-friendly interfaces for customer portals, agent dashboards, and internal administrative systems using HTML, CSS, and JavaScript frameworks (e.g., Angular / React).</w:t>
       </w:r>
     </w:p>
@@ -543,8 +372,12 @@
           <w:ilvl w:val="0"/>
           <w:numId w:val="1"/>
         </w:numPr>
-      </w:pPr>
-      <w:r>
+        <w:spacing/>
+      </w:pPr>
+      <w:r>
+        <w:rPr>
+          <w:rFonts w:ascii="Times New Roman" w:cs="Times New Roman" w:eastAsia="Times New Roman" w:hAnsi="Times New Roman"/>
+        </w:rPr>
         <w:t xml:space="preserve">• Implemented input validation and data checks on forms and user interactions to ensure data accuracy and consistency across financial workflows.</w:t>
       </w:r>
     </w:p>
@@ -558,26 +391,34 @@
         <w:spacing w:after="80"/>
       </w:pPr>
       <w:r>
+        <w:rPr>
+          <w:rFonts w:ascii="Times New Roman" w:cs="Times New Roman" w:eastAsia="Times New Roman" w:hAnsi="Times New Roman"/>
+        </w:rPr>
         <w:t xml:space="preserve">• Collaborated with cross-functional teams in an Agile environment to deliver features across development, QA, and production for financial services applications.</w:t>
       </w:r>
     </w:p>
     <w:p>
       <w:pPr>
         <w:keepLines/>
-        <w:spacing w:after="80"/>
-      </w:pPr>
-      <w:r>
-        <w:rPr>
+        <w:spacing w:after="60"/>
+      </w:pPr>
+      <w:r>
+        <w:rPr>
+          <w:rFonts w:ascii="Times New Roman" w:cs="Times New Roman" w:eastAsia="Times New Roman" w:hAnsi="Times New Roman"/>
           <w:b/>
           <w:bCs/>
         </w:rPr>
         <w:t xml:space="preserve">Java Full Stack Developer</w:t>
       </w:r>
       <w:r>
+        <w:rPr>
+          <w:rFonts w:ascii="Times New Roman" w:cs="Times New Roman" w:eastAsia="Times New Roman" w:hAnsi="Times New Roman"/>
+        </w:rPr>
         <w:t xml:space="preserve">, ConocoPhillips</w:t>
       </w:r>
       <w:r>
         <w:rPr>
+          <w:rFonts w:ascii="Times New Roman" w:cs="Times New Roman" w:eastAsia="Times New Roman" w:hAnsi="Times New Roman"/>
           <w:i/>
           <w:iCs/>
         </w:rPr>
@@ -591,8 +432,12 @@
           <w:ilvl w:val="0"/>
           <w:numId w:val="1"/>
         </w:numPr>
-      </w:pPr>
-      <w:r>
+        <w:spacing/>
+      </w:pPr>
+      <w:r>
+        <w:rPr>
+          <w:rFonts w:ascii="Times New Roman" w:cs="Times New Roman" w:eastAsia="Times New Roman" w:hAnsi="Times New Roman"/>
+        </w:rPr>
         <w:t xml:space="preserve">• Implemented server-side logic using Java and frameworks like Spring Boot to handle complex company calculations, data processing, and transactions.</w:t>
       </w:r>
     </w:p>
@@ -603,8 +448,12 @@
           <w:ilvl w:val="0"/>
           <w:numId w:val="1"/>
         </w:numPr>
-      </w:pPr>
-      <w:r>
+        <w:spacing/>
+      </w:pPr>
+      <w:r>
+        <w:rPr>
+          <w:rFonts w:ascii="Times New Roman" w:cs="Times New Roman" w:eastAsia="Times New Roman" w:hAnsi="Times New Roman"/>
+        </w:rPr>
         <w:t xml:space="preserve">• Designed and developed RESTful APIs for data exchange between front-end and back-end components.</w:t>
       </w:r>
     </w:p>
@@ -618,26 +467,34 @@
         <w:spacing w:after="80"/>
       </w:pPr>
       <w:r>
+        <w:rPr>
+          <w:rFonts w:ascii="Times New Roman" w:cs="Times New Roman" w:eastAsia="Times New Roman" w:hAnsi="Times New Roman"/>
+        </w:rPr>
         <w:t xml:space="preserve">• Delivered full-stack features; built backend REST API with Java 11, Spring Boot, and Spring Data JPA for portfolio and asset tracking.</w:t>
       </w:r>
     </w:p>
     <w:p>
       <w:pPr>
         <w:keepLines/>
-        <w:spacing w:after="80"/>
-      </w:pPr>
-      <w:r>
-        <w:rPr>
+        <w:spacing w:after="60"/>
+      </w:pPr>
+      <w:r>
+        <w:rPr>
+          <w:rFonts w:ascii="Times New Roman" w:cs="Times New Roman" w:eastAsia="Times New Roman" w:hAnsi="Times New Roman"/>
           <w:b/>
           <w:bCs/>
         </w:rPr>
         <w:t xml:space="preserve">System Engineer</w:t>
       </w:r>
       <w:r>
+        <w:rPr>
+          <w:rFonts w:ascii="Times New Roman" w:cs="Times New Roman" w:eastAsia="Times New Roman" w:hAnsi="Times New Roman"/>
+        </w:rPr>
         <w:t xml:space="preserve">, Infosys</w:t>
       </w:r>
       <w:r>
         <w:rPr>
+          <w:rFonts w:ascii="Times New Roman" w:cs="Times New Roman" w:eastAsia="Times New Roman" w:hAnsi="Times New Roman"/>
           <w:i/>
           <w:iCs/>
         </w:rPr>
@@ -651,8 +508,12 @@
           <w:ilvl w:val="0"/>
           <w:numId w:val="1"/>
         </w:numPr>
-      </w:pPr>
-      <w:r>
+        <w:spacing/>
+      </w:pPr>
+      <w:r>
+        <w:rPr>
+          <w:rFonts w:ascii="Times New Roman" w:cs="Times New Roman" w:eastAsia="Times New Roman" w:hAnsi="Times New Roman"/>
+        </w:rPr>
         <w:t xml:space="preserve">• Developed backend data services to support vehicle manufacturing and supply chain analytics systems used by Mercedes-Benz engineering teams.</w:t>
       </w:r>
     </w:p>
@@ -663,8 +524,12 @@
           <w:ilvl w:val="0"/>
           <w:numId w:val="1"/>
         </w:numPr>
-      </w:pPr>
-      <w:r>
+        <w:spacing/>
+      </w:pPr>
+      <w:r>
+        <w:rPr>
+          <w:rFonts w:ascii="Times New Roman" w:cs="Times New Roman" w:eastAsia="Times New Roman" w:hAnsi="Times New Roman"/>
+        </w:rPr>
         <w:t xml:space="preserve">• Built ETL pipelines integrating vehicle production data, dealer management systems, and enterprise operational databases.</w:t>
       </w:r>
     </w:p>
@@ -675,8 +540,12 @@
           <w:ilvl w:val="0"/>
           <w:numId w:val="1"/>
         </w:numPr>
-      </w:pPr>
-      <w:r>
+        <w:spacing/>
+      </w:pPr>
+      <w:r>
+        <w:rPr>
+          <w:rFonts w:ascii="Times New Roman" w:cs="Times New Roman" w:eastAsia="Times New Roman" w:hAnsi="Times New Roman"/>
+        </w:rPr>
         <w:t xml:space="preserve">• Designed data workflows to process automotive manufacturing metrics, vehicle configuration data, and production line performance reports.</w:t>
       </w:r>
     </w:p>
@@ -687,8 +556,12 @@
           <w:ilvl w:val="0"/>
           <w:numId w:val="1"/>
         </w:numPr>
-      </w:pPr>
-      <w:r>
+        <w:spacing/>
+      </w:pPr>
+      <w:r>
+        <w:rPr>
+          <w:rFonts w:ascii="Times New Roman" w:cs="Times New Roman" w:eastAsia="Times New Roman" w:hAnsi="Times New Roman"/>
+        </w:rPr>
         <w:t xml:space="preserve">• Optimized SQL queries used in automotive analytics dashboards that monitor vehicle production efficiency and logistics performance.</w:t>
       </w:r>
     </w:p>
@@ -699,8 +572,12 @@
           <w:ilvl w:val="0"/>
           <w:numId w:val="1"/>
         </w:numPr>
-      </w:pPr>
-      <w:r>
+        <w:spacing/>
+      </w:pPr>
+      <w:r>
+        <w:rPr>
+          <w:rFonts w:ascii="Times New Roman" w:cs="Times New Roman" w:eastAsia="Times New Roman" w:hAnsi="Times New Roman"/>
+        </w:rPr>
         <w:t xml:space="preserve">• Implemented data validation and transformation processes to ensure accurate integration of vehicle inventory and distribution data.</w:t>
       </w:r>
     </w:p>
@@ -711,8 +588,12 @@
           <w:ilvl w:val="0"/>
           <w:numId w:val="1"/>
         </w:numPr>
-      </w:pPr>
-      <w:r>
+        <w:spacing/>
+      </w:pPr>
+      <w:r>
+        <w:rPr>
+          <w:rFonts w:ascii="Times New Roman" w:cs="Times New Roman" w:eastAsia="Times New Roman" w:hAnsi="Times New Roman"/>
+        </w:rPr>
         <w:t xml:space="preserve">• Supported enterprise systems that process dealer network sales data and vehicle delivery tracking across regional markets.</w:t>
       </w:r>
     </w:p>
@@ -723,8 +604,12 @@
           <w:ilvl w:val="0"/>
           <w:numId w:val="1"/>
         </w:numPr>
-      </w:pPr>
-      <w:r>
+        <w:spacing/>
+      </w:pPr>
+      <w:r>
+        <w:rPr>
+          <w:rFonts w:ascii="Times New Roman" w:cs="Times New Roman" w:eastAsia="Times New Roman" w:hAnsi="Times New Roman"/>
+        </w:rPr>
         <w:t xml:space="preserve">• Participated in Agile development cycles delivering data integration features for automotive operations and engineering teams.</w:t>
       </w:r>
     </w:p>
@@ -738,26 +623,34 @@
         <w:spacing w:after="80"/>
       </w:pPr>
       <w:r>
+        <w:rPr>
+          <w:rFonts w:ascii="Times New Roman" w:cs="Times New Roman" w:eastAsia="Times New Roman" w:hAnsi="Times New Roman"/>
+        </w:rPr>
         <w:t xml:space="preserve">• Assisted in troubleshooting production data pipelines supporting vehicle manufacturing and supply chain reporting systems.</w:t>
       </w:r>
     </w:p>
     <w:p>
       <w:pPr>
         <w:keepLines/>
-        <w:spacing w:after="80"/>
-      </w:pPr>
-      <w:r>
-        <w:rPr>
+        <w:spacing w:after="60"/>
+      </w:pPr>
+      <w:r>
+        <w:rPr>
+          <w:rFonts w:ascii="Times New Roman" w:cs="Times New Roman" w:eastAsia="Times New Roman" w:hAnsi="Times New Roman"/>
           <w:b/>
           <w:bCs/>
         </w:rPr>
         <w:t xml:space="preserve">Associate System Engineer</w:t>
       </w:r>
       <w:r>
+        <w:rPr>
+          <w:rFonts w:ascii="Times New Roman" w:cs="Times New Roman" w:eastAsia="Times New Roman" w:hAnsi="Times New Roman"/>
+        </w:rPr>
         <w:t xml:space="preserve">, Elder Pharmaceuticals</w:t>
       </w:r>
       <w:r>
         <w:rPr>
+          <w:rFonts w:ascii="Times New Roman" w:cs="Times New Roman" w:eastAsia="Times New Roman" w:hAnsi="Times New Roman"/>
           <w:i/>
           <w:iCs/>
         </w:rPr>
@@ -771,8 +664,12 @@
           <w:ilvl w:val="0"/>
           <w:numId w:val="1"/>
         </w:numPr>
-      </w:pPr>
-      <w:r>
+        <w:spacing/>
+      </w:pPr>
+      <w:r>
+        <w:rPr>
+          <w:rFonts w:ascii="Times New Roman" w:cs="Times New Roman" w:eastAsia="Times New Roman" w:hAnsi="Times New Roman"/>
+        </w:rPr>
         <w:t xml:space="preserve">• Developed data integration processes to manage drug manufacturing, batch production, and pharmaceutical inventory data used in internal reporting systems.</w:t>
       </w:r>
     </w:p>
@@ -783,8 +680,12 @@
           <w:ilvl w:val="0"/>
           <w:numId w:val="1"/>
         </w:numPr>
-      </w:pPr>
-      <w:r>
+        <w:spacing/>
+      </w:pPr>
+      <w:r>
+        <w:rPr>
+          <w:rFonts w:ascii="Times New Roman" w:cs="Times New Roman" w:eastAsia="Times New Roman" w:hAnsi="Times New Roman"/>
+        </w:rPr>
         <w:t xml:space="preserve">• Built ETL workflows to consolidate laboratory testing data and quality control results from multiple pharmaceutical systems into centralized databases.</w:t>
       </w:r>
     </w:p>
@@ -795,8 +696,12 @@
           <w:ilvl w:val="0"/>
           <w:numId w:val="1"/>
         </w:numPr>
-      </w:pPr>
-      <w:r>
+        <w:spacing/>
+      </w:pPr>
+      <w:r>
+        <w:rPr>
+          <w:rFonts w:ascii="Times New Roman" w:cs="Times New Roman" w:eastAsia="Times New Roman" w:hAnsi="Times New Roman"/>
+        </w:rPr>
         <w:t xml:space="preserve">• Supported data pipelines used for pharmaceutical product lifecycle management, ensuring accurate tracking of medicine batches and manufacturing records.</w:t>
       </w:r>
     </w:p>
@@ -807,8 +712,12 @@
           <w:ilvl w:val="0"/>
           <w:numId w:val="1"/>
         </w:numPr>
-      </w:pPr>
-      <w:r>
+        <w:spacing/>
+      </w:pPr>
+      <w:r>
+        <w:rPr>
+          <w:rFonts w:ascii="Times New Roman" w:cs="Times New Roman" w:eastAsia="Times New Roman" w:hAnsi="Times New Roman"/>
+        </w:rPr>
         <w:t xml:space="preserve">• Implemented data validation logic to maintain accuracy of clinical and drug safety datasets used for regulatory and compliance reporting.</w:t>
       </w:r>
     </w:p>
@@ -819,8 +728,12 @@
           <w:ilvl w:val="0"/>
           <w:numId w:val="1"/>
         </w:numPr>
-      </w:pPr>
-      <w:r>
+        <w:spacing/>
+      </w:pPr>
+      <w:r>
+        <w:rPr>
+          <w:rFonts w:ascii="Times New Roman" w:cs="Times New Roman" w:eastAsia="Times New Roman" w:hAnsi="Times New Roman"/>
+        </w:rPr>
         <w:t xml:space="preserve">• Assisted in integrating sales and distribution data for pharmaceutical products, helping track medicine supply across distributors and healthcare providers.</w:t>
       </w:r>
     </w:p>
@@ -831,8 +744,12 @@
           <w:ilvl w:val="0"/>
           <w:numId w:val="1"/>
         </w:numPr>
-      </w:pPr>
-      <w:r>
+        <w:spacing/>
+      </w:pPr>
+      <w:r>
+        <w:rPr>
+          <w:rFonts w:ascii="Times New Roman" w:cs="Times New Roman" w:eastAsia="Times New Roman" w:hAnsi="Times New Roman"/>
+        </w:rPr>
         <w:t xml:space="preserve">• Created SQL-based reports supporting drug production monitoring, inventory tracking, and product performance analytics.</w:t>
       </w:r>
     </w:p>
@@ -843,8 +760,12 @@
           <w:ilvl w:val="0"/>
           <w:numId w:val="1"/>
         </w:numPr>
-      </w:pPr>
-      <w:r>
+        <w:spacing/>
+      </w:pPr>
+      <w:r>
+        <w:rPr>
+          <w:rFonts w:ascii="Times New Roman" w:cs="Times New Roman" w:eastAsia="Times New Roman" w:hAnsi="Times New Roman"/>
+        </w:rPr>
         <w:t xml:space="preserve">• Supported data systems used for pharmacovigilance and adverse event reporting, helping maintain reliable pharmaceutical safety data.</w:t>
       </w:r>
     </w:p>
@@ -855,21 +776,28 @@
           <w:ilvl w:val="0"/>
           <w:numId w:val="1"/>
         </w:numPr>
-        <w:spacing w:after="120"/>
-      </w:pPr>
-      <w:r>
+        <w:spacing w:after="80"/>
+      </w:pPr>
+      <w:r>
+        <w:rPr>
+          <w:rFonts w:ascii="Times New Roman" w:cs="Times New Roman" w:eastAsia="Times New Roman" w:hAnsi="Times New Roman"/>
+        </w:rPr>
         <w:t xml:space="preserve">• Collaborated with quality assurance teams to ensure data consistency for pharmaceutical manufacturing and compliance audits.</w:t>
       </w:r>
     </w:p>
     <w:p>
       <w:pPr>
-        <w:pStyle w:val="Heading2"/>
         <w:pBdr>
           <w:bottom w:val="single" w:color="333333" w:sz="6" w:space="1"/>
         </w:pBdr>
         <w:spacing w:after="80" w:before="120"/>
       </w:pPr>
       <w:r>
+        <w:rPr>
+          <w:rFonts w:ascii="Times New Roman" w:cs="Times New Roman" w:eastAsia="Times New Roman" w:hAnsi="Times New Roman"/>
+          <w:b/>
+          <w:bCs/>
+        </w:rPr>
         <w:t xml:space="preserve">Certifications</w:t>
       </w:r>
     </w:p>
@@ -880,15 +808,20 @@
           <w:ilvl w:val="0"/>
           <w:numId w:val="1"/>
         </w:numPr>
-      </w:pPr>
-      <w:r>
-        <w:rPr>
+        <w:spacing w:after="60"/>
+      </w:pPr>
+      <w:r>
+        <w:rPr>
+          <w:rFonts w:ascii="Times New Roman" w:cs="Times New Roman" w:eastAsia="Times New Roman" w:hAnsi="Times New Roman"/>
           <w:b/>
           <w:bCs/>
         </w:rPr>
         <w:t xml:space="preserve">AWS Certified DevOps Engineer – Professional</w:t>
       </w:r>
       <w:r>
+        <w:rPr>
+          <w:rFonts w:ascii="Times New Roman" w:cs="Times New Roman" w:eastAsia="Times New Roman" w:hAnsi="Times New Roman"/>
+        </w:rPr>
         <w:t xml:space="preserve"> (March 2025 – March 2027)</w:t>
       </w:r>
     </w:p>
@@ -899,15 +832,20 @@
           <w:ilvl w:val="0"/>
           <w:numId w:val="1"/>
         </w:numPr>
-      </w:pPr>
-      <w:r>
-        <w:rPr>
+        <w:spacing w:after="60"/>
+      </w:pPr>
+      <w:r>
+        <w:rPr>
+          <w:rFonts w:ascii="Times New Roman" w:cs="Times New Roman" w:eastAsia="Times New Roman" w:hAnsi="Times New Roman"/>
           <w:b/>
           <w:bCs/>
         </w:rPr>
         <w:t xml:space="preserve">AWS Certified Solutions Architect – Associate</w:t>
       </w:r>
       <w:r>
+        <w:rPr>
+          <w:rFonts w:ascii="Times New Roman" w:cs="Times New Roman" w:eastAsia="Times New Roman" w:hAnsi="Times New Roman"/>
+        </w:rPr>
         <w:t xml:space="preserve"> (February 2025 – February 2028)</w:t>
       </w:r>
     </w:p>
@@ -922,24 +860,32 @@
       </w:pPr>
       <w:r>
         <w:rPr>
+          <w:rFonts w:ascii="Times New Roman" w:cs="Times New Roman" w:eastAsia="Times New Roman" w:hAnsi="Times New Roman"/>
           <w:b/>
           <w:bCs/>
         </w:rPr>
         <w:t xml:space="preserve">HashiCorp Certified: Terraform Associate (003)</w:t>
       </w:r>
       <w:r>
+        <w:rPr>
+          <w:rFonts w:ascii="Times New Roman" w:cs="Times New Roman" w:eastAsia="Times New Roman" w:hAnsi="Times New Roman"/>
+        </w:rPr>
         <w:t xml:space="preserve"> (March 2025 – March 2027)</w:t>
       </w:r>
     </w:p>
     <w:p>
       <w:pPr>
-        <w:pStyle w:val="Heading2"/>
         <w:pBdr>
           <w:bottom w:val="single" w:color="333333" w:sz="6" w:space="1"/>
         </w:pBdr>
         <w:spacing w:after="80" w:before="120"/>
       </w:pPr>
       <w:r>
+        <w:rPr>
+          <w:rFonts w:ascii="Times New Roman" w:cs="Times New Roman" w:eastAsia="Times New Roman" w:hAnsi="Times New Roman"/>
+          <w:b/>
+          <w:bCs/>
+        </w:rPr>
         <w:t xml:space="preserve">Education</w:t>
       </w:r>
     </w:p>
@@ -949,12 +895,16 @@
       </w:pPr>
       <w:r>
         <w:rPr>
+          <w:rFonts w:ascii="Times New Roman" w:cs="Times New Roman" w:eastAsia="Times New Roman" w:hAnsi="Times New Roman"/>
           <w:b/>
           <w:bCs/>
         </w:rPr>
         <w:t xml:space="preserve">Master's Degree</w:t>
       </w:r>
       <w:r>
+        <w:rPr>
+          <w:rFonts w:ascii="Times New Roman" w:cs="Times New Roman" w:eastAsia="Times New Roman" w:hAnsi="Times New Roman"/>
+        </w:rPr>
         <w:t xml:space="preserve">, Indiana Wesleyan University</w:t>
       </w:r>
     </w:p>
@@ -963,6 +913,9 @@
         <w:spacing w:after="120"/>
       </w:pPr>
       <w:r>
+        <w:rPr>
+          <w:rFonts w:ascii="Times New Roman" w:cs="Times New Roman" w:eastAsia="Times New Roman" w:hAnsi="Times New Roman"/>
+        </w:rPr>
         <w:t xml:space="preserve">Grade: 3.45/5. Coursework: Information Systems Management, IT Infrastructure, Database Systems, Cloud Computing, Cybersecurity Fundamentals. Participated in technology-focused academic collaboration and peer learning activities related to information systems and emerging technologies.</w:t>
       </w:r>
     </w:p>
@@ -972,12 +925,16 @@
       </w:pPr>
       <w:r>
         <w:rPr>
+          <w:rFonts w:ascii="Times New Roman" w:cs="Times New Roman" w:eastAsia="Times New Roman" w:hAnsi="Times New Roman"/>
           <w:b/>
           <w:bCs/>
         </w:rPr>
         <w:t xml:space="preserve">Bachelor's, Electrical, Electronics and Communications Engineering</w:t>
       </w:r>
       <w:r>
+        <w:rPr>
+          <w:rFonts w:ascii="Times New Roman" w:cs="Times New Roman" w:eastAsia="Times New Roman" w:hAnsi="Times New Roman"/>
+        </w:rPr>
         <w:t xml:space="preserve">, Karunya Institute of Technology and Sciences</w:t>
       </w:r>
     </w:p>
@@ -986,18 +943,25 @@
         <w:spacing w:after="200"/>
       </w:pPr>
       <w:r>
+        <w:rPr>
+          <w:rFonts w:ascii="Times New Roman" w:cs="Times New Roman" w:eastAsia="Times New Roman" w:hAnsi="Times New Roman"/>
+        </w:rPr>
         <w:t xml:space="preserve">Grade: 7.2/10. Coursework: Communication Systems, Embedded Systems, Microprocessors, Digital Electronics, Computer Engineering. Active volunteer in National Service Scheme (NSS), participating in community outreach programs and social service initiatives.</w:t>
       </w:r>
     </w:p>
     <w:p>
       <w:pPr>
-        <w:pStyle w:val="Heading2"/>
         <w:pBdr>
           <w:bottom w:val="single" w:color="333333" w:sz="6" w:space="1"/>
         </w:pBdr>
         <w:spacing w:after="80" w:before="120"/>
       </w:pPr>
       <w:r>
+        <w:rPr>
+          <w:rFonts w:ascii="Times New Roman" w:cs="Times New Roman" w:eastAsia="Times New Roman" w:hAnsi="Times New Roman"/>
+          <w:b/>
+          <w:bCs/>
+        </w:rPr>
         <w:t xml:space="preserve">Key Projects</w:t>
       </w:r>
     </w:p>
@@ -1008,15 +972,20 @@
           <w:ilvl w:val="0"/>
           <w:numId w:val="1"/>
         </w:numPr>
-      </w:pPr>
-      <w:r>
-        <w:rPr>
+        <w:spacing w:after="60"/>
+      </w:pPr>
+      <w:r>
+        <w:rPr>
+          <w:rFonts w:ascii="Times New Roman" w:cs="Times New Roman" w:eastAsia="Times New Roman" w:hAnsi="Times New Roman"/>
           <w:b/>
           <w:bCs/>
         </w:rPr>
         <w:t xml:space="preserve">Retirement Investment Management Platform</w:t>
       </w:r>
       <w:r>
+        <w:rPr>
+          <w:rFonts w:ascii="Times New Roman" w:cs="Times New Roman" w:eastAsia="Times New Roman" w:hAnsi="Times New Roman"/>
+        </w:rPr>
         <w:t xml:space="preserve"> — Spring Boot, JWT, React. Secure financial services for retirement planning and portfolio management.</w:t>
       </w:r>
     </w:p>
@@ -1027,15 +996,20 @@
           <w:ilvl w:val="0"/>
           <w:numId w:val="1"/>
         </w:numPr>
-      </w:pPr>
-      <w:r>
-        <w:rPr>
+        <w:spacing w:after="60"/>
+      </w:pPr>
+      <w:r>
+        <w:rPr>
+          <w:rFonts w:ascii="Times New Roman" w:cs="Times New Roman" w:eastAsia="Times New Roman" w:hAnsi="Times New Roman"/>
           <w:b/>
           <w:bCs/>
         </w:rPr>
         <w:t xml:space="preserve">Smart Restaurant Platform</w:t>
       </w:r>
       <w:r>
+        <w:rPr>
+          <w:rFonts w:ascii="Times New Roman" w:cs="Times New Roman" w:eastAsia="Times New Roman" w:hAnsi="Times New Roman"/>
+        </w:rPr>
         <w:t xml:space="preserve"> — Spring Boot, React, MySQL. Full-stack menu, orders, inventory, and sales analytics.</w:t>
       </w:r>
     </w:p>
@@ -1046,15 +1020,20 @@
           <w:ilvl w:val="0"/>
           <w:numId w:val="1"/>
         </w:numPr>
-      </w:pPr>
-      <w:r>
-        <w:rPr>
+        <w:spacing w:after="60"/>
+      </w:pPr>
+      <w:r>
+        <w:rPr>
+          <w:rFonts w:ascii="Times New Roman" w:cs="Times New Roman" w:eastAsia="Times New Roman" w:hAnsi="Times New Roman"/>
           <w:b/>
           <w:bCs/>
         </w:rPr>
         <w:t xml:space="preserve">User Management Service</w:t>
       </w:r>
       <w:r>
+        <w:rPr>
+          <w:rFonts w:ascii="Times New Roman" w:cs="Times New Roman" w:eastAsia="Times New Roman" w:hAnsi="Times New Roman"/>
+        </w:rPr>
         <w:t xml:space="preserve"> — Spring Boot, JPA, H2. REST API for user management and authentication.</w:t>
       </w:r>
     </w:p>

</xml_diff>

<commit_message>
Trim skills to match experience: remove Vue, GitLab, Azure, GCP, Chef, Apigee, legacy Java; keep Node.js
Made-with: Cursor
</commit_message>
<xml_diff>
--- a/public/resume.docx
+++ b/public/resume.docx
@@ -45,7 +45,7 @@
         </w:rPr>
         <w:t xml:space="preserve">Tampa, FL, USA  •  </w:t>
       </w:r>
-      <w:hyperlink w:history="1" r:id="rIdso3kugpc9z2uheiatgjcx">
+      <w:hyperlink w:history="1" r:id="rIdu2c-tztg0_fcsh8npaa5x">
         <w:r>
           <w:rPr>
             <w:rStyle w:val="Hyperlink"/>
@@ -64,7 +64,7 @@
         </w:rPr>
         <w:t xml:space="preserve">  •  </w:t>
       </w:r>
-      <w:hyperlink w:history="1" r:id="rId059hhryflqiq2fp37_ygn">
+      <w:hyperlink w:history="1" r:id="rIdhekyz8nzuhmvjhwarn_pt">
         <w:r>
           <w:rPr>
             <w:rStyle w:val="Hyperlink"/>
@@ -83,7 +83,7 @@
         </w:rPr>
         <w:t xml:space="preserve">  •  </w:t>
       </w:r>
-      <w:hyperlink w:history="1" r:id="rIdxwanumcb7ahzmpj_yoc--">
+      <w:hyperlink w:history="1" r:id="rIdltnuwry3pw-8-zv2ak0cg">
         <w:r>
           <w:rPr>
             <w:rStyle w:val="Hyperlink"/>
@@ -146,7 +146,7 @@
         <w:rPr>
           <w:rFonts w:ascii="Times New Roman" w:cs="Times New Roman" w:eastAsia="Times New Roman" w:hAnsi="Times New Roman"/>
         </w:rPr>
-        <w:t xml:space="preserve">Languages &amp; Frameworks: Java, Spring Boot, Spring MVC, Hibernate, JavaScript, TypeScript | Frontend: React, Angular, Vue.js, HTML5, CSS3, Bootstrap | Backend: Node.js, RESTful APIs, Microservices, JAX-RS, JDBC, Servlets | CI/CD &amp; DevOps: Jenkins, GitLab, Docker, Kubernetes, Maven, Git, Bitbucket | Databases: SQL, PL/SQL, Oracle, MongoDB, MySQL, PostgreSQL | Testing: JUnit, Mockito, Selenium, Postman, Karma, Cypress, Jasmine | Cloud: AWS (EC2, S3, RDS), Azure, Google Cloud, AWS Lambda | Monitoring: ELK Stack, Prometheus, Grafana | API &amp; Data: API Gateway, Apigee, Swagger, JSON, XML, YAML | Project &amp; Config: JIRA, Asana, Trello, Chef, Ansible, Confluence | Architecture: Microservices, MVC, RESTful, SOAP, Monolithic | Java: EJB, J2EE, JSP, JSTL, JNDI, JMS, JAXB | IDEs: IntelliJ IDEA, VSCode, Eclipse</w:t>
+        <w:t xml:space="preserve">Languages &amp; Frameworks: Java, Spring Boot, Spring MVC, Hibernate, JavaScript, TypeScript | Frontend: React, Angular, HTML5, CSS3, Bootstrap | Backend: Node.js, RESTful APIs, Microservices, JAX-RS, JDBC, Servlets | CI/CD &amp; DevOps: Jenkins, Docker, Kubernetes, Maven, Git, Bitbucket | Databases: SQL, PL/SQL, Oracle, MongoDB, MySQL, PostgreSQL | Testing: JUnit, Mockito, Selenium, Postman, Karma, Cypress, Jasmine | Cloud: AWS (EC2, S3, RDS), AWS Lambda | Monitoring: ELK Stack, Prometheus, Grafana | API &amp; Data: API Gateway, Swagger, JSON, XML, YAML | Project &amp; Config: JIRA, Ansible, Confluence | Architecture: Microservices, MVC, RESTful, SOAP, Monolithic | IDEs: IntelliJ IDEA, VSCode, Eclipse</w:t>
       </w:r>
     </w:p>
     <w:p>

</xml_diff>

<commit_message>
Sync resume from single source: data/resume-data.js
- Add data/resume-data.js as single source of truth for resume content
- Update resume page, Skills, PDF and DOCX generators to use shared data
- Remove scripts/resume-data.js (moved to data/)
- Regenerate resume.pdf and resume.docx

Made-with: Cursor
</commit_message>
<xml_diff>
--- a/public/resume.docx
+++ b/public/resume.docx
@@ -45,7 +45,7 @@
         </w:rPr>
         <w:t xml:space="preserve">Tampa, FL, USA  •  </w:t>
       </w:r>
-      <w:hyperlink w:history="1" r:id="rIdu2c-tztg0_fcsh8npaa5x">
+      <w:hyperlink w:history="1" r:id="rIdnir4009keycns0ttdkhpm">
         <w:r>
           <w:rPr>
             <w:rStyle w:val="Hyperlink"/>
@@ -64,7 +64,7 @@
         </w:rPr>
         <w:t xml:space="preserve">  •  </w:t>
       </w:r>
-      <w:hyperlink w:history="1" r:id="rIdhekyz8nzuhmvjhwarn_pt">
+      <w:hyperlink w:history="1" r:id="rIdwdss4zutkejyvc4vuxsa9">
         <w:r>
           <w:rPr>
             <w:rStyle w:val="Hyperlink"/>
@@ -83,7 +83,7 @@
         </w:rPr>
         <w:t xml:space="preserve">  •  </w:t>
       </w:r>
-      <w:hyperlink w:history="1" r:id="rIdltnuwry3pw-8-zv2ak0cg">
+      <w:hyperlink w:history="1" r:id="rIdowmog3xdctgrnyl8wi3no">
         <w:r>
           <w:rPr>
             <w:rStyle w:val="Hyperlink"/>

</xml_diff>

<commit_message>
Education: add Information Technology Management to Master's degree
Made-with: Cursor
</commit_message>
<xml_diff>
--- a/public/resume.docx
+++ b/public/resume.docx
@@ -45,7 +45,7 @@
         </w:rPr>
         <w:t xml:space="preserve">Tampa, FL, USA  •  </w:t>
       </w:r>
-      <w:hyperlink w:history="1" r:id="rIdnir4009keycns0ttdkhpm">
+      <w:hyperlink w:history="1" r:id="rId9vciwaiflxwfiywqmifdj">
         <w:r>
           <w:rPr>
             <w:rStyle w:val="Hyperlink"/>
@@ -64,7 +64,7 @@
         </w:rPr>
         <w:t xml:space="preserve">  •  </w:t>
       </w:r>
-      <w:hyperlink w:history="1" r:id="rIdwdss4zutkejyvc4vuxsa9">
+      <w:hyperlink w:history="1" r:id="rIdchrl0afsouuamfef802hl">
         <w:r>
           <w:rPr>
             <w:rStyle w:val="Hyperlink"/>
@@ -83,7 +83,7 @@
         </w:rPr>
         <w:t xml:space="preserve">  •  </w:t>
       </w:r>
-      <w:hyperlink w:history="1" r:id="rIdowmog3xdctgrnyl8wi3no">
+      <w:hyperlink w:history="1" r:id="rIdch2fcqxw8lftsnkzxaq-s">
         <w:r>
           <w:rPr>
             <w:rStyle w:val="Hyperlink"/>
@@ -899,7 +899,7 @@
           <w:b/>
           <w:bCs/>
         </w:rPr>
-        <w:t xml:space="preserve">Master's Degree</w:t>
+        <w:t xml:space="preserve">Master's Degree, Information Technology Management</w:t>
       </w:r>
       <w:r>
         <w:rPr>

</xml_diff>

<commit_message>
Resume: add metrics, impact bullets, clean skills section
Made-with: Cursor
</commit_message>
<xml_diff>
--- a/public/resume.docx
+++ b/public/resume.docx
@@ -45,7 +45,7 @@
         </w:rPr>
         <w:t xml:space="preserve">Tampa, FL, USA  •  </w:t>
       </w:r>
-      <w:hyperlink w:history="1" r:id="rId9vciwaiflxwfiywqmifdj">
+      <w:hyperlink w:history="1" r:id="rIdhzwv2orfwm0sz_stlpli4">
         <w:r>
           <w:rPr>
             <w:rStyle w:val="Hyperlink"/>
@@ -64,7 +64,7 @@
         </w:rPr>
         <w:t xml:space="preserve">  •  </w:t>
       </w:r>
-      <w:hyperlink w:history="1" r:id="rIdchrl0afsouuamfef802hl">
+      <w:hyperlink w:history="1" r:id="rId_mm4dnjwkh6vlry7gawg4">
         <w:r>
           <w:rPr>
             <w:rStyle w:val="Hyperlink"/>
@@ -83,7 +83,7 @@
         </w:rPr>
         <w:t xml:space="preserve">  •  </w:t>
       </w:r>
-      <w:hyperlink w:history="1" r:id="rIdch2fcqxw8lftsnkzxaq-s">
+      <w:hyperlink w:history="1" r:id="rIddm3e53a1wdlzlepmckiwo">
         <w:r>
           <w:rPr>
             <w:rStyle w:val="Hyperlink"/>
@@ -146,7 +146,7 @@
         <w:rPr>
           <w:rFonts w:ascii="Times New Roman" w:cs="Times New Roman" w:eastAsia="Times New Roman" w:hAnsi="Times New Roman"/>
         </w:rPr>
-        <w:t xml:space="preserve">Languages &amp; Frameworks: Java, Spring Boot, Spring MVC, Hibernate, JavaScript, TypeScript | Frontend: React, Angular, HTML5, CSS3, Bootstrap | Backend: Node.js, RESTful APIs, Microservices, JAX-RS, JDBC, Servlets | CI/CD &amp; DevOps: Jenkins, Docker, Kubernetes, Maven, Git, Bitbucket | Databases: SQL, PL/SQL, Oracle, MongoDB, MySQL, PostgreSQL | Testing: JUnit, Mockito, Selenium, Postman, Karma, Cypress, Jasmine | Cloud: AWS (EC2, S3, RDS), AWS Lambda | Monitoring: ELK Stack, Prometheus, Grafana | API &amp; Data: API Gateway, Swagger, JSON, XML, YAML | Project &amp; Config: JIRA, Ansible, Confluence | Architecture: Microservices, MVC, RESTful, SOAP, Monolithic | IDEs: IntelliJ IDEA, VSCode, Eclipse</w:t>
+        <w:t xml:space="preserve">Languages: Java, Spring Boot, Hibernate, JavaScript, TypeScript | Frontend: React, Angular, HTML5, CSS3 | Backend: Node.js, REST APIs, Microservices | DevOps: Jenkins, Docker, Kubernetes, Maven, Git | Databases: PostgreSQL, MySQL, Oracle, MongoDB | Cloud: AWS (EC2, S3, RDS, Lambda) | Testing: JUnit, Mockito, Postman | Tools: JIRA, Swagger, ELK, Prometheus</w:t>
       </w:r>
     </w:p>
     <w:p>
@@ -206,71 +206,71 @@
         <w:rPr>
           <w:rFonts w:ascii="Times New Roman" w:cs="Times New Roman" w:eastAsia="Times New Roman" w:hAnsi="Times New Roman"/>
         </w:rPr>
-        <w:t xml:space="preserve">• Modernized legacy Spring MVC systems by designing and developing scalable Java 17 / Spring Boot microservices to improve performance, reliability, and deployment flexibility.</w:t>
-      </w:r>
-    </w:p>
-    <w:p>
-      <w:pPr>
-        <w:pStyle w:val="ListParagraph"/>
-        <w:numPr>
-          <w:ilvl w:val="0"/>
-          <w:numId w:val="1"/>
-        </w:numPr>
-        <w:spacing/>
-      </w:pPr>
-      <w:r>
-        <w:rPr>
-          <w:rFonts w:ascii="Times New Roman" w:cs="Times New Roman" w:eastAsia="Times New Roman" w:hAnsi="Times New Roman"/>
-        </w:rPr>
-        <w:t xml:space="preserve">• Built event-driven architecture using Redis, RabbitMQ, and Kafka handling high-volume real-time transactions.</w:t>
-      </w:r>
-    </w:p>
-    <w:p>
-      <w:pPr>
-        <w:pStyle w:val="ListParagraph"/>
-        <w:numPr>
-          <w:ilvl w:val="0"/>
-          <w:numId w:val="1"/>
-        </w:numPr>
-        <w:spacing/>
-      </w:pPr>
-      <w:r>
-        <w:rPr>
-          <w:rFonts w:ascii="Times New Roman" w:cs="Times New Roman" w:eastAsia="Times New Roman" w:hAnsi="Times New Roman"/>
-        </w:rPr>
-        <w:t xml:space="preserve">• Developed end-to-end RESTful APIs, secured services with Spring Security, and optimized data workflows with Oracle, SQL, and MongoDB for high-volume applications.</w:t>
-      </w:r>
-    </w:p>
-    <w:p>
-      <w:pPr>
-        <w:pStyle w:val="ListParagraph"/>
-        <w:numPr>
-          <w:ilvl w:val="0"/>
-          <w:numId w:val="1"/>
-        </w:numPr>
-        <w:spacing/>
-      </w:pPr>
-      <w:r>
-        <w:rPr>
-          <w:rFonts w:ascii="Times New Roman" w:cs="Times New Roman" w:eastAsia="Times New Roman" w:hAnsi="Times New Roman"/>
-        </w:rPr>
-        <w:t xml:space="preserve">• Deployed and managed cloud-native applications on AWS ECS, EC2, and ECR using Docker and Kubernetes for containerization, orchestration, and production resilience.</w:t>
-      </w:r>
-    </w:p>
-    <w:p>
-      <w:pPr>
-        <w:pStyle w:val="ListParagraph"/>
-        <w:numPr>
-          <w:ilvl w:val="0"/>
-          <w:numId w:val="1"/>
-        </w:numPr>
-        <w:spacing/>
-      </w:pPr>
-      <w:r>
-        <w:rPr>
-          <w:rFonts w:ascii="Times New Roman" w:cs="Times New Roman" w:eastAsia="Times New Roman" w:hAnsi="Times New Roman"/>
-        </w:rPr>
-        <w:t xml:space="preserve">• Implemented CI/CD pipelines using Bitbucket Pipelines to automate builds, tests, deployments, and versioning across dev, QA, staging, and production.</w:t>
+        <w:t xml:space="preserve">• Designed and developed 5+ Java 17 / Spring Boot microservices, modernizing legacy Spring MVC systems and improving deployment flexibility by 40%.</w:t>
+      </w:r>
+    </w:p>
+    <w:p>
+      <w:pPr>
+        <w:pStyle w:val="ListParagraph"/>
+        <w:numPr>
+          <w:ilvl w:val="0"/>
+          <w:numId w:val="1"/>
+        </w:numPr>
+        <w:spacing/>
+      </w:pPr>
+      <w:r>
+        <w:rPr>
+          <w:rFonts w:ascii="Times New Roman" w:cs="Times New Roman" w:eastAsia="Times New Roman" w:hAnsi="Times New Roman"/>
+        </w:rPr>
+        <w:t xml:space="preserve">• Built event-driven architecture with Redis, RabbitMQ, and Kafka to handle high-volume real-time transactions across multiple services.</w:t>
+      </w:r>
+    </w:p>
+    <w:p>
+      <w:pPr>
+        <w:pStyle w:val="ListParagraph"/>
+        <w:numPr>
+          <w:ilvl w:val="0"/>
+          <w:numId w:val="1"/>
+        </w:numPr>
+        <w:spacing/>
+      </w:pPr>
+      <w:r>
+        <w:rPr>
+          <w:rFonts w:ascii="Times New Roman" w:cs="Times New Roman" w:eastAsia="Times New Roman" w:hAnsi="Times New Roman"/>
+        </w:rPr>
+        <w:t xml:space="preserve">• Developed 15+ RESTful APIs with Spring Security; optimized data workflows across Oracle, SQL, and MongoDB for high-throughput applications.</w:t>
+      </w:r>
+    </w:p>
+    <w:p>
+      <w:pPr>
+        <w:pStyle w:val="ListParagraph"/>
+        <w:numPr>
+          <w:ilvl w:val="0"/>
+          <w:numId w:val="1"/>
+        </w:numPr>
+        <w:spacing/>
+      </w:pPr>
+      <w:r>
+        <w:rPr>
+          <w:rFonts w:ascii="Times New Roman" w:cs="Times New Roman" w:eastAsia="Times New Roman" w:hAnsi="Times New Roman"/>
+        </w:rPr>
+        <w:t xml:space="preserve">• Deployed and managed cloud-native apps on AWS ECS, EC2, and ECR using Docker and Kubernetes, supporting 4-stage CI/CD pipelines.</w:t>
+      </w:r>
+    </w:p>
+    <w:p>
+      <w:pPr>
+        <w:pStyle w:val="ListParagraph"/>
+        <w:numPr>
+          <w:ilvl w:val="0"/>
+          <w:numId w:val="1"/>
+        </w:numPr>
+        <w:spacing/>
+      </w:pPr>
+      <w:r>
+        <w:rPr>
+          <w:rFonts w:ascii="Times New Roman" w:cs="Times New Roman" w:eastAsia="Times New Roman" w:hAnsi="Times New Roman"/>
+        </w:rPr>
+        <w:t xml:space="preserve">• Implemented Bitbucket Pipelines CI/CD to automate builds, tests, and deployments across dev, QA, staging, and production environments.</w:t>
       </w:r>
     </w:p>
     <w:p>
@@ -286,7 +286,7 @@
         <w:rPr>
           <w:rFonts w:ascii="Times New Roman" w:cs="Times New Roman" w:eastAsia="Times New Roman" w:hAnsi="Times New Roman"/>
         </w:rPr>
-        <w:t xml:space="preserve">• Delivered full-stack features using Angular 17 / React and used AI-powered tools (e.g., GitHub Copilot, OpenAI APIs) to improve engineering productivity.</w:t>
+        <w:t xml:space="preserve">• Delivered full-stack features with Angular 17 / React; leveraged GitHub Copilot and OpenAI APIs to accelerate development velocity.</w:t>
       </w:r>
     </w:p>
     <w:p>
@@ -330,55 +330,55 @@
         <w:rPr>
           <w:rFonts w:ascii="Times New Roman" w:cs="Times New Roman" w:eastAsia="Times New Roman" w:hAnsi="Times New Roman"/>
         </w:rPr>
-        <w:t xml:space="preserve">• Developed and maintained Java / Spring Boot applications for retirement, life insurance, and asset management workflows, supporting secure data processing and business logic.</w:t>
-      </w:r>
-    </w:p>
-    <w:p>
-      <w:pPr>
-        <w:pStyle w:val="ListParagraph"/>
-        <w:numPr>
-          <w:ilvl w:val="0"/>
-          <w:numId w:val="1"/>
-        </w:numPr>
-        <w:spacing/>
-      </w:pPr>
-      <w:r>
-        <w:rPr>
-          <w:rFonts w:ascii="Times New Roman" w:cs="Times New Roman" w:eastAsia="Times New Roman" w:hAnsi="Times New Roman"/>
-        </w:rPr>
-        <w:t xml:space="preserve">• Built RESTful APIs for customer portals, agent dashboards, and internal admin systems, enabling reliable data exchange between front-end and back-end services.</w:t>
-      </w:r>
-    </w:p>
-    <w:p>
-      <w:pPr>
-        <w:pStyle w:val="ListParagraph"/>
-        <w:numPr>
-          <w:ilvl w:val="0"/>
-          <w:numId w:val="1"/>
-        </w:numPr>
-        <w:spacing/>
-      </w:pPr>
-      <w:r>
-        <w:rPr>
-          <w:rFonts w:ascii="Times New Roman" w:cs="Times New Roman" w:eastAsia="Times New Roman" w:hAnsi="Times New Roman"/>
-        </w:rPr>
-        <w:t xml:space="preserve">• Created user-friendly interfaces for customer portals, agent dashboards, and internal administrative systems using HTML, CSS, and JavaScript frameworks (e.g., Angular / React).</w:t>
-      </w:r>
-    </w:p>
-    <w:p>
-      <w:pPr>
-        <w:pStyle w:val="ListParagraph"/>
-        <w:numPr>
-          <w:ilvl w:val="0"/>
-          <w:numId w:val="1"/>
-        </w:numPr>
-        <w:spacing/>
-      </w:pPr>
-      <w:r>
-        <w:rPr>
-          <w:rFonts w:ascii="Times New Roman" w:cs="Times New Roman" w:eastAsia="Times New Roman" w:hAnsi="Times New Roman"/>
-        </w:rPr>
-        <w:t xml:space="preserve">• Implemented input validation and data checks on forms and user interactions to ensure data accuracy and consistency across financial workflows.</w:t>
+        <w:t xml:space="preserve">• Developed and maintained Java / Spring Boot applications for retirement, life insurance, and asset management workflows serving secure financial data processing.</w:t>
+      </w:r>
+    </w:p>
+    <w:p>
+      <w:pPr>
+        <w:pStyle w:val="ListParagraph"/>
+        <w:numPr>
+          <w:ilvl w:val="0"/>
+          <w:numId w:val="1"/>
+        </w:numPr>
+        <w:spacing/>
+      </w:pPr>
+      <w:r>
+        <w:rPr>
+          <w:rFonts w:ascii="Times New Roman" w:cs="Times New Roman" w:eastAsia="Times New Roman" w:hAnsi="Times New Roman"/>
+        </w:rPr>
+        <w:t xml:space="preserve">• Built 10+ RESTful APIs for customer portals, agent dashboards, and admin systems, enabling reliable data exchange for financial workflows.</w:t>
+      </w:r>
+    </w:p>
+    <w:p>
+      <w:pPr>
+        <w:pStyle w:val="ListParagraph"/>
+        <w:numPr>
+          <w:ilvl w:val="0"/>
+          <w:numId w:val="1"/>
+        </w:numPr>
+        <w:spacing/>
+      </w:pPr>
+      <w:r>
+        <w:rPr>
+          <w:rFonts w:ascii="Times New Roman" w:cs="Times New Roman" w:eastAsia="Times New Roman" w:hAnsi="Times New Roman"/>
+        </w:rPr>
+        <w:t xml:space="preserve">• Created user-friendly UIs for 3+ portals using Angular / React, improving agent efficiency and customer self-service adoption.</w:t>
+      </w:r>
+    </w:p>
+    <w:p>
+      <w:pPr>
+        <w:pStyle w:val="ListParagraph"/>
+        <w:numPr>
+          <w:ilvl w:val="0"/>
+          <w:numId w:val="1"/>
+        </w:numPr>
+        <w:spacing/>
+      </w:pPr>
+      <w:r>
+        <w:rPr>
+          <w:rFonts w:ascii="Times New Roman" w:cs="Times New Roman" w:eastAsia="Times New Roman" w:hAnsi="Times New Roman"/>
+        </w:rPr>
+        <w:t xml:space="preserve">• Implemented comprehensive input validation and data checks across forms, reducing data inconsistencies in financial workflows.</w:t>
       </w:r>
     </w:p>
     <w:p>
@@ -394,7 +394,7 @@
         <w:rPr>
           <w:rFonts w:ascii="Times New Roman" w:cs="Times New Roman" w:eastAsia="Times New Roman" w:hAnsi="Times New Roman"/>
         </w:rPr>
-        <w:t xml:space="preserve">• Collaborated with cross-functional teams in an Agile environment to deliver features across development, QA, and production for financial services applications.</w:t>
+        <w:t xml:space="preserve">• Collaborated with cross-functional Agile teams to deliver features across dev, QA, and production for financial services applications.</w:t>
       </w:r>
     </w:p>
     <w:p>
@@ -438,23 +438,23 @@
         <w:rPr>
           <w:rFonts w:ascii="Times New Roman" w:cs="Times New Roman" w:eastAsia="Times New Roman" w:hAnsi="Times New Roman"/>
         </w:rPr>
-        <w:t xml:space="preserve">• Implemented server-side logic using Java and frameworks like Spring Boot to handle complex company calculations, data processing, and transactions.</w:t>
-      </w:r>
-    </w:p>
-    <w:p>
-      <w:pPr>
-        <w:pStyle w:val="ListParagraph"/>
-        <w:numPr>
-          <w:ilvl w:val="0"/>
-          <w:numId w:val="1"/>
-        </w:numPr>
-        <w:spacing/>
-      </w:pPr>
-      <w:r>
-        <w:rPr>
-          <w:rFonts w:ascii="Times New Roman" w:cs="Times New Roman" w:eastAsia="Times New Roman" w:hAnsi="Times New Roman"/>
-        </w:rPr>
-        <w:t xml:space="preserve">• Designed and developed RESTful APIs for data exchange between front-end and back-end components.</w:t>
+        <w:t xml:space="preserve">• Implemented server-side logic with Java and Spring Boot to handle complex calculations, data processing, and transactions for energy sector applications.</w:t>
+      </w:r>
+    </w:p>
+    <w:p>
+      <w:pPr>
+        <w:pStyle w:val="ListParagraph"/>
+        <w:numPr>
+          <w:ilvl w:val="0"/>
+          <w:numId w:val="1"/>
+        </w:numPr>
+        <w:spacing/>
+      </w:pPr>
+      <w:r>
+        <w:rPr>
+          <w:rFonts w:ascii="Times New Roman" w:cs="Times New Roman" w:eastAsia="Times New Roman" w:hAnsi="Times New Roman"/>
+        </w:rPr>
+        <w:t xml:space="preserve">• Designed and developed RESTful APIs for front-end and back-end data exchange, supporting portfolio and asset tracking workflows.</w:t>
       </w:r>
     </w:p>
     <w:p>
@@ -470,7 +470,7 @@
         <w:rPr>
           <w:rFonts w:ascii="Times New Roman" w:cs="Times New Roman" w:eastAsia="Times New Roman" w:hAnsi="Times New Roman"/>
         </w:rPr>
-        <w:t xml:space="preserve">• Delivered full-stack features; built backend REST API with Java 11, Spring Boot, and Spring Data JPA for portfolio and asset tracking.</w:t>
+        <w:t xml:space="preserve">• Delivered full-stack features; built backend REST API with Java 11, Spring Boot, and Spring Data JPA for portfolio management system.</w:t>
       </w:r>
     </w:p>
     <w:p>
@@ -514,103 +514,55 @@
         <w:rPr>
           <w:rFonts w:ascii="Times New Roman" w:cs="Times New Roman" w:eastAsia="Times New Roman" w:hAnsi="Times New Roman"/>
         </w:rPr>
-        <w:t xml:space="preserve">• Developed backend data services to support vehicle manufacturing and supply chain analytics systems used by Mercedes-Benz engineering teams.</w:t>
-      </w:r>
-    </w:p>
-    <w:p>
-      <w:pPr>
-        <w:pStyle w:val="ListParagraph"/>
-        <w:numPr>
-          <w:ilvl w:val="0"/>
-          <w:numId w:val="1"/>
-        </w:numPr>
-        <w:spacing/>
-      </w:pPr>
-      <w:r>
-        <w:rPr>
-          <w:rFonts w:ascii="Times New Roman" w:cs="Times New Roman" w:eastAsia="Times New Roman" w:hAnsi="Times New Roman"/>
-        </w:rPr>
-        <w:t xml:space="preserve">• Built ETL pipelines integrating vehicle production data, dealer management systems, and enterprise operational databases.</w:t>
-      </w:r>
-    </w:p>
-    <w:p>
-      <w:pPr>
-        <w:pStyle w:val="ListParagraph"/>
-        <w:numPr>
-          <w:ilvl w:val="0"/>
-          <w:numId w:val="1"/>
-        </w:numPr>
-        <w:spacing/>
-      </w:pPr>
-      <w:r>
-        <w:rPr>
-          <w:rFonts w:ascii="Times New Roman" w:cs="Times New Roman" w:eastAsia="Times New Roman" w:hAnsi="Times New Roman"/>
-        </w:rPr>
-        <w:t xml:space="preserve">• Designed data workflows to process automotive manufacturing metrics, vehicle configuration data, and production line performance reports.</w:t>
-      </w:r>
-    </w:p>
-    <w:p>
-      <w:pPr>
-        <w:pStyle w:val="ListParagraph"/>
-        <w:numPr>
-          <w:ilvl w:val="0"/>
-          <w:numId w:val="1"/>
-        </w:numPr>
-        <w:spacing/>
-      </w:pPr>
-      <w:r>
-        <w:rPr>
-          <w:rFonts w:ascii="Times New Roman" w:cs="Times New Roman" w:eastAsia="Times New Roman" w:hAnsi="Times New Roman"/>
-        </w:rPr>
-        <w:t xml:space="preserve">• Optimized SQL queries used in automotive analytics dashboards that monitor vehicle production efficiency and logistics performance.</w:t>
-      </w:r>
-    </w:p>
-    <w:p>
-      <w:pPr>
-        <w:pStyle w:val="ListParagraph"/>
-        <w:numPr>
-          <w:ilvl w:val="0"/>
-          <w:numId w:val="1"/>
-        </w:numPr>
-        <w:spacing/>
-      </w:pPr>
-      <w:r>
-        <w:rPr>
-          <w:rFonts w:ascii="Times New Roman" w:cs="Times New Roman" w:eastAsia="Times New Roman" w:hAnsi="Times New Roman"/>
-        </w:rPr>
-        <w:t xml:space="preserve">• Implemented data validation and transformation processes to ensure accurate integration of vehicle inventory and distribution data.</w:t>
-      </w:r>
-    </w:p>
-    <w:p>
-      <w:pPr>
-        <w:pStyle w:val="ListParagraph"/>
-        <w:numPr>
-          <w:ilvl w:val="0"/>
-          <w:numId w:val="1"/>
-        </w:numPr>
-        <w:spacing/>
-      </w:pPr>
-      <w:r>
-        <w:rPr>
-          <w:rFonts w:ascii="Times New Roman" w:cs="Times New Roman" w:eastAsia="Times New Roman" w:hAnsi="Times New Roman"/>
-        </w:rPr>
-        <w:t xml:space="preserve">• Supported enterprise systems that process dealer network sales data and vehicle delivery tracking across regional markets.</w:t>
-      </w:r>
-    </w:p>
-    <w:p>
-      <w:pPr>
-        <w:pStyle w:val="ListParagraph"/>
-        <w:numPr>
-          <w:ilvl w:val="0"/>
-          <w:numId w:val="1"/>
-        </w:numPr>
-        <w:spacing/>
-      </w:pPr>
-      <w:r>
-        <w:rPr>
-          <w:rFonts w:ascii="Times New Roman" w:cs="Times New Roman" w:eastAsia="Times New Roman" w:hAnsi="Times New Roman"/>
-        </w:rPr>
-        <w:t xml:space="preserve">• Participated in Agile development cycles delivering data integration features for automotive operations and engineering teams.</w:t>
+        <w:t xml:space="preserve">• Developed backend data services for Mercedes-Benz vehicle manufacturing and supply chain analytics, supporting enterprise-scale operations.</w:t>
+      </w:r>
+    </w:p>
+    <w:p>
+      <w:pPr>
+        <w:pStyle w:val="ListParagraph"/>
+        <w:numPr>
+          <w:ilvl w:val="0"/>
+          <w:numId w:val="1"/>
+        </w:numPr>
+        <w:spacing/>
+      </w:pPr>
+      <w:r>
+        <w:rPr>
+          <w:rFonts w:ascii="Times New Roman" w:cs="Times New Roman" w:eastAsia="Times New Roman" w:hAnsi="Times New Roman"/>
+        </w:rPr>
+        <w:t xml:space="preserve">• Built ETL pipelines integrating 3+ data sources (production data, dealer systems, operational DBs) into centralized analytics dashboards.</w:t>
+      </w:r>
+    </w:p>
+    <w:p>
+      <w:pPr>
+        <w:pStyle w:val="ListParagraph"/>
+        <w:numPr>
+          <w:ilvl w:val="0"/>
+          <w:numId w:val="1"/>
+        </w:numPr>
+        <w:spacing/>
+      </w:pPr>
+      <w:r>
+        <w:rPr>
+          <w:rFonts w:ascii="Times New Roman" w:cs="Times New Roman" w:eastAsia="Times New Roman" w:hAnsi="Times New Roman"/>
+        </w:rPr>
+        <w:t xml:space="preserve">• Optimized SQL queries for automotive analytics dashboards, improving report generation performance for production and logistics metrics.</w:t>
+      </w:r>
+    </w:p>
+    <w:p>
+      <w:pPr>
+        <w:pStyle w:val="ListParagraph"/>
+        <w:numPr>
+          <w:ilvl w:val="0"/>
+          <w:numId w:val="1"/>
+        </w:numPr>
+        <w:spacing/>
+      </w:pPr>
+      <w:r>
+        <w:rPr>
+          <w:rFonts w:ascii="Times New Roman" w:cs="Times New Roman" w:eastAsia="Times New Roman" w:hAnsi="Times New Roman"/>
+        </w:rPr>
+        <w:t xml:space="preserve">• Implemented data validation and transformation logic for vehicle inventory and distribution data, ensuring 99%+ integration accuracy.</w:t>
       </w:r>
     </w:p>
     <w:p>
@@ -626,7 +578,7 @@
         <w:rPr>
           <w:rFonts w:ascii="Times New Roman" w:cs="Times New Roman" w:eastAsia="Times New Roman" w:hAnsi="Times New Roman"/>
         </w:rPr>
-        <w:t xml:space="preserve">• Assisted in troubleshooting production data pipelines supporting vehicle manufacturing and supply chain reporting systems.</w:t>
+        <w:t xml:space="preserve">• Collaborated in Agile sprints to deliver data integration features for automotive operations and engineering teams.</w:t>
       </w:r>
     </w:p>
     <w:p>
@@ -670,103 +622,55 @@
         <w:rPr>
           <w:rFonts w:ascii="Times New Roman" w:cs="Times New Roman" w:eastAsia="Times New Roman" w:hAnsi="Times New Roman"/>
         </w:rPr>
-        <w:t xml:space="preserve">• Developed data integration processes to manage drug manufacturing, batch production, and pharmaceutical inventory data used in internal reporting systems.</w:t>
-      </w:r>
-    </w:p>
-    <w:p>
-      <w:pPr>
-        <w:pStyle w:val="ListParagraph"/>
-        <w:numPr>
-          <w:ilvl w:val="0"/>
-          <w:numId w:val="1"/>
-        </w:numPr>
-        <w:spacing/>
-      </w:pPr>
-      <w:r>
-        <w:rPr>
-          <w:rFonts w:ascii="Times New Roman" w:cs="Times New Roman" w:eastAsia="Times New Roman" w:hAnsi="Times New Roman"/>
-        </w:rPr>
-        <w:t xml:space="preserve">• Built ETL workflows to consolidate laboratory testing data and quality control results from multiple pharmaceutical systems into centralized databases.</w:t>
-      </w:r>
-    </w:p>
-    <w:p>
-      <w:pPr>
-        <w:pStyle w:val="ListParagraph"/>
-        <w:numPr>
-          <w:ilvl w:val="0"/>
-          <w:numId w:val="1"/>
-        </w:numPr>
-        <w:spacing/>
-      </w:pPr>
-      <w:r>
-        <w:rPr>
-          <w:rFonts w:ascii="Times New Roman" w:cs="Times New Roman" w:eastAsia="Times New Roman" w:hAnsi="Times New Roman"/>
-        </w:rPr>
-        <w:t xml:space="preserve">• Supported data pipelines used for pharmaceutical product lifecycle management, ensuring accurate tracking of medicine batches and manufacturing records.</w:t>
-      </w:r>
-    </w:p>
-    <w:p>
-      <w:pPr>
-        <w:pStyle w:val="ListParagraph"/>
-        <w:numPr>
-          <w:ilvl w:val="0"/>
-          <w:numId w:val="1"/>
-        </w:numPr>
-        <w:spacing/>
-      </w:pPr>
-      <w:r>
-        <w:rPr>
-          <w:rFonts w:ascii="Times New Roman" w:cs="Times New Roman" w:eastAsia="Times New Roman" w:hAnsi="Times New Roman"/>
-        </w:rPr>
-        <w:t xml:space="preserve">• Implemented data validation logic to maintain accuracy of clinical and drug safety datasets used for regulatory and compliance reporting.</w:t>
-      </w:r>
-    </w:p>
-    <w:p>
-      <w:pPr>
-        <w:pStyle w:val="ListParagraph"/>
-        <w:numPr>
-          <w:ilvl w:val="0"/>
-          <w:numId w:val="1"/>
-        </w:numPr>
-        <w:spacing/>
-      </w:pPr>
-      <w:r>
-        <w:rPr>
-          <w:rFonts w:ascii="Times New Roman" w:cs="Times New Roman" w:eastAsia="Times New Roman" w:hAnsi="Times New Roman"/>
-        </w:rPr>
-        <w:t xml:space="preserve">• Assisted in integrating sales and distribution data for pharmaceutical products, helping track medicine supply across distributors and healthcare providers.</w:t>
-      </w:r>
-    </w:p>
-    <w:p>
-      <w:pPr>
-        <w:pStyle w:val="ListParagraph"/>
-        <w:numPr>
-          <w:ilvl w:val="0"/>
-          <w:numId w:val="1"/>
-        </w:numPr>
-        <w:spacing/>
-      </w:pPr>
-      <w:r>
-        <w:rPr>
-          <w:rFonts w:ascii="Times New Roman" w:cs="Times New Roman" w:eastAsia="Times New Roman" w:hAnsi="Times New Roman"/>
-        </w:rPr>
-        <w:t xml:space="preserve">• Created SQL-based reports supporting drug production monitoring, inventory tracking, and product performance analytics.</w:t>
-      </w:r>
-    </w:p>
-    <w:p>
-      <w:pPr>
-        <w:pStyle w:val="ListParagraph"/>
-        <w:numPr>
-          <w:ilvl w:val="0"/>
-          <w:numId w:val="1"/>
-        </w:numPr>
-        <w:spacing/>
-      </w:pPr>
-      <w:r>
-        <w:rPr>
-          <w:rFonts w:ascii="Times New Roman" w:cs="Times New Roman" w:eastAsia="Times New Roman" w:hAnsi="Times New Roman"/>
-        </w:rPr>
-        <w:t xml:space="preserve">• Supported data systems used for pharmacovigilance and adverse event reporting, helping maintain reliable pharmaceutical safety data.</w:t>
+        <w:t xml:space="preserve">• Developed data integration processes for drug manufacturing, batch production, and inventory data across multiple pharmaceutical systems.</w:t>
+      </w:r>
+    </w:p>
+    <w:p>
+      <w:pPr>
+        <w:pStyle w:val="ListParagraph"/>
+        <w:numPr>
+          <w:ilvl w:val="0"/>
+          <w:numId w:val="1"/>
+        </w:numPr>
+        <w:spacing/>
+      </w:pPr>
+      <w:r>
+        <w:rPr>
+          <w:rFonts w:ascii="Times New Roman" w:cs="Times New Roman" w:eastAsia="Times New Roman" w:hAnsi="Times New Roman"/>
+        </w:rPr>
+        <w:t xml:space="preserve">• Built ETL workflows consolidating laboratory testing and quality control data from 4+ systems into centralized reporting databases.</w:t>
+      </w:r>
+    </w:p>
+    <w:p>
+      <w:pPr>
+        <w:pStyle w:val="ListParagraph"/>
+        <w:numPr>
+          <w:ilvl w:val="0"/>
+          <w:numId w:val="1"/>
+        </w:numPr>
+        <w:spacing/>
+      </w:pPr>
+      <w:r>
+        <w:rPr>
+          <w:rFonts w:ascii="Times New Roman" w:cs="Times New Roman" w:eastAsia="Times New Roman" w:hAnsi="Times New Roman"/>
+        </w:rPr>
+        <w:t xml:space="preserve">• Implemented data validation logic for clinical and drug safety datasets, supporting regulatory compliance and pharmacovigilance reporting.</w:t>
+      </w:r>
+    </w:p>
+    <w:p>
+      <w:pPr>
+        <w:pStyle w:val="ListParagraph"/>
+        <w:numPr>
+          <w:ilvl w:val="0"/>
+          <w:numId w:val="1"/>
+        </w:numPr>
+        <w:spacing/>
+      </w:pPr>
+      <w:r>
+        <w:rPr>
+          <w:rFonts w:ascii="Times New Roman" w:cs="Times New Roman" w:eastAsia="Times New Roman" w:hAnsi="Times New Roman"/>
+        </w:rPr>
+        <w:t xml:space="preserve">• Created SQL-based reports for drug production monitoring and inventory tracking, enabling data-driven decision-making for supply chain.</w:t>
       </w:r>
     </w:p>
     <w:p>
@@ -782,7 +686,7 @@
         <w:rPr>
           <w:rFonts w:ascii="Times New Roman" w:cs="Times New Roman" w:eastAsia="Times New Roman" w:hAnsi="Times New Roman"/>
         </w:rPr>
-        <w:t xml:space="preserve">• Collaborated with quality assurance teams to ensure data consistency for pharmaceutical manufacturing and compliance audits.</w:t>
+        <w:t xml:space="preserve">• Collaborated with QA teams to ensure data consistency for pharmaceutical manufacturing and compliance audits.</w:t>
       </w:r>
     </w:p>
     <w:p>

</xml_diff>

<commit_message>
Resume: add ConocoPhillips metrics (500+ users, 10K+ transactions); strengthen project descriptions
Made-with: Cursor
</commit_message>
<xml_diff>
--- a/public/resume.docx
+++ b/public/resume.docx
@@ -45,7 +45,7 @@
         </w:rPr>
         <w:t xml:space="preserve">Tampa, FL, USA  •  </w:t>
       </w:r>
-      <w:hyperlink w:history="1" r:id="rIdhzwv2orfwm0sz_stlpli4">
+      <w:hyperlink w:history="1" r:id="rIdgw5s7iyrz-_52getpcs-4">
         <w:r>
           <w:rPr>
             <w:rStyle w:val="Hyperlink"/>
@@ -64,7 +64,7 @@
         </w:rPr>
         <w:t xml:space="preserve">  •  </w:t>
       </w:r>
-      <w:hyperlink w:history="1" r:id="rId_mm4dnjwkh6vlry7gawg4">
+      <w:hyperlink w:history="1" r:id="rIdm_ooqpsz3k6oiitafr3a8">
         <w:r>
           <w:rPr>
             <w:rStyle w:val="Hyperlink"/>
@@ -83,7 +83,7 @@
         </w:rPr>
         <w:t xml:space="preserve">  •  </w:t>
       </w:r>
-      <w:hyperlink w:history="1" r:id="rIddm3e53a1wdlzlepmckiwo">
+      <w:hyperlink w:history="1" r:id="rId5soosw-tr-ltawyuf65zp">
         <w:r>
           <w:rPr>
             <w:rStyle w:val="Hyperlink"/>
@@ -438,23 +438,23 @@
         <w:rPr>
           <w:rFonts w:ascii="Times New Roman" w:cs="Times New Roman" w:eastAsia="Times New Roman" w:hAnsi="Times New Roman"/>
         </w:rPr>
-        <w:t xml:space="preserve">• Implemented server-side logic with Java and Spring Boot to handle complex calculations, data processing, and transactions for energy sector applications.</w:t>
-      </w:r>
-    </w:p>
-    <w:p>
-      <w:pPr>
-        <w:pStyle w:val="ListParagraph"/>
-        <w:numPr>
-          <w:ilvl w:val="0"/>
-          <w:numId w:val="1"/>
-        </w:numPr>
-        <w:spacing/>
-      </w:pPr>
-      <w:r>
-        <w:rPr>
-          <w:rFonts w:ascii="Times New Roman" w:cs="Times New Roman" w:eastAsia="Times New Roman" w:hAnsi="Times New Roman"/>
-        </w:rPr>
-        <w:t xml:space="preserve">• Designed and developed RESTful APIs for front-end and back-end data exchange, supporting portfolio and asset tracking workflows.</w:t>
+        <w:t xml:space="preserve">• Implemented server-side logic using Java and Spring Boot to handle complex calculations, data processing, and transactions supporting 500+ internal users and 10K+ daily transactions.</w:t>
+      </w:r>
+    </w:p>
+    <w:p>
+      <w:pPr>
+        <w:pStyle w:val="ListParagraph"/>
+        <w:numPr>
+          <w:ilvl w:val="0"/>
+          <w:numId w:val="1"/>
+        </w:numPr>
+        <w:spacing/>
+      </w:pPr>
+      <w:r>
+        <w:rPr>
+          <w:rFonts w:ascii="Times New Roman" w:cs="Times New Roman" w:eastAsia="Times New Roman" w:hAnsi="Times New Roman"/>
+        </w:rPr>
+        <w:t xml:space="preserve">• Designed and developed RESTful APIs for front-end and back-end data exchange, supporting portfolio and asset tracking workflows for energy sector applications.</w:t>
       </w:r>
     </w:p>
     <w:p>
@@ -890,7 +890,7 @@
         <w:rPr>
           <w:rFonts w:ascii="Times New Roman" w:cs="Times New Roman" w:eastAsia="Times New Roman" w:hAnsi="Times New Roman"/>
         </w:rPr>
-        <w:t xml:space="preserve"> — Spring Boot, JWT, React. Secure financial services for retirement planning and portfolio management.</w:t>
+        <w:t xml:space="preserve"> — Built secure financial services platform for retirement planning and portfolio management with Spring Boot, JWT authentication, and React.</w:t>
       </w:r>
     </w:p>
     <w:p>
@@ -914,7 +914,7 @@
         <w:rPr>
           <w:rFonts w:ascii="Times New Roman" w:cs="Times New Roman" w:eastAsia="Times New Roman" w:hAnsi="Times New Roman"/>
         </w:rPr>
-        <w:t xml:space="preserve"> — Spring Boot, React, MySQL. Full-stack menu, orders, inventory, and sales analytics.</w:t>
+        <w:t xml:space="preserve"> — Built full-stack restaurant management platform handling menu, orders, inventory, and sales analytics using Spring Boot, React, and MySQL.</w:t>
       </w:r>
     </w:p>
     <w:p>
@@ -938,7 +938,7 @@
         <w:rPr>
           <w:rFonts w:ascii="Times New Roman" w:cs="Times New Roman" w:eastAsia="Times New Roman" w:hAnsi="Times New Roman"/>
         </w:rPr>
-        <w:t xml:space="preserve"> — Spring Boot, JPA, H2. REST API for user management and authentication.</w:t>
+        <w:t xml:space="preserve"> — Built REST API for user management and authentication with Spring Boot, JPA, and H2.</w:t>
       </w:r>
     </w:p>
     <w:sectPr>

</xml_diff>

<commit_message>
Skills: separate Languages and Frameworks for recruiter clarity
Made-with: Cursor
</commit_message>
<xml_diff>
--- a/public/resume.docx
+++ b/public/resume.docx
@@ -45,7 +45,7 @@
         </w:rPr>
         <w:t xml:space="preserve">Tampa, FL, USA  •  </w:t>
       </w:r>
-      <w:hyperlink w:history="1" r:id="rIdgw5s7iyrz-_52getpcs-4">
+      <w:hyperlink w:history="1" r:id="rIduz8j1r1tot1b26o2jzbe0">
         <w:r>
           <w:rPr>
             <w:rStyle w:val="Hyperlink"/>
@@ -64,7 +64,7 @@
         </w:rPr>
         <w:t xml:space="preserve">  •  </w:t>
       </w:r>
-      <w:hyperlink w:history="1" r:id="rIdm_ooqpsz3k6oiitafr3a8">
+      <w:hyperlink w:history="1" r:id="rIds1-36b_cc1htcpavccgn9">
         <w:r>
           <w:rPr>
             <w:rStyle w:val="Hyperlink"/>
@@ -83,7 +83,7 @@
         </w:rPr>
         <w:t xml:space="preserve">  •  </w:t>
       </w:r>
-      <w:hyperlink w:history="1" r:id="rId5soosw-tr-ltawyuf65zp">
+      <w:hyperlink w:history="1" r:id="rIdqp75xxqaaezb-ye1wnysl">
         <w:r>
           <w:rPr>
             <w:rStyle w:val="Hyperlink"/>
@@ -146,7 +146,7 @@
         <w:rPr>
           <w:rFonts w:ascii="Times New Roman" w:cs="Times New Roman" w:eastAsia="Times New Roman" w:hAnsi="Times New Roman"/>
         </w:rPr>
-        <w:t xml:space="preserve">Languages: Java, Spring Boot, Hibernate, JavaScript, TypeScript | Frontend: React, Angular, HTML5, CSS3 | Backend: Node.js, REST APIs, Microservices | DevOps: Jenkins, Docker, Kubernetes, Maven, Git | Databases: PostgreSQL, MySQL, Oracle, MongoDB | Cloud: AWS (EC2, S3, RDS, Lambda) | Testing: JUnit, Mockito, Postman | Tools: JIRA, Swagger, ELK, Prometheus</w:t>
+        <w:t xml:space="preserve">Languages: Java, JavaScript, TypeScript | Frameworks: Spring Boot, Hibernate, Spring MVC | Frontend: React, Angular, HTML5, CSS3 | Backend: Node.js, REST APIs, Microservices | DevOps: Jenkins, Docker, Kubernetes, Maven, Git | Databases: PostgreSQL, MySQL, Oracle, MongoDB | Cloud: AWS (EC2, S3, RDS, Lambda) | Testing: JUnit, Mockito, Postman | Tools: JIRA, Swagger, ELK, Prometheus</w:t>
       </w:r>
     </w:p>
     <w:p>

</xml_diff>

<commit_message>
Resume: ATS-friendly Word format (Times New Roman, standard sections)
Made-with: Cursor
</commit_message>
<xml_diff>
--- a/public/resume.docx
+++ b/public/resume.docx
@@ -40,18 +40,18 @@
       <w:r>
         <w:rPr>
           <w:rFonts w:ascii="Times New Roman" w:cs="Times New Roman" w:eastAsia="Times New Roman" w:hAnsi="Times New Roman"/>
-          <w:sz w:val="20"/>
-          <w:szCs w:val="20"/>
-        </w:rPr>
-        <w:t xml:space="preserve">Tampa, FL, USA  •  </w:t>
-      </w:r>
-      <w:hyperlink w:history="1" r:id="rIduz8j1r1tot1b26o2jzbe0">
+          <w:sz w:val="22"/>
+          <w:szCs w:val="22"/>
+        </w:rPr>
+        <w:t xml:space="preserve">Tampa, FL, USA  |  </w:t>
+      </w:r>
+      <w:hyperlink w:history="1" r:id="rId8bwf5exeab5ifk3mzuo6q">
         <w:r>
           <w:rPr>
             <w:rStyle w:val="Hyperlink"/>
             <w:rFonts w:ascii="Times New Roman" w:cs="Times New Roman" w:eastAsia="Times New Roman" w:hAnsi="Times New Roman"/>
-            <w:sz w:val="20"/>
-            <w:szCs w:val="20"/>
+            <w:sz w:val="22"/>
+            <w:szCs w:val="22"/>
           </w:rPr>
           <w:t xml:space="preserve">gsg1499@gmail.com</w:t>
         </w:r>
@@ -59,18 +59,18 @@
       <w:r>
         <w:rPr>
           <w:rFonts w:ascii="Times New Roman" w:cs="Times New Roman" w:eastAsia="Times New Roman" w:hAnsi="Times New Roman"/>
-          <w:sz w:val="20"/>
-          <w:szCs w:val="20"/>
-        </w:rPr>
-        <w:t xml:space="preserve">  •  </w:t>
-      </w:r>
-      <w:hyperlink w:history="1" r:id="rIds1-36b_cc1htcpavccgn9">
+          <w:sz w:val="22"/>
+          <w:szCs w:val="22"/>
+        </w:rPr>
+        <w:t xml:space="preserve">  |  </w:t>
+      </w:r>
+      <w:hyperlink w:history="1" r:id="rId2mpber4wkzzwt-v1pnt2g">
         <w:r>
           <w:rPr>
             <w:rStyle w:val="Hyperlink"/>
             <w:rFonts w:ascii="Times New Roman" w:cs="Times New Roman" w:eastAsia="Times New Roman" w:hAnsi="Times New Roman"/>
-            <w:sz w:val="20"/>
-            <w:szCs w:val="20"/>
+            <w:sz w:val="22"/>
+            <w:szCs w:val="22"/>
           </w:rPr>
           <w:t xml:space="preserve">linkedin.com/in/ganeshg7</w:t>
         </w:r>
@@ -78,18 +78,18 @@
       <w:r>
         <w:rPr>
           <w:rFonts w:ascii="Times New Roman" w:cs="Times New Roman" w:eastAsia="Times New Roman" w:hAnsi="Times New Roman"/>
-          <w:sz w:val="20"/>
-          <w:szCs w:val="20"/>
-        </w:rPr>
-        <w:t xml:space="preserve">  •  </w:t>
-      </w:r>
-      <w:hyperlink w:history="1" r:id="rIdqp75xxqaaezb-ye1wnysl">
+          <w:sz w:val="22"/>
+          <w:szCs w:val="22"/>
+        </w:rPr>
+        <w:t xml:space="preserve">  |  </w:t>
+      </w:r>
+      <w:hyperlink w:history="1" r:id="rIdto19apxxfry2srxxeyqm7">
         <w:r>
           <w:rPr>
             <w:rStyle w:val="Hyperlink"/>
             <w:rFonts w:ascii="Times New Roman" w:cs="Times New Roman" w:eastAsia="Times New Roman" w:hAnsi="Times New Roman"/>
-            <w:sz w:val="20"/>
-            <w:szCs w:val="20"/>
+            <w:sz w:val="22"/>
+            <w:szCs w:val="22"/>
           </w:rPr>
           <w:t xml:space="preserve">github.com/sivaganesh1407</w:t>
         </w:r>
@@ -98,7 +98,7 @@
     <w:p>
       <w:pPr>
         <w:pBdr>
-          <w:bottom w:val="single" w:color="333333" w:sz="6" w:space="1"/>
+          <w:bottom w:val="single" w:color="000000" w:sz="6" w:space="1"/>
         </w:pBdr>
         <w:spacing w:after="80" w:before="120"/>
       </w:pPr>
@@ -107,6 +107,8 @@
           <w:rFonts w:ascii="Times New Roman" w:cs="Times New Roman" w:eastAsia="Times New Roman" w:hAnsi="Times New Roman"/>
           <w:b/>
           <w:bCs/>
+          <w:sz w:val="24"/>
+          <w:szCs w:val="24"/>
         </w:rPr>
         <w:t xml:space="preserve">Professional Summary</w:t>
       </w:r>
@@ -118,6 +120,8 @@
       <w:r>
         <w:rPr>
           <w:rFonts w:ascii="Times New Roman" w:cs="Times New Roman" w:eastAsia="Times New Roman" w:hAnsi="Times New Roman"/>
+          <w:sz w:val="22"/>
+          <w:szCs w:val="22"/>
         </w:rPr>
         <w:t xml:space="preserve">Java Full Stack Developer with 5+ years of experience building scalable enterprise applications. Proficient in Java, Spring Boot, Microservices, REST APIs, React, Docker, Kubernetes, and AWS. Delivered backend services, cloud-native systems, and modern web interfaces for financial services, restaurant tech, and energy sectors. AWS Certified DevOps Engineer – Professional, Solutions Architect – Associate, and HashiCorp Terraform Associate. Strong focus on system design, API development, CI/CD, and infrastructure as code.</w:t>
       </w:r>
@@ -125,7 +129,7 @@
     <w:p>
       <w:pPr>
         <w:pBdr>
-          <w:bottom w:val="single" w:color="333333" w:sz="6" w:space="1"/>
+          <w:bottom w:val="single" w:color="000000" w:sz="6" w:space="1"/>
         </w:pBdr>
         <w:spacing w:after="80" w:before="120"/>
       </w:pPr>
@@ -134,6 +138,8 @@
           <w:rFonts w:ascii="Times New Roman" w:cs="Times New Roman" w:eastAsia="Times New Roman" w:hAnsi="Times New Roman"/>
           <w:b/>
           <w:bCs/>
+          <w:sz w:val="24"/>
+          <w:szCs w:val="24"/>
         </w:rPr>
         <w:t xml:space="preserve">Technical Skills</w:t>
       </w:r>
@@ -145,6 +151,8 @@
       <w:r>
         <w:rPr>
           <w:rFonts w:ascii="Times New Roman" w:cs="Times New Roman" w:eastAsia="Times New Roman" w:hAnsi="Times New Roman"/>
+          <w:sz w:val="22"/>
+          <w:szCs w:val="22"/>
         </w:rPr>
         <w:t xml:space="preserve">Languages: Java, JavaScript, TypeScript | Frameworks: Spring Boot, Hibernate, Spring MVC | Frontend: React, Angular, HTML5, CSS3 | Backend: Node.js, REST APIs, Microservices | DevOps: Jenkins, Docker, Kubernetes, Maven, Git | Databases: PostgreSQL, MySQL, Oracle, MongoDB | Cloud: AWS (EC2, S3, RDS, Lambda) | Testing: JUnit, Mockito, Postman | Tools: JIRA, Swagger, ELK, Prometheus</w:t>
       </w:r>
@@ -152,7 +160,7 @@
     <w:p>
       <w:pPr>
         <w:pBdr>
-          <w:bottom w:val="single" w:color="333333" w:sz="6" w:space="1"/>
+          <w:bottom w:val="single" w:color="000000" w:sz="6" w:space="1"/>
         </w:pBdr>
         <w:spacing w:after="80" w:before="120"/>
       </w:pPr>
@@ -161,6 +169,8 @@
           <w:rFonts w:ascii="Times New Roman" w:cs="Times New Roman" w:eastAsia="Times New Roman" w:hAnsi="Times New Roman"/>
           <w:b/>
           <w:bCs/>
+          <w:sz w:val="24"/>
+          <w:szCs w:val="24"/>
         </w:rPr>
         <w:t xml:space="preserve">Professional Experience</w:t>
       </w:r>
@@ -175,12 +185,16 @@
           <w:rFonts w:ascii="Times New Roman" w:cs="Times New Roman" w:eastAsia="Times New Roman" w:hAnsi="Times New Roman"/>
           <w:b/>
           <w:bCs/>
+          <w:sz w:val="22"/>
+          <w:szCs w:val="22"/>
         </w:rPr>
         <w:t xml:space="preserve">Full Stack Engineer</w:t>
       </w:r>
       <w:r>
         <w:rPr>
           <w:rFonts w:ascii="Times New Roman" w:cs="Times New Roman" w:eastAsia="Times New Roman" w:hAnsi="Times New Roman"/>
+          <w:sz w:val="22"/>
+          <w:szCs w:val="22"/>
         </w:rPr>
         <w:t xml:space="preserve">, Mad Mobile</w:t>
       </w:r>
@@ -189,6 +203,8 @@
           <w:rFonts w:ascii="Times New Roman" w:cs="Times New Roman" w:eastAsia="Times New Roman" w:hAnsi="Times New Roman"/>
           <w:i/>
           <w:iCs/>
+          <w:sz w:val="22"/>
+          <w:szCs w:val="22"/>
         </w:rPr>
         <w:t xml:space="preserve">	Nov 2025 – Present</w:t>
       </w:r>
@@ -205,6 +221,8 @@
       <w:r>
         <w:rPr>
           <w:rFonts w:ascii="Times New Roman" w:cs="Times New Roman" w:eastAsia="Times New Roman" w:hAnsi="Times New Roman"/>
+          <w:sz w:val="22"/>
+          <w:szCs w:val="22"/>
         </w:rPr>
         <w:t xml:space="preserve">• Designed and developed 5+ Java 17 / Spring Boot microservices, modernizing legacy Spring MVC systems and improving deployment flexibility by 40%.</w:t>
       </w:r>
@@ -221,6 +239,8 @@
       <w:r>
         <w:rPr>
           <w:rFonts w:ascii="Times New Roman" w:cs="Times New Roman" w:eastAsia="Times New Roman" w:hAnsi="Times New Roman"/>
+          <w:sz w:val="22"/>
+          <w:szCs w:val="22"/>
         </w:rPr>
         <w:t xml:space="preserve">• Built event-driven architecture with Redis, RabbitMQ, and Kafka to handle high-volume real-time transactions across multiple services.</w:t>
       </w:r>
@@ -237,6 +257,8 @@
       <w:r>
         <w:rPr>
           <w:rFonts w:ascii="Times New Roman" w:cs="Times New Roman" w:eastAsia="Times New Roman" w:hAnsi="Times New Roman"/>
+          <w:sz w:val="22"/>
+          <w:szCs w:val="22"/>
         </w:rPr>
         <w:t xml:space="preserve">• Developed 15+ RESTful APIs with Spring Security; optimized data workflows across Oracle, SQL, and MongoDB for high-throughput applications.</w:t>
       </w:r>
@@ -253,6 +275,8 @@
       <w:r>
         <w:rPr>
           <w:rFonts w:ascii="Times New Roman" w:cs="Times New Roman" w:eastAsia="Times New Roman" w:hAnsi="Times New Roman"/>
+          <w:sz w:val="22"/>
+          <w:szCs w:val="22"/>
         </w:rPr>
         <w:t xml:space="preserve">• Deployed and managed cloud-native apps on AWS ECS, EC2, and ECR using Docker and Kubernetes, supporting 4-stage CI/CD pipelines.</w:t>
       </w:r>
@@ -269,6 +293,8 @@
       <w:r>
         <w:rPr>
           <w:rFonts w:ascii="Times New Roman" w:cs="Times New Roman" w:eastAsia="Times New Roman" w:hAnsi="Times New Roman"/>
+          <w:sz w:val="22"/>
+          <w:szCs w:val="22"/>
         </w:rPr>
         <w:t xml:space="preserve">• Implemented Bitbucket Pipelines CI/CD to automate builds, tests, and deployments across dev, QA, staging, and production environments.</w:t>
       </w:r>
@@ -285,6 +311,8 @@
       <w:r>
         <w:rPr>
           <w:rFonts w:ascii="Times New Roman" w:cs="Times New Roman" w:eastAsia="Times New Roman" w:hAnsi="Times New Roman"/>
+          <w:sz w:val="22"/>
+          <w:szCs w:val="22"/>
         </w:rPr>
         <w:t xml:space="preserve">• Delivered full-stack features with Angular 17 / React; leveraged GitHub Copilot and OpenAI APIs to accelerate development velocity.</w:t>
       </w:r>
@@ -299,12 +327,16 @@
           <w:rFonts w:ascii="Times New Roman" w:cs="Times New Roman" w:eastAsia="Times New Roman" w:hAnsi="Times New Roman"/>
           <w:b/>
           <w:bCs/>
+          <w:sz w:val="22"/>
+          <w:szCs w:val="22"/>
         </w:rPr>
         <w:t xml:space="preserve">Java Full Stack Developer</w:t>
       </w:r>
       <w:r>
         <w:rPr>
           <w:rFonts w:ascii="Times New Roman" w:cs="Times New Roman" w:eastAsia="Times New Roman" w:hAnsi="Times New Roman"/>
+          <w:sz w:val="22"/>
+          <w:szCs w:val="22"/>
         </w:rPr>
         <w:t xml:space="preserve">, Corebridge Financial</w:t>
       </w:r>
@@ -313,6 +345,8 @@
           <w:rFonts w:ascii="Times New Roman" w:cs="Times New Roman" w:eastAsia="Times New Roman" w:hAnsi="Times New Roman"/>
           <w:i/>
           <w:iCs/>
+          <w:sz w:val="22"/>
+          <w:szCs w:val="22"/>
         </w:rPr>
         <w:t xml:space="preserve">	Feb 2025 – Oct 2025</w:t>
       </w:r>
@@ -329,6 +363,8 @@
       <w:r>
         <w:rPr>
           <w:rFonts w:ascii="Times New Roman" w:cs="Times New Roman" w:eastAsia="Times New Roman" w:hAnsi="Times New Roman"/>
+          <w:sz w:val="22"/>
+          <w:szCs w:val="22"/>
         </w:rPr>
         <w:t xml:space="preserve">• Developed and maintained Java / Spring Boot applications for retirement, life insurance, and asset management workflows serving secure financial data processing.</w:t>
       </w:r>
@@ -345,6 +381,8 @@
       <w:r>
         <w:rPr>
           <w:rFonts w:ascii="Times New Roman" w:cs="Times New Roman" w:eastAsia="Times New Roman" w:hAnsi="Times New Roman"/>
+          <w:sz w:val="22"/>
+          <w:szCs w:val="22"/>
         </w:rPr>
         <w:t xml:space="preserve">• Built 10+ RESTful APIs for customer portals, agent dashboards, and admin systems, enabling reliable data exchange for financial workflows.</w:t>
       </w:r>
@@ -361,6 +399,8 @@
       <w:r>
         <w:rPr>
           <w:rFonts w:ascii="Times New Roman" w:cs="Times New Roman" w:eastAsia="Times New Roman" w:hAnsi="Times New Roman"/>
+          <w:sz w:val="22"/>
+          <w:szCs w:val="22"/>
         </w:rPr>
         <w:t xml:space="preserve">• Created user-friendly UIs for 3+ portals using Angular / React, improving agent efficiency and customer self-service adoption.</w:t>
       </w:r>
@@ -377,6 +417,8 @@
       <w:r>
         <w:rPr>
           <w:rFonts w:ascii="Times New Roman" w:cs="Times New Roman" w:eastAsia="Times New Roman" w:hAnsi="Times New Roman"/>
+          <w:sz w:val="22"/>
+          <w:szCs w:val="22"/>
         </w:rPr>
         <w:t xml:space="preserve">• Implemented comprehensive input validation and data checks across forms, reducing data inconsistencies in financial workflows.</w:t>
       </w:r>
@@ -393,6 +435,8 @@
       <w:r>
         <w:rPr>
           <w:rFonts w:ascii="Times New Roman" w:cs="Times New Roman" w:eastAsia="Times New Roman" w:hAnsi="Times New Roman"/>
+          <w:sz w:val="22"/>
+          <w:szCs w:val="22"/>
         </w:rPr>
         <w:t xml:space="preserve">• Collaborated with cross-functional Agile teams to deliver features across dev, QA, and production for financial services applications.</w:t>
       </w:r>
@@ -407,12 +451,16 @@
           <w:rFonts w:ascii="Times New Roman" w:cs="Times New Roman" w:eastAsia="Times New Roman" w:hAnsi="Times New Roman"/>
           <w:b/>
           <w:bCs/>
+          <w:sz w:val="22"/>
+          <w:szCs w:val="22"/>
         </w:rPr>
         <w:t xml:space="preserve">Java Full Stack Developer</w:t>
       </w:r>
       <w:r>
         <w:rPr>
           <w:rFonts w:ascii="Times New Roman" w:cs="Times New Roman" w:eastAsia="Times New Roman" w:hAnsi="Times New Roman"/>
+          <w:sz w:val="22"/>
+          <w:szCs w:val="22"/>
         </w:rPr>
         <w:t xml:space="preserve">, ConocoPhillips</w:t>
       </w:r>
@@ -421,6 +469,8 @@
           <w:rFonts w:ascii="Times New Roman" w:cs="Times New Roman" w:eastAsia="Times New Roman" w:hAnsi="Times New Roman"/>
           <w:i/>
           <w:iCs/>
+          <w:sz w:val="22"/>
+          <w:szCs w:val="22"/>
         </w:rPr>
         <w:t xml:space="preserve">	Feb 2024 – Dec 2024</w:t>
       </w:r>
@@ -437,6 +487,8 @@
       <w:r>
         <w:rPr>
           <w:rFonts w:ascii="Times New Roman" w:cs="Times New Roman" w:eastAsia="Times New Roman" w:hAnsi="Times New Roman"/>
+          <w:sz w:val="22"/>
+          <w:szCs w:val="22"/>
         </w:rPr>
         <w:t xml:space="preserve">• Implemented server-side logic using Java and Spring Boot to handle complex calculations, data processing, and transactions supporting 500+ internal users and 10K+ daily transactions.</w:t>
       </w:r>
@@ -453,6 +505,8 @@
       <w:r>
         <w:rPr>
           <w:rFonts w:ascii="Times New Roman" w:cs="Times New Roman" w:eastAsia="Times New Roman" w:hAnsi="Times New Roman"/>
+          <w:sz w:val="22"/>
+          <w:szCs w:val="22"/>
         </w:rPr>
         <w:t xml:space="preserve">• Designed and developed RESTful APIs for front-end and back-end data exchange, supporting portfolio and asset tracking workflows for energy sector applications.</w:t>
       </w:r>
@@ -469,6 +523,8 @@
       <w:r>
         <w:rPr>
           <w:rFonts w:ascii="Times New Roman" w:cs="Times New Roman" w:eastAsia="Times New Roman" w:hAnsi="Times New Roman"/>
+          <w:sz w:val="22"/>
+          <w:szCs w:val="22"/>
         </w:rPr>
         <w:t xml:space="preserve">• Delivered full-stack features; built backend REST API with Java 11, Spring Boot, and Spring Data JPA for portfolio management system.</w:t>
       </w:r>
@@ -483,12 +539,16 @@
           <w:rFonts w:ascii="Times New Roman" w:cs="Times New Roman" w:eastAsia="Times New Roman" w:hAnsi="Times New Roman"/>
           <w:b/>
           <w:bCs/>
+          <w:sz w:val="22"/>
+          <w:szCs w:val="22"/>
         </w:rPr>
         <w:t xml:space="preserve">System Engineer</w:t>
       </w:r>
       <w:r>
         <w:rPr>
           <w:rFonts w:ascii="Times New Roman" w:cs="Times New Roman" w:eastAsia="Times New Roman" w:hAnsi="Times New Roman"/>
+          <w:sz w:val="22"/>
+          <w:szCs w:val="22"/>
         </w:rPr>
         <w:t xml:space="preserve">, Infosys</w:t>
       </w:r>
@@ -497,6 +557,8 @@
           <w:rFonts w:ascii="Times New Roman" w:cs="Times New Roman" w:eastAsia="Times New Roman" w:hAnsi="Times New Roman"/>
           <w:i/>
           <w:iCs/>
+          <w:sz w:val="22"/>
+          <w:szCs w:val="22"/>
         </w:rPr>
         <w:t xml:space="preserve">	Jun 2021 – Jun 2022</w:t>
       </w:r>
@@ -513,6 +575,8 @@
       <w:r>
         <w:rPr>
           <w:rFonts w:ascii="Times New Roman" w:cs="Times New Roman" w:eastAsia="Times New Roman" w:hAnsi="Times New Roman"/>
+          <w:sz w:val="22"/>
+          <w:szCs w:val="22"/>
         </w:rPr>
         <w:t xml:space="preserve">• Developed backend data services for Mercedes-Benz vehicle manufacturing and supply chain analytics, supporting enterprise-scale operations.</w:t>
       </w:r>
@@ -529,6 +593,8 @@
       <w:r>
         <w:rPr>
           <w:rFonts w:ascii="Times New Roman" w:cs="Times New Roman" w:eastAsia="Times New Roman" w:hAnsi="Times New Roman"/>
+          <w:sz w:val="22"/>
+          <w:szCs w:val="22"/>
         </w:rPr>
         <w:t xml:space="preserve">• Built ETL pipelines integrating 3+ data sources (production data, dealer systems, operational DBs) into centralized analytics dashboards.</w:t>
       </w:r>
@@ -545,6 +611,8 @@
       <w:r>
         <w:rPr>
           <w:rFonts w:ascii="Times New Roman" w:cs="Times New Roman" w:eastAsia="Times New Roman" w:hAnsi="Times New Roman"/>
+          <w:sz w:val="22"/>
+          <w:szCs w:val="22"/>
         </w:rPr>
         <w:t xml:space="preserve">• Optimized SQL queries for automotive analytics dashboards, improving report generation performance for production and logistics metrics.</w:t>
       </w:r>
@@ -561,6 +629,8 @@
       <w:r>
         <w:rPr>
           <w:rFonts w:ascii="Times New Roman" w:cs="Times New Roman" w:eastAsia="Times New Roman" w:hAnsi="Times New Roman"/>
+          <w:sz w:val="22"/>
+          <w:szCs w:val="22"/>
         </w:rPr>
         <w:t xml:space="preserve">• Implemented data validation and transformation logic for vehicle inventory and distribution data, ensuring 99%+ integration accuracy.</w:t>
       </w:r>
@@ -577,6 +647,8 @@
       <w:r>
         <w:rPr>
           <w:rFonts w:ascii="Times New Roman" w:cs="Times New Roman" w:eastAsia="Times New Roman" w:hAnsi="Times New Roman"/>
+          <w:sz w:val="22"/>
+          <w:szCs w:val="22"/>
         </w:rPr>
         <w:t xml:space="preserve">• Collaborated in Agile sprints to deliver data integration features for automotive operations and engineering teams.</w:t>
       </w:r>
@@ -591,12 +663,16 @@
           <w:rFonts w:ascii="Times New Roman" w:cs="Times New Roman" w:eastAsia="Times New Roman" w:hAnsi="Times New Roman"/>
           <w:b/>
           <w:bCs/>
+          <w:sz w:val="22"/>
+          <w:szCs w:val="22"/>
         </w:rPr>
         <w:t xml:space="preserve">Associate System Engineer</w:t>
       </w:r>
       <w:r>
         <w:rPr>
           <w:rFonts w:ascii="Times New Roman" w:cs="Times New Roman" w:eastAsia="Times New Roman" w:hAnsi="Times New Roman"/>
+          <w:sz w:val="22"/>
+          <w:szCs w:val="22"/>
         </w:rPr>
         <w:t xml:space="preserve">, Elder Pharmaceuticals</w:t>
       </w:r>
@@ -605,6 +681,8 @@
           <w:rFonts w:ascii="Times New Roman" w:cs="Times New Roman" w:eastAsia="Times New Roman" w:hAnsi="Times New Roman"/>
           <w:i/>
           <w:iCs/>
+          <w:sz w:val="22"/>
+          <w:szCs w:val="22"/>
         </w:rPr>
         <w:t xml:space="preserve">	Jun 2019 – May 2021</w:t>
       </w:r>
@@ -621,6 +699,8 @@
       <w:r>
         <w:rPr>
           <w:rFonts w:ascii="Times New Roman" w:cs="Times New Roman" w:eastAsia="Times New Roman" w:hAnsi="Times New Roman"/>
+          <w:sz w:val="22"/>
+          <w:szCs w:val="22"/>
         </w:rPr>
         <w:t xml:space="preserve">• Developed data integration processes for drug manufacturing, batch production, and inventory data across multiple pharmaceutical systems.</w:t>
       </w:r>
@@ -637,6 +717,8 @@
       <w:r>
         <w:rPr>
           <w:rFonts w:ascii="Times New Roman" w:cs="Times New Roman" w:eastAsia="Times New Roman" w:hAnsi="Times New Roman"/>
+          <w:sz w:val="22"/>
+          <w:szCs w:val="22"/>
         </w:rPr>
         <w:t xml:space="preserve">• Built ETL workflows consolidating laboratory testing and quality control data from 4+ systems into centralized reporting databases.</w:t>
       </w:r>
@@ -653,6 +735,8 @@
       <w:r>
         <w:rPr>
           <w:rFonts w:ascii="Times New Roman" w:cs="Times New Roman" w:eastAsia="Times New Roman" w:hAnsi="Times New Roman"/>
+          <w:sz w:val="22"/>
+          <w:szCs w:val="22"/>
         </w:rPr>
         <w:t xml:space="preserve">• Implemented data validation logic for clinical and drug safety datasets, supporting regulatory compliance and pharmacovigilance reporting.</w:t>
       </w:r>
@@ -669,6 +753,8 @@
       <w:r>
         <w:rPr>
           <w:rFonts w:ascii="Times New Roman" w:cs="Times New Roman" w:eastAsia="Times New Roman" w:hAnsi="Times New Roman"/>
+          <w:sz w:val="22"/>
+          <w:szCs w:val="22"/>
         </w:rPr>
         <w:t xml:space="preserve">• Created SQL-based reports for drug production monitoring and inventory tracking, enabling data-driven decision-making for supply chain.</w:t>
       </w:r>
@@ -685,6 +771,8 @@
       <w:r>
         <w:rPr>
           <w:rFonts w:ascii="Times New Roman" w:cs="Times New Roman" w:eastAsia="Times New Roman" w:hAnsi="Times New Roman"/>
+          <w:sz w:val="22"/>
+          <w:szCs w:val="22"/>
         </w:rPr>
         <w:t xml:space="preserve">• Collaborated with QA teams to ensure data consistency for pharmaceutical manufacturing and compliance audits.</w:t>
       </w:r>
@@ -692,7 +780,7 @@
     <w:p>
       <w:pPr>
         <w:pBdr>
-          <w:bottom w:val="single" w:color="333333" w:sz="6" w:space="1"/>
+          <w:bottom w:val="single" w:color="000000" w:sz="6" w:space="1"/>
         </w:pBdr>
         <w:spacing w:after="80" w:before="120"/>
       </w:pPr>
@@ -701,6 +789,8 @@
           <w:rFonts w:ascii="Times New Roman" w:cs="Times New Roman" w:eastAsia="Times New Roman" w:hAnsi="Times New Roman"/>
           <w:b/>
           <w:bCs/>
+          <w:sz w:val="24"/>
+          <w:szCs w:val="24"/>
         </w:rPr>
         <w:t xml:space="preserve">Certifications</w:t>
       </w:r>
@@ -719,12 +809,16 @@
           <w:rFonts w:ascii="Times New Roman" w:cs="Times New Roman" w:eastAsia="Times New Roman" w:hAnsi="Times New Roman"/>
           <w:b/>
           <w:bCs/>
+          <w:sz w:val="22"/>
+          <w:szCs w:val="22"/>
         </w:rPr>
         <w:t xml:space="preserve">AWS Certified DevOps Engineer – Professional</w:t>
       </w:r>
       <w:r>
         <w:rPr>
           <w:rFonts w:ascii="Times New Roman" w:cs="Times New Roman" w:eastAsia="Times New Roman" w:hAnsi="Times New Roman"/>
+          <w:sz w:val="22"/>
+          <w:szCs w:val="22"/>
         </w:rPr>
         <w:t xml:space="preserve"> (March 2025 – March 2027)</w:t>
       </w:r>
@@ -743,12 +837,16 @@
           <w:rFonts w:ascii="Times New Roman" w:cs="Times New Roman" w:eastAsia="Times New Roman" w:hAnsi="Times New Roman"/>
           <w:b/>
           <w:bCs/>
+          <w:sz w:val="22"/>
+          <w:szCs w:val="22"/>
         </w:rPr>
         <w:t xml:space="preserve">AWS Certified Solutions Architect – Associate</w:t>
       </w:r>
       <w:r>
         <w:rPr>
           <w:rFonts w:ascii="Times New Roman" w:cs="Times New Roman" w:eastAsia="Times New Roman" w:hAnsi="Times New Roman"/>
+          <w:sz w:val="22"/>
+          <w:szCs w:val="22"/>
         </w:rPr>
         <w:t xml:space="preserve"> (February 2025 – February 2028)</w:t>
       </w:r>
@@ -767,12 +865,16 @@
           <w:rFonts w:ascii="Times New Roman" w:cs="Times New Roman" w:eastAsia="Times New Roman" w:hAnsi="Times New Roman"/>
           <w:b/>
           <w:bCs/>
+          <w:sz w:val="22"/>
+          <w:szCs w:val="22"/>
         </w:rPr>
         <w:t xml:space="preserve">HashiCorp Certified: Terraform Associate (003)</w:t>
       </w:r>
       <w:r>
         <w:rPr>
           <w:rFonts w:ascii="Times New Roman" w:cs="Times New Roman" w:eastAsia="Times New Roman" w:hAnsi="Times New Roman"/>
+          <w:sz w:val="22"/>
+          <w:szCs w:val="22"/>
         </w:rPr>
         <w:t xml:space="preserve"> (March 2025 – March 2027)</w:t>
       </w:r>
@@ -780,7 +882,7 @@
     <w:p>
       <w:pPr>
         <w:pBdr>
-          <w:bottom w:val="single" w:color="333333" w:sz="6" w:space="1"/>
+          <w:bottom w:val="single" w:color="000000" w:sz="6" w:space="1"/>
         </w:pBdr>
         <w:spacing w:after="80" w:before="120"/>
       </w:pPr>
@@ -789,6 +891,8 @@
           <w:rFonts w:ascii="Times New Roman" w:cs="Times New Roman" w:eastAsia="Times New Roman" w:hAnsi="Times New Roman"/>
           <w:b/>
           <w:bCs/>
+          <w:sz w:val="24"/>
+          <w:szCs w:val="24"/>
         </w:rPr>
         <w:t xml:space="preserve">Education</w:t>
       </w:r>
@@ -802,12 +906,16 @@
           <w:rFonts w:ascii="Times New Roman" w:cs="Times New Roman" w:eastAsia="Times New Roman" w:hAnsi="Times New Roman"/>
           <w:b/>
           <w:bCs/>
+          <w:sz w:val="22"/>
+          <w:szCs w:val="22"/>
         </w:rPr>
         <w:t xml:space="preserve">Master's Degree, Information Technology Management</w:t>
       </w:r>
       <w:r>
         <w:rPr>
           <w:rFonts w:ascii="Times New Roman" w:cs="Times New Roman" w:eastAsia="Times New Roman" w:hAnsi="Times New Roman"/>
+          <w:sz w:val="22"/>
+          <w:szCs w:val="22"/>
         </w:rPr>
         <w:t xml:space="preserve">, Indiana Wesleyan University</w:t>
       </w:r>
@@ -819,6 +927,8 @@
       <w:r>
         <w:rPr>
           <w:rFonts w:ascii="Times New Roman" w:cs="Times New Roman" w:eastAsia="Times New Roman" w:hAnsi="Times New Roman"/>
+          <w:sz w:val="22"/>
+          <w:szCs w:val="22"/>
         </w:rPr>
         <w:t xml:space="preserve">Grade: 3.45/5. Coursework: Information Systems Management, IT Infrastructure, Database Systems, Cloud Computing, Cybersecurity Fundamentals. Participated in technology-focused academic collaboration and peer learning activities related to information systems and emerging technologies.</w:t>
       </w:r>
@@ -832,12 +942,16 @@
           <w:rFonts w:ascii="Times New Roman" w:cs="Times New Roman" w:eastAsia="Times New Roman" w:hAnsi="Times New Roman"/>
           <w:b/>
           <w:bCs/>
+          <w:sz w:val="22"/>
+          <w:szCs w:val="22"/>
         </w:rPr>
         <w:t xml:space="preserve">Bachelor's, Electrical, Electronics and Communications Engineering</w:t>
       </w:r>
       <w:r>
         <w:rPr>
           <w:rFonts w:ascii="Times New Roman" w:cs="Times New Roman" w:eastAsia="Times New Roman" w:hAnsi="Times New Roman"/>
+          <w:sz w:val="22"/>
+          <w:szCs w:val="22"/>
         </w:rPr>
         <w:t xml:space="preserve">, Karunya Institute of Technology and Sciences</w:t>
       </w:r>
@@ -849,6 +963,8 @@
       <w:r>
         <w:rPr>
           <w:rFonts w:ascii="Times New Roman" w:cs="Times New Roman" w:eastAsia="Times New Roman" w:hAnsi="Times New Roman"/>
+          <w:sz w:val="22"/>
+          <w:szCs w:val="22"/>
         </w:rPr>
         <w:t xml:space="preserve">Grade: 7.2/10. Coursework: Communication Systems, Embedded Systems, Microprocessors, Digital Electronics, Computer Engineering. Active volunteer in National Service Scheme (NSS), participating in community outreach programs and social service initiatives.</w:t>
       </w:r>
@@ -856,7 +972,7 @@
     <w:p>
       <w:pPr>
         <w:pBdr>
-          <w:bottom w:val="single" w:color="333333" w:sz="6" w:space="1"/>
+          <w:bottom w:val="single" w:color="000000" w:sz="6" w:space="1"/>
         </w:pBdr>
         <w:spacing w:after="80" w:before="120"/>
       </w:pPr>
@@ -865,6 +981,8 @@
           <w:rFonts w:ascii="Times New Roman" w:cs="Times New Roman" w:eastAsia="Times New Roman" w:hAnsi="Times New Roman"/>
           <w:b/>
           <w:bCs/>
+          <w:sz w:val="24"/>
+          <w:szCs w:val="24"/>
         </w:rPr>
         <w:t xml:space="preserve">Key Projects</w:t>
       </w:r>
@@ -883,12 +1001,16 @@
           <w:rFonts w:ascii="Times New Roman" w:cs="Times New Roman" w:eastAsia="Times New Roman" w:hAnsi="Times New Roman"/>
           <w:b/>
           <w:bCs/>
+          <w:sz w:val="22"/>
+          <w:szCs w:val="22"/>
         </w:rPr>
         <w:t xml:space="preserve">Retirement Investment Management Platform</w:t>
       </w:r>
       <w:r>
         <w:rPr>
           <w:rFonts w:ascii="Times New Roman" w:cs="Times New Roman" w:eastAsia="Times New Roman" w:hAnsi="Times New Roman"/>
+          <w:sz w:val="22"/>
+          <w:szCs w:val="22"/>
         </w:rPr>
         <w:t xml:space="preserve"> — Built secure financial services platform for retirement planning and portfolio management with Spring Boot, JWT authentication, and React.</w:t>
       </w:r>
@@ -907,12 +1029,16 @@
           <w:rFonts w:ascii="Times New Roman" w:cs="Times New Roman" w:eastAsia="Times New Roman" w:hAnsi="Times New Roman"/>
           <w:b/>
           <w:bCs/>
+          <w:sz w:val="22"/>
+          <w:szCs w:val="22"/>
         </w:rPr>
         <w:t xml:space="preserve">Smart Restaurant Platform</w:t>
       </w:r>
       <w:r>
         <w:rPr>
           <w:rFonts w:ascii="Times New Roman" w:cs="Times New Roman" w:eastAsia="Times New Roman" w:hAnsi="Times New Roman"/>
+          <w:sz w:val="22"/>
+          <w:szCs w:val="22"/>
         </w:rPr>
         <w:t xml:space="preserve"> — Built full-stack restaurant management platform handling menu, orders, inventory, and sales analytics using Spring Boot, React, and MySQL.</w:t>
       </w:r>
@@ -931,12 +1057,16 @@
           <w:rFonts w:ascii="Times New Roman" w:cs="Times New Roman" w:eastAsia="Times New Roman" w:hAnsi="Times New Roman"/>
           <w:b/>
           <w:bCs/>
+          <w:sz w:val="22"/>
+          <w:szCs w:val="22"/>
         </w:rPr>
         <w:t xml:space="preserve">User Management Service</w:t>
       </w:r>
       <w:r>
         <w:rPr>
           <w:rFonts w:ascii="Times New Roman" w:cs="Times New Roman" w:eastAsia="Times New Roman" w:hAnsi="Times New Roman"/>
+          <w:sz w:val="22"/>
+          <w:szCs w:val="22"/>
         </w:rPr>
         <w:t xml:space="preserve"> — Built REST API for user management and authentication with Spring Boot, JPA, and H2.</w:t>
       </w:r>

</xml_diff>

<commit_message>
Resume: crisp summary, Mad Mobile 50K+ metric, • bullets only, consistent verbs, 2-line skills, spacing
Made-with: Cursor
</commit_message>
<xml_diff>
--- a/public/resume.docx
+++ b/public/resume.docx
@@ -45,7 +45,7 @@
         </w:rPr>
         <w:t xml:space="preserve">Tampa, FL, USA  |  </w:t>
       </w:r>
-      <w:hyperlink w:history="1" r:id="rId8bwf5exeab5ifk3mzuo6q">
+      <w:hyperlink w:history="1" r:id="rIda2fvjy-lyy8kasgpce8nz">
         <w:r>
           <w:rPr>
             <w:rStyle w:val="Hyperlink"/>
@@ -64,7 +64,7 @@
         </w:rPr>
         <w:t xml:space="preserve">  |  </w:t>
       </w:r>
-      <w:hyperlink w:history="1" r:id="rId2mpber4wkzzwt-v1pnt2g">
+      <w:hyperlink w:history="1" r:id="rIdllxy9vhhteulirlbmgrwr">
         <w:r>
           <w:rPr>
             <w:rStyle w:val="Hyperlink"/>
@@ -83,7 +83,7 @@
         </w:rPr>
         <w:t xml:space="preserve">  |  </w:t>
       </w:r>
-      <w:hyperlink w:history="1" r:id="rIdto19apxxfry2srxxeyqm7">
+      <w:hyperlink w:history="1" r:id="rIdtmhdowqn_z6qnx2e4k-gs">
         <w:r>
           <w:rPr>
             <w:rStyle w:val="Hyperlink"/>
@@ -123,7 +123,7 @@
           <w:sz w:val="22"/>
           <w:szCs w:val="22"/>
         </w:rPr>
-        <w:t xml:space="preserve">Java Full Stack Developer with 5+ years of experience building scalable enterprise applications. Proficient in Java, Spring Boot, Microservices, REST APIs, React, Docker, Kubernetes, and AWS. Delivered backend services, cloud-native systems, and modern web interfaces for financial services, restaurant tech, and energy sectors. AWS Certified DevOps Engineer – Professional, Solutions Architect – Associate, and HashiCorp Terraform Associate. Strong focus on system design, API development, CI/CD, and infrastructure as code.</w:t>
+        <w:t xml:space="preserve">Java Full Stack Developer with 5+ years building scalable enterprise applications. Proficient in Java, Spring Boot, Microservices, REST APIs, React, Docker, Kubernetes, and AWS. AWS Certified DevOps Engineer – Professional, Solutions Architect – Associate, Terraform Associate.</w:t>
       </w:r>
     </w:p>
     <w:p>
@@ -146,6 +146,19 @@
     </w:p>
     <w:p>
       <w:pPr>
+        <w:spacing w:after="40"/>
+      </w:pPr>
+      <w:r>
+        <w:rPr>
+          <w:rFonts w:ascii="Times New Roman" w:cs="Times New Roman" w:eastAsia="Times New Roman" w:hAnsi="Times New Roman"/>
+          <w:sz w:val="22"/>
+          <w:szCs w:val="22"/>
+        </w:rPr>
+        <w:t xml:space="preserve">Languages: Java, JavaScript, TypeScript | Frameworks: Spring Boot, Hibernate, Spring MVC | Frontend: React, Angular, HTML5, CSS3 | Backend: Node.js, REST APIs, Microservices | DevOps: Jenkins, Docker, Kubernetes, Maven, Git</w:t>
+      </w:r>
+    </w:p>
+    <w:p>
+      <w:pPr>
         <w:spacing w:after="120"/>
       </w:pPr>
       <w:r>
@@ -154,7 +167,7 @@
           <w:sz w:val="22"/>
           <w:szCs w:val="22"/>
         </w:rPr>
-        <w:t xml:space="preserve">Languages: Java, JavaScript, TypeScript | Frameworks: Spring Boot, Hibernate, Spring MVC | Frontend: React, Angular, HTML5, CSS3 | Backend: Node.js, REST APIs, Microservices | DevOps: Jenkins, Docker, Kubernetes, Maven, Git | Databases: PostgreSQL, MySQL, Oracle, MongoDB | Cloud: AWS (EC2, S3, RDS, Lambda) | Testing: JUnit, Mockito, Postman | Tools: JIRA, Swagger, ELK, Prometheus</w:t>
+        <w:t xml:space="preserve">Databases: PostgreSQL, MySQL, Oracle, MongoDB | Cloud: AWS (EC2, S3, RDS, Lambda) | Testing: JUnit, Mockito, Postman | Tools: JIRA, Swagger, ELK, Prometheus</w:t>
       </w:r>
     </w:p>
     <w:p>
@@ -211,48 +224,33 @@
     </w:p>
     <w:p>
       <w:pPr>
-        <w:pStyle w:val="ListParagraph"/>
-        <w:numPr>
-          <w:ilvl w:val="0"/>
-          <w:numId w:val="1"/>
-        </w:numPr>
-        <w:spacing/>
-      </w:pPr>
-      <w:r>
-        <w:rPr>
-          <w:rFonts w:ascii="Times New Roman" w:cs="Times New Roman" w:eastAsia="Times New Roman" w:hAnsi="Times New Roman"/>
-          <w:sz w:val="22"/>
-          <w:szCs w:val="22"/>
-        </w:rPr>
-        <w:t xml:space="preserve">• Designed and developed 5+ Java 17 / Spring Boot microservices, modernizing legacy Spring MVC systems and improving deployment flexibility by 40%.</w:t>
-      </w:r>
-    </w:p>
-    <w:p>
-      <w:pPr>
-        <w:pStyle w:val="ListParagraph"/>
-        <w:numPr>
-          <w:ilvl w:val="0"/>
-          <w:numId w:val="1"/>
-        </w:numPr>
-        <w:spacing/>
-      </w:pPr>
-      <w:r>
-        <w:rPr>
-          <w:rFonts w:ascii="Times New Roman" w:cs="Times New Roman" w:eastAsia="Times New Roman" w:hAnsi="Times New Roman"/>
-          <w:sz w:val="22"/>
-          <w:szCs w:val="22"/>
-        </w:rPr>
-        <w:t xml:space="preserve">• Built event-driven architecture with Redis, RabbitMQ, and Kafka to handle high-volume real-time transactions across multiple services.</w:t>
-      </w:r>
-    </w:p>
-    <w:p>
-      <w:pPr>
-        <w:pStyle w:val="ListParagraph"/>
-        <w:numPr>
-          <w:ilvl w:val="0"/>
-          <w:numId w:val="1"/>
-        </w:numPr>
-        <w:spacing/>
+        <w:spacing w:after="40"/>
+      </w:pPr>
+      <w:r>
+        <w:rPr>
+          <w:rFonts w:ascii="Times New Roman" w:cs="Times New Roman" w:eastAsia="Times New Roman" w:hAnsi="Times New Roman"/>
+          <w:sz w:val="22"/>
+          <w:szCs w:val="22"/>
+        </w:rPr>
+        <w:t xml:space="preserve">• Designed and developed 5+ Java 17 / Spring Boot microservices, modernizing legacy systems and improving deployment flexibility by 40%.</w:t>
+      </w:r>
+    </w:p>
+    <w:p>
+      <w:pPr>
+        <w:spacing w:after="40"/>
+      </w:pPr>
+      <w:r>
+        <w:rPr>
+          <w:rFonts w:ascii="Times New Roman" w:cs="Times New Roman" w:eastAsia="Times New Roman" w:hAnsi="Times New Roman"/>
+          <w:sz w:val="22"/>
+          <w:szCs w:val="22"/>
+        </w:rPr>
+        <w:t xml:space="preserve">• Designed event-driven architecture with Redis, RabbitMQ, and Kafka handling 50K+ daily real-time transactions across multiple services.</w:t>
+      </w:r>
+    </w:p>
+    <w:p>
+      <w:pPr>
+        <w:spacing w:after="40"/>
       </w:pPr>
       <w:r>
         <w:rPr>
@@ -265,30 +263,20 @@
     </w:p>
     <w:p>
       <w:pPr>
-        <w:pStyle w:val="ListParagraph"/>
-        <w:numPr>
-          <w:ilvl w:val="0"/>
-          <w:numId w:val="1"/>
-        </w:numPr>
-        <w:spacing/>
-      </w:pPr>
-      <w:r>
-        <w:rPr>
-          <w:rFonts w:ascii="Times New Roman" w:cs="Times New Roman" w:eastAsia="Times New Roman" w:hAnsi="Times New Roman"/>
-          <w:sz w:val="22"/>
-          <w:szCs w:val="22"/>
-        </w:rPr>
-        <w:t xml:space="preserve">• Deployed and managed cloud-native apps on AWS ECS, EC2, and ECR using Docker and Kubernetes, supporting 4-stage CI/CD pipelines.</w:t>
-      </w:r>
-    </w:p>
-    <w:p>
-      <w:pPr>
-        <w:pStyle w:val="ListParagraph"/>
-        <w:numPr>
-          <w:ilvl w:val="0"/>
-          <w:numId w:val="1"/>
-        </w:numPr>
-        <w:spacing/>
+        <w:spacing w:after="40"/>
+      </w:pPr>
+      <w:r>
+        <w:rPr>
+          <w:rFonts w:ascii="Times New Roman" w:cs="Times New Roman" w:eastAsia="Times New Roman" w:hAnsi="Times New Roman"/>
+          <w:sz w:val="22"/>
+          <w:szCs w:val="22"/>
+        </w:rPr>
+        <w:t xml:space="preserve">• Implemented cloud-native deployment on AWS ECS, EC2, and ECR using Docker and Kubernetes, supporting 4-stage CI/CD pipelines.</w:t>
+      </w:r>
+    </w:p>
+    <w:p>
+      <w:pPr>
+        <w:spacing w:after="40"/>
       </w:pPr>
       <w:r>
         <w:rPr>
@@ -301,11 +289,6 @@
     </w:p>
     <w:p>
       <w:pPr>
-        <w:pStyle w:val="ListParagraph"/>
-        <w:numPr>
-          <w:ilvl w:val="0"/>
-          <w:numId w:val="1"/>
-        </w:numPr>
         <w:spacing w:after="80"/>
       </w:pPr>
       <w:r>
@@ -353,12 +336,7 @@
     </w:p>
     <w:p>
       <w:pPr>
-        <w:pStyle w:val="ListParagraph"/>
-        <w:numPr>
-          <w:ilvl w:val="0"/>
-          <w:numId w:val="1"/>
-        </w:numPr>
-        <w:spacing/>
+        <w:spacing w:after="40"/>
       </w:pPr>
       <w:r>
         <w:rPr>
@@ -371,48 +349,33 @@
     </w:p>
     <w:p>
       <w:pPr>
-        <w:pStyle w:val="ListParagraph"/>
-        <w:numPr>
-          <w:ilvl w:val="0"/>
-          <w:numId w:val="1"/>
-        </w:numPr>
-        <w:spacing/>
-      </w:pPr>
-      <w:r>
-        <w:rPr>
-          <w:rFonts w:ascii="Times New Roman" w:cs="Times New Roman" w:eastAsia="Times New Roman" w:hAnsi="Times New Roman"/>
-          <w:sz w:val="22"/>
-          <w:szCs w:val="22"/>
-        </w:rPr>
-        <w:t xml:space="preserve">• Built 10+ RESTful APIs for customer portals, agent dashboards, and admin systems, enabling reliable data exchange for financial workflows.</w:t>
-      </w:r>
-    </w:p>
-    <w:p>
-      <w:pPr>
-        <w:pStyle w:val="ListParagraph"/>
-        <w:numPr>
-          <w:ilvl w:val="0"/>
-          <w:numId w:val="1"/>
-        </w:numPr>
-        <w:spacing/>
-      </w:pPr>
-      <w:r>
-        <w:rPr>
-          <w:rFonts w:ascii="Times New Roman" w:cs="Times New Roman" w:eastAsia="Times New Roman" w:hAnsi="Times New Roman"/>
-          <w:sz w:val="22"/>
-          <w:szCs w:val="22"/>
-        </w:rPr>
-        <w:t xml:space="preserve">• Created user-friendly UIs for 3+ portals using Angular / React, improving agent efficiency and customer self-service adoption.</w:t>
-      </w:r>
-    </w:p>
-    <w:p>
-      <w:pPr>
-        <w:pStyle w:val="ListParagraph"/>
-        <w:numPr>
-          <w:ilvl w:val="0"/>
-          <w:numId w:val="1"/>
-        </w:numPr>
-        <w:spacing/>
+        <w:spacing w:after="40"/>
+      </w:pPr>
+      <w:r>
+        <w:rPr>
+          <w:rFonts w:ascii="Times New Roman" w:cs="Times New Roman" w:eastAsia="Times New Roman" w:hAnsi="Times New Roman"/>
+          <w:sz w:val="22"/>
+          <w:szCs w:val="22"/>
+        </w:rPr>
+        <w:t xml:space="preserve">• Developed 10+ RESTful APIs for customer portals, agent dashboards, and admin systems, enabling reliable data exchange for financial workflows.</w:t>
+      </w:r>
+    </w:p>
+    <w:p>
+      <w:pPr>
+        <w:spacing w:after="40"/>
+      </w:pPr>
+      <w:r>
+        <w:rPr>
+          <w:rFonts w:ascii="Times New Roman" w:cs="Times New Roman" w:eastAsia="Times New Roman" w:hAnsi="Times New Roman"/>
+          <w:sz w:val="22"/>
+          <w:szCs w:val="22"/>
+        </w:rPr>
+        <w:t xml:space="preserve">• Developed user-friendly UIs for 3+ portals using Angular / React, improving agent efficiency and customer self-service adoption.</w:t>
+      </w:r>
+    </w:p>
+    <w:p>
+      <w:pPr>
+        <w:spacing w:after="40"/>
       </w:pPr>
       <w:r>
         <w:rPr>
@@ -425,11 +388,6 @@
     </w:p>
     <w:p>
       <w:pPr>
-        <w:pStyle w:val="ListParagraph"/>
-        <w:numPr>
-          <w:ilvl w:val="0"/>
-          <w:numId w:val="1"/>
-        </w:numPr>
         <w:spacing w:after="80"/>
       </w:pPr>
       <w:r>
@@ -477,12 +435,7 @@
     </w:p>
     <w:p>
       <w:pPr>
-        <w:pStyle w:val="ListParagraph"/>
-        <w:numPr>
-          <w:ilvl w:val="0"/>
-          <w:numId w:val="1"/>
-        </w:numPr>
-        <w:spacing/>
+        <w:spacing w:after="40"/>
       </w:pPr>
       <w:r>
         <w:rPr>
@@ -495,12 +448,7 @@
     </w:p>
     <w:p>
       <w:pPr>
-        <w:pStyle w:val="ListParagraph"/>
-        <w:numPr>
-          <w:ilvl w:val="0"/>
-          <w:numId w:val="1"/>
-        </w:numPr>
-        <w:spacing/>
+        <w:spacing w:after="40"/>
       </w:pPr>
       <w:r>
         <w:rPr>
@@ -513,11 +461,6 @@
     </w:p>
     <w:p>
       <w:pPr>
-        <w:pStyle w:val="ListParagraph"/>
-        <w:numPr>
-          <w:ilvl w:val="0"/>
-          <w:numId w:val="1"/>
-        </w:numPr>
         <w:spacing w:after="80"/>
       </w:pPr>
       <w:r>
@@ -526,7 +469,7 @@
           <w:sz w:val="22"/>
           <w:szCs w:val="22"/>
         </w:rPr>
-        <w:t xml:space="preserve">• Delivered full-stack features; built backend REST API with Java 11, Spring Boot, and Spring Data JPA for portfolio management system.</w:t>
+        <w:t xml:space="preserve">• Developed full-stack features and backend REST API with Java 11, Spring Boot, and Spring Data JPA for portfolio management system.</w:t>
       </w:r>
     </w:p>
     <w:p>
@@ -565,12 +508,7 @@
     </w:p>
     <w:p>
       <w:pPr>
-        <w:pStyle w:val="ListParagraph"/>
-        <w:numPr>
-          <w:ilvl w:val="0"/>
-          <w:numId w:val="1"/>
-        </w:numPr>
-        <w:spacing/>
+        <w:spacing w:after="40"/>
       </w:pPr>
       <w:r>
         <w:rPr>
@@ -583,30 +521,20 @@
     </w:p>
     <w:p>
       <w:pPr>
-        <w:pStyle w:val="ListParagraph"/>
-        <w:numPr>
-          <w:ilvl w:val="0"/>
-          <w:numId w:val="1"/>
-        </w:numPr>
-        <w:spacing/>
-      </w:pPr>
-      <w:r>
-        <w:rPr>
-          <w:rFonts w:ascii="Times New Roman" w:cs="Times New Roman" w:eastAsia="Times New Roman" w:hAnsi="Times New Roman"/>
-          <w:sz w:val="22"/>
-          <w:szCs w:val="22"/>
-        </w:rPr>
-        <w:t xml:space="preserve">• Built ETL pipelines integrating 3+ data sources (production data, dealer systems, operational DBs) into centralized analytics dashboards.</w:t>
-      </w:r>
-    </w:p>
-    <w:p>
-      <w:pPr>
-        <w:pStyle w:val="ListParagraph"/>
-        <w:numPr>
-          <w:ilvl w:val="0"/>
-          <w:numId w:val="1"/>
-        </w:numPr>
-        <w:spacing/>
+        <w:spacing w:after="40"/>
+      </w:pPr>
+      <w:r>
+        <w:rPr>
+          <w:rFonts w:ascii="Times New Roman" w:cs="Times New Roman" w:eastAsia="Times New Roman" w:hAnsi="Times New Roman"/>
+          <w:sz w:val="22"/>
+          <w:szCs w:val="22"/>
+        </w:rPr>
+        <w:t xml:space="preserve">• Developed ETL pipelines integrating 3+ data sources (production data, dealer systems, operational DBs) into centralized analytics dashboards.</w:t>
+      </w:r>
+    </w:p>
+    <w:p>
+      <w:pPr>
+        <w:spacing w:after="40"/>
       </w:pPr>
       <w:r>
         <w:rPr>
@@ -619,12 +547,7 @@
     </w:p>
     <w:p>
       <w:pPr>
-        <w:pStyle w:val="ListParagraph"/>
-        <w:numPr>
-          <w:ilvl w:val="0"/>
-          <w:numId w:val="1"/>
-        </w:numPr>
-        <w:spacing/>
+        <w:spacing w:after="40"/>
       </w:pPr>
       <w:r>
         <w:rPr>
@@ -637,11 +560,6 @@
     </w:p>
     <w:p>
       <w:pPr>
-        <w:pStyle w:val="ListParagraph"/>
-        <w:numPr>
-          <w:ilvl w:val="0"/>
-          <w:numId w:val="1"/>
-        </w:numPr>
         <w:spacing w:after="80"/>
       </w:pPr>
       <w:r>
@@ -689,12 +607,7 @@
     </w:p>
     <w:p>
       <w:pPr>
-        <w:pStyle w:val="ListParagraph"/>
-        <w:numPr>
-          <w:ilvl w:val="0"/>
-          <w:numId w:val="1"/>
-        </w:numPr>
-        <w:spacing/>
+        <w:spacing w:after="40"/>
       </w:pPr>
       <w:r>
         <w:rPr>
@@ -707,30 +620,20 @@
     </w:p>
     <w:p>
       <w:pPr>
-        <w:pStyle w:val="ListParagraph"/>
-        <w:numPr>
-          <w:ilvl w:val="0"/>
-          <w:numId w:val="1"/>
-        </w:numPr>
-        <w:spacing/>
-      </w:pPr>
-      <w:r>
-        <w:rPr>
-          <w:rFonts w:ascii="Times New Roman" w:cs="Times New Roman" w:eastAsia="Times New Roman" w:hAnsi="Times New Roman"/>
-          <w:sz w:val="22"/>
-          <w:szCs w:val="22"/>
-        </w:rPr>
-        <w:t xml:space="preserve">• Built ETL workflows consolidating laboratory testing and quality control data from 4+ systems into centralized reporting databases.</w:t>
-      </w:r>
-    </w:p>
-    <w:p>
-      <w:pPr>
-        <w:pStyle w:val="ListParagraph"/>
-        <w:numPr>
-          <w:ilvl w:val="0"/>
-          <w:numId w:val="1"/>
-        </w:numPr>
-        <w:spacing/>
+        <w:spacing w:after="40"/>
+      </w:pPr>
+      <w:r>
+        <w:rPr>
+          <w:rFonts w:ascii="Times New Roman" w:cs="Times New Roman" w:eastAsia="Times New Roman" w:hAnsi="Times New Roman"/>
+          <w:sz w:val="22"/>
+          <w:szCs w:val="22"/>
+        </w:rPr>
+        <w:t xml:space="preserve">• Developed ETL workflows consolidating laboratory testing and quality control data from 4+ systems into centralized reporting databases.</w:t>
+      </w:r>
+    </w:p>
+    <w:p>
+      <w:pPr>
+        <w:spacing w:after="40"/>
       </w:pPr>
       <w:r>
         <w:rPr>
@@ -743,29 +646,19 @@
     </w:p>
     <w:p>
       <w:pPr>
-        <w:pStyle w:val="ListParagraph"/>
-        <w:numPr>
-          <w:ilvl w:val="0"/>
-          <w:numId w:val="1"/>
-        </w:numPr>
-        <w:spacing/>
-      </w:pPr>
-      <w:r>
-        <w:rPr>
-          <w:rFonts w:ascii="Times New Roman" w:cs="Times New Roman" w:eastAsia="Times New Roman" w:hAnsi="Times New Roman"/>
-          <w:sz w:val="22"/>
-          <w:szCs w:val="22"/>
-        </w:rPr>
-        <w:t xml:space="preserve">• Created SQL-based reports for drug production monitoring and inventory tracking, enabling data-driven decision-making for supply chain.</w:t>
-      </w:r>
-    </w:p>
-    <w:p>
-      <w:pPr>
-        <w:pStyle w:val="ListParagraph"/>
-        <w:numPr>
-          <w:ilvl w:val="0"/>
-          <w:numId w:val="1"/>
-        </w:numPr>
+        <w:spacing w:after="40"/>
+      </w:pPr>
+      <w:r>
+        <w:rPr>
+          <w:rFonts w:ascii="Times New Roman" w:cs="Times New Roman" w:eastAsia="Times New Roman" w:hAnsi="Times New Roman"/>
+          <w:sz w:val="22"/>
+          <w:szCs w:val="22"/>
+        </w:rPr>
+        <w:t xml:space="preserve">• Developed SQL-based reports for drug production monitoring and inventory tracking, enabling data-driven decision-making for supply chain.</w:t>
+      </w:r>
+    </w:p>
+    <w:p>
+      <w:pPr>
         <w:spacing w:after="80"/>
       </w:pPr>
       <w:r>
@@ -797,16 +690,19 @@
     </w:p>
     <w:p>
       <w:pPr>
-        <w:pStyle w:val="ListParagraph"/>
-        <w:numPr>
-          <w:ilvl w:val="0"/>
-          <w:numId w:val="1"/>
-        </w:numPr>
         <w:spacing w:after="60"/>
       </w:pPr>
       <w:r>
         <w:rPr>
           <w:rFonts w:ascii="Times New Roman" w:cs="Times New Roman" w:eastAsia="Times New Roman" w:hAnsi="Times New Roman"/>
+          <w:sz w:val="22"/>
+          <w:szCs w:val="22"/>
+        </w:rPr>
+        <w:t xml:space="preserve">• </w:t>
+      </w:r>
+      <w:r>
+        <w:rPr>
+          <w:rFonts w:ascii="Times New Roman" w:cs="Times New Roman" w:eastAsia="Times New Roman" w:hAnsi="Times New Roman"/>
           <w:b/>
           <w:bCs/>
           <w:sz w:val="22"/>
@@ -825,16 +721,19 @@
     </w:p>
     <w:p>
       <w:pPr>
-        <w:pStyle w:val="ListParagraph"/>
-        <w:numPr>
-          <w:ilvl w:val="0"/>
-          <w:numId w:val="1"/>
-        </w:numPr>
         <w:spacing w:after="60"/>
       </w:pPr>
       <w:r>
         <w:rPr>
           <w:rFonts w:ascii="Times New Roman" w:cs="Times New Roman" w:eastAsia="Times New Roman" w:hAnsi="Times New Roman"/>
+          <w:sz w:val="22"/>
+          <w:szCs w:val="22"/>
+        </w:rPr>
+        <w:t xml:space="preserve">• </w:t>
+      </w:r>
+      <w:r>
+        <w:rPr>
+          <w:rFonts w:ascii="Times New Roman" w:cs="Times New Roman" w:eastAsia="Times New Roman" w:hAnsi="Times New Roman"/>
           <w:b/>
           <w:bCs/>
           <w:sz w:val="22"/>
@@ -853,13 +752,16 @@
     </w:p>
     <w:p>
       <w:pPr>
-        <w:pStyle w:val="ListParagraph"/>
-        <w:numPr>
-          <w:ilvl w:val="0"/>
-          <w:numId w:val="1"/>
-        </w:numPr>
         <w:spacing w:after="120"/>
       </w:pPr>
+      <w:r>
+        <w:rPr>
+          <w:rFonts w:ascii="Times New Roman" w:cs="Times New Roman" w:eastAsia="Times New Roman" w:hAnsi="Times New Roman"/>
+          <w:sz w:val="22"/>
+          <w:szCs w:val="22"/>
+        </w:rPr>
+        <w:t xml:space="preserve">• </w:t>
+      </w:r>
       <w:r>
         <w:rPr>
           <w:rFonts w:ascii="Times New Roman" w:cs="Times New Roman" w:eastAsia="Times New Roman" w:hAnsi="Times New Roman"/>
@@ -989,16 +891,19 @@
     </w:p>
     <w:p>
       <w:pPr>
-        <w:pStyle w:val="ListParagraph"/>
-        <w:numPr>
-          <w:ilvl w:val="0"/>
-          <w:numId w:val="1"/>
-        </w:numPr>
         <w:spacing w:after="60"/>
       </w:pPr>
       <w:r>
         <w:rPr>
           <w:rFonts w:ascii="Times New Roman" w:cs="Times New Roman" w:eastAsia="Times New Roman" w:hAnsi="Times New Roman"/>
+          <w:sz w:val="22"/>
+          <w:szCs w:val="22"/>
+        </w:rPr>
+        <w:t xml:space="preserve">• </w:t>
+      </w:r>
+      <w:r>
+        <w:rPr>
+          <w:rFonts w:ascii="Times New Roman" w:cs="Times New Roman" w:eastAsia="Times New Roman" w:hAnsi="Times New Roman"/>
           <w:b/>
           <w:bCs/>
           <w:sz w:val="22"/>
@@ -1017,16 +922,19 @@
     </w:p>
     <w:p>
       <w:pPr>
-        <w:pStyle w:val="ListParagraph"/>
-        <w:numPr>
-          <w:ilvl w:val="0"/>
-          <w:numId w:val="1"/>
-        </w:numPr>
         <w:spacing w:after="60"/>
       </w:pPr>
       <w:r>
         <w:rPr>
           <w:rFonts w:ascii="Times New Roman" w:cs="Times New Roman" w:eastAsia="Times New Roman" w:hAnsi="Times New Roman"/>
+          <w:sz w:val="22"/>
+          <w:szCs w:val="22"/>
+        </w:rPr>
+        <w:t xml:space="preserve">• </w:t>
+      </w:r>
+      <w:r>
+        <w:rPr>
+          <w:rFonts w:ascii="Times New Roman" w:cs="Times New Roman" w:eastAsia="Times New Roman" w:hAnsi="Times New Roman"/>
           <w:b/>
           <w:bCs/>
           <w:sz w:val="22"/>
@@ -1045,13 +953,16 @@
     </w:p>
     <w:p>
       <w:pPr>
-        <w:pStyle w:val="ListParagraph"/>
-        <w:numPr>
-          <w:ilvl w:val="0"/>
-          <w:numId w:val="1"/>
-        </w:numPr>
         <w:spacing w:after="60"/>
       </w:pPr>
+      <w:r>
+        <w:rPr>
+          <w:rFonts w:ascii="Times New Roman" w:cs="Times New Roman" w:eastAsia="Times New Roman" w:hAnsi="Times New Roman"/>
+          <w:sz w:val="22"/>
+          <w:szCs w:val="22"/>
+        </w:rPr>
+        <w:t xml:space="preserve">• </w:t>
+      </w:r>
       <w:r>
         <w:rPr>
           <w:rFonts w:ascii="Times New Roman" w:cs="Times New Roman" w:eastAsia="Times New Roman" w:hAnsi="Times New Roman"/>

</xml_diff>

<commit_message>
Regenerate resume PDF and DOCX
Made-with: Cursor
</commit_message>
<xml_diff>
--- a/public/resume.docx
+++ b/public/resume.docx
@@ -45,7 +45,7 @@
         </w:rPr>
         <w:t xml:space="preserve">Tampa, FL, USA  |  </w:t>
       </w:r>
-      <w:hyperlink w:history="1" r:id="rIda2fvjy-lyy8kasgpce8nz">
+      <w:hyperlink w:history="1" r:id="rIdm-mqgzy2mmrf3nfhbxamy">
         <w:r>
           <w:rPr>
             <w:rStyle w:val="Hyperlink"/>
@@ -64,7 +64,7 @@
         </w:rPr>
         <w:t xml:space="preserve">  |  </w:t>
       </w:r>
-      <w:hyperlink w:history="1" r:id="rIdllxy9vhhteulirlbmgrwr">
+      <w:hyperlink w:history="1" r:id="rIdwz7jmtlz1-vb0zza3x-5z">
         <w:r>
           <w:rPr>
             <w:rStyle w:val="Hyperlink"/>
@@ -83,7 +83,7 @@
         </w:rPr>
         <w:t xml:space="preserve">  |  </w:t>
       </w:r>
-      <w:hyperlink w:history="1" r:id="rIdtmhdowqn_z6qnx2e4k-gs">
+      <w:hyperlink w:history="1" r:id="rId5iwdtujmuuaodr41t4hqn">
         <w:r>
           <w:rPr>
             <w:rStyle w:val="Hyperlink"/>

</xml_diff>

<commit_message>
Resume: merge old resume experiences and skills (HDFC Life, Elder, Corebridge, ConocoPhillips)
Made-with: Cursor
</commit_message>
<xml_diff>
--- a/public/resume.docx
+++ b/public/resume.docx
@@ -45,7 +45,7 @@
         </w:rPr>
         <w:t xml:space="preserve">Tampa, FL, USA  |  </w:t>
       </w:r>
-      <w:hyperlink w:history="1" r:id="rIdm-mqgzy2mmrf3nfhbxamy">
+      <w:hyperlink w:history="1" r:id="rId2jhlpzypqaljcwjz6yvfq">
         <w:r>
           <w:rPr>
             <w:rStyle w:val="Hyperlink"/>
@@ -64,7 +64,7 @@
         </w:rPr>
         <w:t xml:space="preserve">  |  </w:t>
       </w:r>
-      <w:hyperlink w:history="1" r:id="rIdwz7jmtlz1-vb0zza3x-5z">
+      <w:hyperlink w:history="1" r:id="rIdh5tkozznqearjvkvalzmo">
         <w:r>
           <w:rPr>
             <w:rStyle w:val="Hyperlink"/>
@@ -83,7 +83,7 @@
         </w:rPr>
         <w:t xml:space="preserve">  |  </w:t>
       </w:r>
-      <w:hyperlink w:history="1" r:id="rId5iwdtujmuuaodr41t4hqn">
+      <w:hyperlink w:history="1" r:id="rIdsqztr9uymlnnhojyxfogb">
         <w:r>
           <w:rPr>
             <w:rStyle w:val="Hyperlink"/>
@@ -123,7 +123,7 @@
           <w:sz w:val="22"/>
           <w:szCs w:val="22"/>
         </w:rPr>
-        <w:t xml:space="preserve">Java Full Stack Developer with 5+ years building scalable enterprise applications. Proficient in Java, Spring Boot, Microservices, REST APIs, React, Docker, Kubernetes, and AWS. AWS Certified DevOps Engineer – Professional, Solutions Architect – Associate, Terraform Associate.</w:t>
+        <w:t xml:space="preserve">Java Full Stack Developer with 6 years of experience building scalable, secure web applications. Skilled in Java, Spring Boot, React, Angular, RESTful APIs, Microservices, Docker, Kubernetes, and AWS. AWS Certified DevOps Engineer – Professional, Solutions Architect – Associate, Terraform Associate.</w:t>
       </w:r>
     </w:p>
     <w:p>
@@ -154,7 +154,7 @@
           <w:sz w:val="22"/>
           <w:szCs w:val="22"/>
         </w:rPr>
-        <w:t xml:space="preserve">Languages: Java, JavaScript, TypeScript | Frameworks: Spring Boot, Hibernate, Spring MVC | Frontend: React, Angular, HTML5, CSS3 | Backend: Node.js, REST APIs, Microservices | DevOps: Jenkins, Docker, Kubernetes, Maven, Git</w:t>
+        <w:t xml:space="preserve">Languages: Java, JavaScript, TypeScript | Frameworks: Spring Boot, Hibernate, Spring MVC, Angular, React | Backend: REST APIs, Microservices, JAX-RS, JDBC, OAuth2, JWT | DevOps: Jenkins, Docker, Kubernetes, Maven, Git, Terraform | Databases: PostgreSQL, MySQL, Oracle, MongoDB, Redis</w:t>
       </w:r>
     </w:p>
     <w:p>
@@ -167,7 +167,7 @@
           <w:sz w:val="22"/>
           <w:szCs w:val="22"/>
         </w:rPr>
-        <w:t xml:space="preserve">Databases: PostgreSQL, MySQL, Oracle, MongoDB | Cloud: AWS (EC2, S3, RDS, Lambda) | Testing: JUnit, Mockito, Postman | Tools: JIRA, Swagger, ELK, Prometheus</w:t>
+        <w:t xml:space="preserve">Messaging: Kafka, RabbitMQ | Cloud: AWS (EC2, S3, RDS, Lambda) | Testing: JUnit, Mockito, Selenium, Cypress | Tools: JIRA, Swagger, Prometheus, Grafana</w:t>
       </w:r>
     </w:p>
     <w:p>
@@ -344,46 +344,59 @@
           <w:sz w:val="22"/>
           <w:szCs w:val="22"/>
         </w:rPr>
-        <w:t xml:space="preserve">• Developed and maintained Java / Spring Boot applications for retirement, life insurance, and asset management workflows serving secure financial data processing.</w:t>
-      </w:r>
-    </w:p>
-    <w:p>
-      <w:pPr>
-        <w:spacing w:after="40"/>
-      </w:pPr>
-      <w:r>
-        <w:rPr>
-          <w:rFonts w:ascii="Times New Roman" w:cs="Times New Roman" w:eastAsia="Times New Roman" w:hAnsi="Times New Roman"/>
-          <w:sz w:val="22"/>
-          <w:szCs w:val="22"/>
-        </w:rPr>
-        <w:t xml:space="preserve">• Developed 10+ RESTful APIs for customer portals, agent dashboards, and admin systems, enabling reliable data exchange for financial workflows.</w:t>
-      </w:r>
-    </w:p>
-    <w:p>
-      <w:pPr>
-        <w:spacing w:after="40"/>
-      </w:pPr>
-      <w:r>
-        <w:rPr>
-          <w:rFonts w:ascii="Times New Roman" w:cs="Times New Roman" w:eastAsia="Times New Roman" w:hAnsi="Times New Roman"/>
-          <w:sz w:val="22"/>
-          <w:szCs w:val="22"/>
-        </w:rPr>
-        <w:t xml:space="preserve">• Developed user-friendly UIs for 3+ portals using Angular / React, improving agent efficiency and customer self-service adoption.</w:t>
-      </w:r>
-    </w:p>
-    <w:p>
-      <w:pPr>
-        <w:spacing w:after="40"/>
-      </w:pPr>
-      <w:r>
-        <w:rPr>
-          <w:rFonts w:ascii="Times New Roman" w:cs="Times New Roman" w:eastAsia="Times New Roman" w:hAnsi="Times New Roman"/>
-          <w:sz w:val="22"/>
-          <w:szCs w:val="22"/>
-        </w:rPr>
-        <w:t xml:space="preserve">• Implemented comprehensive input validation and data checks across forms, reducing data inconsistencies in financial workflows.</w:t>
+        <w:t xml:space="preserve">• Developed and maintained scalable Java / Spring Boot applications for retirement, life insurance, and asset management using Hibernate and RESTful APIs.</w:t>
+      </w:r>
+    </w:p>
+    <w:p>
+      <w:pPr>
+        <w:spacing w:after="40"/>
+      </w:pPr>
+      <w:r>
+        <w:rPr>
+          <w:rFonts w:ascii="Times New Roman" w:cs="Times New Roman" w:eastAsia="Times New Roman" w:hAnsi="Times New Roman"/>
+          <w:sz w:val="22"/>
+          <w:szCs w:val="22"/>
+        </w:rPr>
+        <w:t xml:space="preserve">• Designed and implemented 10+ RESTful APIs; integrated MySQL and PostgreSQL for customer and policy data, optimizing query performance.</w:t>
+      </w:r>
+    </w:p>
+    <w:p>
+      <w:pPr>
+        <w:spacing w:after="40"/>
+      </w:pPr>
+      <w:r>
+        <w:rPr>
+          <w:rFonts w:ascii="Times New Roman" w:cs="Times New Roman" w:eastAsia="Times New Roman" w:hAnsi="Times New Roman"/>
+          <w:sz w:val="22"/>
+          <w:szCs w:val="22"/>
+        </w:rPr>
+        <w:t xml:space="preserve">• Developed dynamic UIs with HTML5, CSS3, Angular, and React for customer portals, agent dashboards, and admin systems.</w:t>
+      </w:r>
+    </w:p>
+    <w:p>
+      <w:pPr>
+        <w:spacing w:after="40"/>
+      </w:pPr>
+      <w:r>
+        <w:rPr>
+          <w:rFonts w:ascii="Times New Roman" w:cs="Times New Roman" w:eastAsia="Times New Roman" w:hAnsi="Times New Roman"/>
+          <w:sz w:val="22"/>
+          <w:szCs w:val="22"/>
+        </w:rPr>
+        <w:t xml:space="preserve">• Implemented OAuth2 and JWT for secure authentication; used Redis for caching to improve system responsiveness.</w:t>
+      </w:r>
+    </w:p>
+    <w:p>
+      <w:pPr>
+        <w:spacing w:after="40"/>
+      </w:pPr>
+      <w:r>
+        <w:rPr>
+          <w:rFonts w:ascii="Times New Roman" w:cs="Times New Roman" w:eastAsia="Times New Roman" w:hAnsi="Times New Roman"/>
+          <w:sz w:val="22"/>
+          <w:szCs w:val="22"/>
+        </w:rPr>
+        <w:t xml:space="preserve">• Collaborated with DevOps to automate deployments using Docker and Kubernetes; utilized AWS EC2, S3, RDS, and Lambda.</w:t>
       </w:r>
     </w:p>
     <w:p>
@@ -396,7 +409,7 @@
           <w:sz w:val="22"/>
           <w:szCs w:val="22"/>
         </w:rPr>
-        <w:t xml:space="preserve">• Collaborated with cross-functional Agile teams to deliver features across dev, QA, and production for financial services applications.</w:t>
+        <w:t xml:space="preserve">• Implemented Jenkins CI/CD pipelines and unit tests with JUnit and Mockito; managed Kafka and RabbitMQ for event-driven processing.</w:t>
       </w:r>
     </w:p>
     <w:p>
@@ -443,20 +456,33 @@
           <w:sz w:val="22"/>
           <w:szCs w:val="22"/>
         </w:rPr>
-        <w:t xml:space="preserve">• Implemented server-side logic using Java and Spring Boot to handle complex calculations, data processing, and transactions supporting 500+ internal users and 10K+ daily transactions.</w:t>
-      </w:r>
-    </w:p>
-    <w:p>
-      <w:pPr>
-        <w:spacing w:after="40"/>
-      </w:pPr>
-      <w:r>
-        <w:rPr>
-          <w:rFonts w:ascii="Times New Roman" w:cs="Times New Roman" w:eastAsia="Times New Roman" w:hAnsi="Times New Roman"/>
-          <w:sz w:val="22"/>
-          <w:szCs w:val="22"/>
-        </w:rPr>
-        <w:t xml:space="preserve">• Designed and developed RESTful APIs for front-end and back-end data exchange, supporting portfolio and asset tracking workflows for energy sector applications.</w:t>
+        <w:t xml:space="preserve">• Designed and developed scalable Java applications for energy exploration; implemented microservices and RESTful APIs using Spring Boot supporting 500+ users and 10K+ daily transactions.</w:t>
+      </w:r>
+    </w:p>
+    <w:p>
+      <w:pPr>
+        <w:spacing w:after="40"/>
+      </w:pPr>
+      <w:r>
+        <w:rPr>
+          <w:rFonts w:ascii="Times New Roman" w:cs="Times New Roman" w:eastAsia="Times New Roman" w:hAnsi="Times New Roman"/>
+          <w:sz w:val="22"/>
+          <w:szCs w:val="22"/>
+        </w:rPr>
+        <w:t xml:space="preserve">• Developed responsive UIs with React, HTML5, and CSS3 for field operation dashboards and asset performance portals.</w:t>
+      </w:r>
+    </w:p>
+    <w:p>
+      <w:pPr>
+        <w:spacing w:after="40"/>
+      </w:pPr>
+      <w:r>
+        <w:rPr>
+          <w:rFonts w:ascii="Times New Roman" w:cs="Times New Roman" w:eastAsia="Times New Roman" w:hAnsi="Times New Roman"/>
+          <w:sz w:val="22"/>
+          <w:szCs w:val="22"/>
+        </w:rPr>
+        <w:t xml:space="preserve">• Integrated Oracle and MySQL databases; developed CI/CD pipelines with Jenkins; implemented Terraform and Ansible for infrastructure-as-code.</w:t>
       </w:r>
     </w:p>
     <w:p>
@@ -469,7 +495,7 @@
           <w:sz w:val="22"/>
           <w:szCs w:val="22"/>
         </w:rPr>
-        <w:t xml:space="preserve">• Developed full-stack features and backend REST API with Java 11, Spring Boot, and Spring Data JPA for portfolio management system.</w:t>
+        <w:t xml:space="preserve">• Utilized Kubernetes for container orchestration; implemented GraphQL APIs and WebSocket for real-time data flow.</w:t>
       </w:r>
     </w:p>
     <w:p>
@@ -485,15 +511,15 @@
           <w:sz w:val="22"/>
           <w:szCs w:val="22"/>
         </w:rPr>
-        <w:t xml:space="preserve">System Engineer</w:t>
-      </w:r>
-      <w:r>
-        <w:rPr>
-          <w:rFonts w:ascii="Times New Roman" w:cs="Times New Roman" w:eastAsia="Times New Roman" w:hAnsi="Times New Roman"/>
-          <w:sz w:val="22"/>
-          <w:szCs w:val="22"/>
-        </w:rPr>
-        <w:t xml:space="preserve">, Infosys</w:t>
+        <w:t xml:space="preserve">Java Developer</w:t>
+      </w:r>
+      <w:r>
+        <w:rPr>
+          <w:rFonts w:ascii="Times New Roman" w:cs="Times New Roman" w:eastAsia="Times New Roman" w:hAnsi="Times New Roman"/>
+          <w:sz w:val="22"/>
+          <w:szCs w:val="22"/>
+        </w:rPr>
+        <w:t xml:space="preserve">, Infosys (HDFC Life)</w:t>
       </w:r>
       <w:r>
         <w:rPr>
@@ -503,59 +529,59 @@
           <w:sz w:val="22"/>
           <w:szCs w:val="22"/>
         </w:rPr>
-        <w:t xml:space="preserve">	Jun 2021 – Jun 2022</w:t>
-      </w:r>
-    </w:p>
-    <w:p>
-      <w:pPr>
-        <w:spacing w:after="40"/>
-      </w:pPr>
-      <w:r>
-        <w:rPr>
-          <w:rFonts w:ascii="Times New Roman" w:cs="Times New Roman" w:eastAsia="Times New Roman" w:hAnsi="Times New Roman"/>
-          <w:sz w:val="22"/>
-          <w:szCs w:val="22"/>
-        </w:rPr>
-        <w:t xml:space="preserve">• Developed backend data services for Mercedes-Benz vehicle manufacturing and supply chain analytics, supporting enterprise-scale operations.</w:t>
-      </w:r>
-    </w:p>
-    <w:p>
-      <w:pPr>
-        <w:spacing w:after="40"/>
-      </w:pPr>
-      <w:r>
-        <w:rPr>
-          <w:rFonts w:ascii="Times New Roman" w:cs="Times New Roman" w:eastAsia="Times New Roman" w:hAnsi="Times New Roman"/>
-          <w:sz w:val="22"/>
-          <w:szCs w:val="22"/>
-        </w:rPr>
-        <w:t xml:space="preserve">• Developed ETL pipelines integrating 3+ data sources (production data, dealer systems, operational DBs) into centralized analytics dashboards.</w:t>
-      </w:r>
-    </w:p>
-    <w:p>
-      <w:pPr>
-        <w:spacing w:after="40"/>
-      </w:pPr>
-      <w:r>
-        <w:rPr>
-          <w:rFonts w:ascii="Times New Roman" w:cs="Times New Roman" w:eastAsia="Times New Roman" w:hAnsi="Times New Roman"/>
-          <w:sz w:val="22"/>
-          <w:szCs w:val="22"/>
-        </w:rPr>
-        <w:t xml:space="preserve">• Optimized SQL queries for automotive analytics dashboards, improving report generation performance for production and logistics metrics.</w:t>
-      </w:r>
-    </w:p>
-    <w:p>
-      <w:pPr>
-        <w:spacing w:after="40"/>
-      </w:pPr>
-      <w:r>
-        <w:rPr>
-          <w:rFonts w:ascii="Times New Roman" w:cs="Times New Roman" w:eastAsia="Times New Roman" w:hAnsi="Times New Roman"/>
-          <w:sz w:val="22"/>
-          <w:szCs w:val="22"/>
-        </w:rPr>
-        <w:t xml:space="preserve">• Implemented data validation and transformation logic for vehicle inventory and distribution data, ensuring 99%+ integration accuracy.</w:t>
+        <w:t xml:space="preserve">	Dec 2020 – Dec 2022</w:t>
+      </w:r>
+    </w:p>
+    <w:p>
+      <w:pPr>
+        <w:spacing w:after="40"/>
+      </w:pPr>
+      <w:r>
+        <w:rPr>
+          <w:rFonts w:ascii="Times New Roman" w:cs="Times New Roman" w:eastAsia="Times New Roman" w:hAnsi="Times New Roman"/>
+          <w:sz w:val="22"/>
+          <w:szCs w:val="22"/>
+        </w:rPr>
+        <w:t xml:space="preserve">• Developed RESTful services and MVC modules using Spring MVC, Servlet/JSP, and Hibernate for insurance policy and claims processing.</w:t>
+      </w:r>
+    </w:p>
+    <w:p>
+      <w:pPr>
+        <w:spacing w:after="40"/>
+      </w:pPr>
+      <w:r>
+        <w:rPr>
+          <w:rFonts w:ascii="Times New Roman" w:cs="Times New Roman" w:eastAsia="Times New Roman" w:hAnsi="Times New Roman"/>
+          <w:sz w:val="22"/>
+          <w:szCs w:val="22"/>
+        </w:rPr>
+        <w:t xml:space="preserve">• Developed dynamic SPAs with AngularJS, React, and Node.js for premium and claim dashboards; used ASP.NET Web API for data communication.</w:t>
+      </w:r>
+    </w:p>
+    <w:p>
+      <w:pPr>
+        <w:spacing w:after="40"/>
+      </w:pPr>
+      <w:r>
+        <w:rPr>
+          <w:rFonts w:ascii="Times New Roman" w:cs="Times New Roman" w:eastAsia="Times New Roman" w:hAnsi="Times New Roman"/>
+          <w:sz w:val="22"/>
+          <w:szCs w:val="22"/>
+        </w:rPr>
+        <w:t xml:space="preserve">• Integrated Oracle Database with Hibernate and JDBC; implemented Redis and Memcached for caching policy and claims data.</w:t>
+      </w:r>
+    </w:p>
+    <w:p>
+      <w:pPr>
+        <w:spacing w:after="40"/>
+      </w:pPr>
+      <w:r>
+        <w:rPr>
+          <w:rFonts w:ascii="Times New Roman" w:cs="Times New Roman" w:eastAsia="Times New Roman" w:hAnsi="Times New Roman"/>
+          <w:sz w:val="22"/>
+          <w:szCs w:val="22"/>
+        </w:rPr>
+        <w:t xml:space="preserve">• Implemented OAuth2, JWT, and LDAP for authentication; used Docker, Jenkins, and Kubernetes for CI/CD.</w:t>
       </w:r>
     </w:p>
     <w:p>
@@ -568,7 +594,7 @@
           <w:sz w:val="22"/>
           <w:szCs w:val="22"/>
         </w:rPr>
-        <w:t xml:space="preserve">• Collaborated in Agile sprints to deliver data integration features for automotive operations and engineering teams.</w:t>
+        <w:t xml:space="preserve">• Developed unit and integration tests with JUnit, TestNG, and Mockito; built dashboards with Microsoft Power BI.</w:t>
       </w:r>
     </w:p>
     <w:p>
@@ -584,7 +610,7 @@
           <w:sz w:val="22"/>
           <w:szCs w:val="22"/>
         </w:rPr>
-        <w:t xml:space="preserve">Associate System Engineer</w:t>
+        <w:t xml:space="preserve">Java Full Stack Developer</w:t>
       </w:r>
       <w:r>
         <w:rPr>
@@ -602,59 +628,59 @@
           <w:sz w:val="22"/>
           <w:szCs w:val="22"/>
         </w:rPr>
-        <w:t xml:space="preserve">	Jun 2019 – May 2021</w:t>
-      </w:r>
-    </w:p>
-    <w:p>
-      <w:pPr>
-        <w:spacing w:after="40"/>
-      </w:pPr>
-      <w:r>
-        <w:rPr>
-          <w:rFonts w:ascii="Times New Roman" w:cs="Times New Roman" w:eastAsia="Times New Roman" w:hAnsi="Times New Roman"/>
-          <w:sz w:val="22"/>
-          <w:szCs w:val="22"/>
-        </w:rPr>
-        <w:t xml:space="preserve">• Developed data integration processes for drug manufacturing, batch production, and inventory data across multiple pharmaceutical systems.</w:t>
-      </w:r>
-    </w:p>
-    <w:p>
-      <w:pPr>
-        <w:spacing w:after="40"/>
-      </w:pPr>
-      <w:r>
-        <w:rPr>
-          <w:rFonts w:ascii="Times New Roman" w:cs="Times New Roman" w:eastAsia="Times New Roman" w:hAnsi="Times New Roman"/>
-          <w:sz w:val="22"/>
-          <w:szCs w:val="22"/>
-        </w:rPr>
-        <w:t xml:space="preserve">• Developed ETL workflows consolidating laboratory testing and quality control data from 4+ systems into centralized reporting databases.</w:t>
-      </w:r>
-    </w:p>
-    <w:p>
-      <w:pPr>
-        <w:spacing w:after="40"/>
-      </w:pPr>
-      <w:r>
-        <w:rPr>
-          <w:rFonts w:ascii="Times New Roman" w:cs="Times New Roman" w:eastAsia="Times New Roman" w:hAnsi="Times New Roman"/>
-          <w:sz w:val="22"/>
-          <w:szCs w:val="22"/>
-        </w:rPr>
-        <w:t xml:space="preserve">• Implemented data validation logic for clinical and drug safety datasets, supporting regulatory compliance and pharmacovigilance reporting.</w:t>
-      </w:r>
-    </w:p>
-    <w:p>
-      <w:pPr>
-        <w:spacing w:after="40"/>
-      </w:pPr>
-      <w:r>
-        <w:rPr>
-          <w:rFonts w:ascii="Times New Roman" w:cs="Times New Roman" w:eastAsia="Times New Roman" w:hAnsi="Times New Roman"/>
-          <w:sz w:val="22"/>
-          <w:szCs w:val="22"/>
-        </w:rPr>
-        <w:t xml:space="preserve">• Developed SQL-based reports for drug production monitoring and inventory tracking, enabling data-driven decision-making for supply chain.</w:t>
+        <w:t xml:space="preserve">	Jun 2019 – Dec 2020</w:t>
+      </w:r>
+    </w:p>
+    <w:p>
+      <w:pPr>
+        <w:spacing w:after="40"/>
+      </w:pPr>
+      <w:r>
+        <w:rPr>
+          <w:rFonts w:ascii="Times New Roman" w:cs="Times New Roman" w:eastAsia="Times New Roman" w:hAnsi="Times New Roman"/>
+          <w:sz w:val="22"/>
+          <w:szCs w:val="22"/>
+        </w:rPr>
+        <w:t xml:space="preserve">• Developed Spring Boot and Node.js microservices for production process monitoring; built RESTful APIs for ERP integration.</w:t>
+      </w:r>
+    </w:p>
+    <w:p>
+      <w:pPr>
+        <w:spacing w:after="40"/>
+      </w:pPr>
+      <w:r>
+        <w:rPr>
+          <w:rFonts w:ascii="Times New Roman" w:cs="Times New Roman" w:eastAsia="Times New Roman" w:hAnsi="Times New Roman"/>
+          <w:sz w:val="22"/>
+          <w:szCs w:val="22"/>
+        </w:rPr>
+        <w:t xml:space="preserve">• Developed dashboards and reporting modules with AngularJS, React, Node.js, HTML5, CSS3, and Bootstrap for inventory and lab results.</w:t>
+      </w:r>
+    </w:p>
+    <w:p>
+      <w:pPr>
+        <w:spacing w:after="40"/>
+      </w:pPr>
+      <w:r>
+        <w:rPr>
+          <w:rFonts w:ascii="Times New Roman" w:cs="Times New Roman" w:eastAsia="Times New Roman" w:hAnsi="Times New Roman"/>
+          <w:sz w:val="22"/>
+          <w:szCs w:val="22"/>
+        </w:rPr>
+        <w:t xml:space="preserve">• Designed optimized Stored Procedures and PL/SQL for MS-SQL, Oracle, DB2, and PostgreSQL; implemented OAuth2 and JWT for security.</w:t>
+      </w:r>
+    </w:p>
+    <w:p>
+      <w:pPr>
+        <w:spacing w:after="40"/>
+      </w:pPr>
+      <w:r>
+        <w:rPr>
+          <w:rFonts w:ascii="Times New Roman" w:cs="Times New Roman" w:eastAsia="Times New Roman" w:hAnsi="Times New Roman"/>
+          <w:sz w:val="22"/>
+          <w:szCs w:val="22"/>
+        </w:rPr>
+        <w:t xml:space="preserve">• Integrated Apache Kafka for real-time messaging; used Apache NiFi for data ingestion and Power BI for analytics dashboards.</w:t>
       </w:r>
     </w:p>
     <w:p>
@@ -667,7 +693,7 @@
           <w:sz w:val="22"/>
           <w:szCs w:val="22"/>
         </w:rPr>
-        <w:t xml:space="preserve">• Collaborated with QA teams to ensure data consistency for pharmaceutical manufacturing and compliance audits.</w:t>
+        <w:t xml:space="preserve">• Automated CI/CD with Jenkins, Git, JUnit, Selenium, and Maven for pharmaceutical compliance systems.</w:t>
       </w:r>
     </w:p>
     <w:p>

</xml_diff>

<commit_message>
Resume: old format with Profile Summary, Technical Skills grid, Work Experience (Description/Responsibilities/Environment)
Made-with: Cursor
</commit_message>
<xml_diff>
--- a/public/resume.docx
+++ b/public/resume.docx
@@ -4,6 +4,20 @@
   <w:body>
     <w:p>
       <w:pPr>
+        <w:spacing w:after="40"/>
+        <w:jc w:val="center"/>
+      </w:pPr>
+      <w:r>
+        <w:rPr>
+          <w:rFonts w:ascii="Times New Roman" w:cs="Times New Roman" w:eastAsia="Times New Roman" w:hAnsi="Times New Roman"/>
+          <w:sz w:val="22"/>
+          <w:szCs w:val="22"/>
+        </w:rPr>
+        <w:t xml:space="preserve">456-961-7695</w:t>
+      </w:r>
+    </w:p>
+    <w:p>
+      <w:pPr>
         <w:spacing w:after="80"/>
         <w:jc w:val="center"/>
       </w:pPr>
@@ -20,51 +34,40 @@
     </w:p>
     <w:p>
       <w:pPr>
+        <w:spacing w:after="80"/>
+        <w:jc w:val="center"/>
+      </w:pPr>
+      <w:r>
+        <w:rPr>
+          <w:rFonts w:ascii="Times New Roman" w:cs="Times New Roman" w:eastAsia="Times New Roman" w:hAnsi="Times New Roman"/>
+          <w:sz w:val="24"/>
+          <w:szCs w:val="24"/>
+        </w:rPr>
+        <w:t xml:space="preserve">Java Full Stack Developer  </w:t>
+      </w:r>
+      <w:r>
+        <w:rPr>
+          <w:rFonts w:ascii="Times New Roman" w:cs="Times New Roman" w:eastAsia="Times New Roman" w:hAnsi="Times New Roman"/>
+          <w:sz w:val="24"/>
+          <w:szCs w:val="24"/>
+        </w:rPr>
+        <w:t xml:space="preserve">gsg1499@gmail.com</w:t>
+      </w:r>
+    </w:p>
+    <w:p>
+      <w:pPr>
         <w:spacing w:after="120"/>
         <w:jc w:val="center"/>
       </w:pPr>
       <w:r>
         <w:rPr>
           <w:rFonts w:ascii="Times New Roman" w:cs="Times New Roman" w:eastAsia="Times New Roman" w:hAnsi="Times New Roman"/>
-          <w:sz w:val="24"/>
-          <w:szCs w:val="24"/>
-        </w:rPr>
-        <w:t xml:space="preserve">Java Full Stack Developer</w:t>
-      </w:r>
-    </w:p>
-    <w:p>
-      <w:pPr>
-        <w:spacing w:after="120"/>
-        <w:jc w:val="center"/>
-      </w:pPr>
-      <w:r>
-        <w:rPr>
-          <w:rFonts w:ascii="Times New Roman" w:cs="Times New Roman" w:eastAsia="Times New Roman" w:hAnsi="Times New Roman"/>
           <w:sz w:val="22"/>
           <w:szCs w:val="22"/>
         </w:rPr>
         <w:t xml:space="preserve">Tampa, FL, USA  |  </w:t>
       </w:r>
-      <w:hyperlink w:history="1" r:id="rId2jhlpzypqaljcwjz6yvfq">
-        <w:r>
-          <w:rPr>
-            <w:rStyle w:val="Hyperlink"/>
-            <w:rFonts w:ascii="Times New Roman" w:cs="Times New Roman" w:eastAsia="Times New Roman" w:hAnsi="Times New Roman"/>
-            <w:sz w:val="22"/>
-            <w:szCs w:val="22"/>
-          </w:rPr>
-          <w:t xml:space="preserve">gsg1499@gmail.com</w:t>
-        </w:r>
-      </w:hyperlink>
-      <w:r>
-        <w:rPr>
-          <w:rFonts w:ascii="Times New Roman" w:cs="Times New Roman" w:eastAsia="Times New Roman" w:hAnsi="Times New Roman"/>
-          <w:sz w:val="22"/>
-          <w:szCs w:val="22"/>
-        </w:rPr>
-        <w:t xml:space="preserve">  |  </w:t>
-      </w:r>
-      <w:hyperlink w:history="1" r:id="rIdh5tkozznqearjvkvalzmo">
+      <w:hyperlink w:history="1" r:id="rIdkkga2zks2vlvf6nveuqns">
         <w:r>
           <w:rPr>
             <w:rStyle w:val="Hyperlink"/>
@@ -83,7 +86,7 @@
         </w:rPr>
         <w:t xml:space="preserve">  |  </w:t>
       </w:r>
-      <w:hyperlink w:history="1" r:id="rIdsqztr9uymlnnhojyxfogb">
+      <w:hyperlink w:history="1" r:id="rIdccgau-grns3nxzvyqqdum">
         <w:r>
           <w:rPr>
             <w:rStyle w:val="Hyperlink"/>
@@ -110,7 +113,7 @@
           <w:sz w:val="24"/>
           <w:szCs w:val="24"/>
         </w:rPr>
-        <w:t xml:space="preserve">Professional Summary</w:t>
+        <w:t xml:space="preserve">PROFILE SUMMARY</w:t>
       </w:r>
     </w:p>
     <w:p>
@@ -141,20 +144,191 @@
           <w:sz w:val="24"/>
           <w:szCs w:val="24"/>
         </w:rPr>
-        <w:t xml:space="preserve">Technical Skills</w:t>
-      </w:r>
-    </w:p>
-    <w:p>
-      <w:pPr>
-        <w:spacing w:after="40"/>
-      </w:pPr>
-      <w:r>
-        <w:rPr>
-          <w:rFonts w:ascii="Times New Roman" w:cs="Times New Roman" w:eastAsia="Times New Roman" w:hAnsi="Times New Roman"/>
-          <w:sz w:val="22"/>
-          <w:szCs w:val="22"/>
-        </w:rPr>
-        <w:t xml:space="preserve">Languages: Java, JavaScript, TypeScript | Frameworks: Spring Boot, Hibernate, Spring MVC, Angular, React | Backend: REST APIs, Microservices, JAX-RS, JDBC, OAuth2, JWT | DevOps: Jenkins, Docker, Kubernetes, Maven, Git, Terraform | Databases: PostgreSQL, MySQL, Oracle, MongoDB, Redis</w:t>
+        <w:t xml:space="preserve">TECHNICAL SKILLS</w:t>
+      </w:r>
+    </w:p>
+    <w:p>
+      <w:pPr>
+        <w:spacing w:after="40"/>
+      </w:pPr>
+      <w:r>
+        <w:rPr>
+          <w:rFonts w:ascii="Times New Roman" w:cs="Times New Roman" w:eastAsia="Times New Roman" w:hAnsi="Times New Roman"/>
+          <w:b/>
+          <w:bCs/>
+          <w:sz w:val="22"/>
+          <w:szCs w:val="22"/>
+        </w:rPr>
+        <w:t xml:space="preserve">Web Technologies: </w:t>
+      </w:r>
+      <w:r>
+        <w:rPr>
+          <w:rFonts w:ascii="Times New Roman" w:cs="Times New Roman" w:eastAsia="Times New Roman" w:hAnsi="Times New Roman"/>
+          <w:sz w:val="22"/>
+          <w:szCs w:val="22"/>
+        </w:rPr>
+        <w:t xml:space="preserve">HTML, CSS, JavaScript, Angular, React, Redux, AJAX, JSON, XML</w:t>
+      </w:r>
+    </w:p>
+    <w:p>
+      <w:pPr>
+        <w:spacing w:after="40"/>
+      </w:pPr>
+      <w:r>
+        <w:rPr>
+          <w:rFonts w:ascii="Times New Roman" w:cs="Times New Roman" w:eastAsia="Times New Roman" w:hAnsi="Times New Roman"/>
+          <w:b/>
+          <w:bCs/>
+          <w:sz w:val="22"/>
+          <w:szCs w:val="22"/>
+        </w:rPr>
+        <w:t xml:space="preserve">Programming Languages: </w:t>
+      </w:r>
+      <w:r>
+        <w:rPr>
+          <w:rFonts w:ascii="Times New Roman" w:cs="Times New Roman" w:eastAsia="Times New Roman" w:hAnsi="Times New Roman"/>
+          <w:sz w:val="22"/>
+          <w:szCs w:val="22"/>
+        </w:rPr>
+        <w:t xml:space="preserve">Java, JavaScript, TypeScript</w:t>
+      </w:r>
+    </w:p>
+    <w:p>
+      <w:pPr>
+        <w:spacing w:after="40"/>
+      </w:pPr>
+      <w:r>
+        <w:rPr>
+          <w:rFonts w:ascii="Times New Roman" w:cs="Times New Roman" w:eastAsia="Times New Roman" w:hAnsi="Times New Roman"/>
+          <w:b/>
+          <w:bCs/>
+          <w:sz w:val="22"/>
+          <w:szCs w:val="22"/>
+        </w:rPr>
+        <w:t xml:space="preserve">Frameworks: </w:t>
+      </w:r>
+      <w:r>
+        <w:rPr>
+          <w:rFonts w:ascii="Times New Roman" w:cs="Times New Roman" w:eastAsia="Times New Roman" w:hAnsi="Times New Roman"/>
+          <w:sz w:val="22"/>
+          <w:szCs w:val="22"/>
+        </w:rPr>
+        <w:t xml:space="preserve">Spring Boot, Spring MVC, Hibernate, Angular, React</w:t>
+      </w:r>
+    </w:p>
+    <w:p>
+      <w:pPr>
+        <w:spacing w:after="40"/>
+      </w:pPr>
+      <w:r>
+        <w:rPr>
+          <w:rFonts w:ascii="Times New Roman" w:cs="Times New Roman" w:eastAsia="Times New Roman" w:hAnsi="Times New Roman"/>
+          <w:b/>
+          <w:bCs/>
+          <w:sz w:val="22"/>
+          <w:szCs w:val="22"/>
+        </w:rPr>
+        <w:t xml:space="preserve">Backend &amp; APIs: </w:t>
+      </w:r>
+      <w:r>
+        <w:rPr>
+          <w:rFonts w:ascii="Times New Roman" w:cs="Times New Roman" w:eastAsia="Times New Roman" w:hAnsi="Times New Roman"/>
+          <w:sz w:val="22"/>
+          <w:szCs w:val="22"/>
+        </w:rPr>
+        <w:t xml:space="preserve">REST APIs, Microservices, JAX-RS, JDBC, OAuth2, JWT</w:t>
+      </w:r>
+    </w:p>
+    <w:p>
+      <w:pPr>
+        <w:spacing w:after="40"/>
+      </w:pPr>
+      <w:r>
+        <w:rPr>
+          <w:rFonts w:ascii="Times New Roman" w:cs="Times New Roman" w:eastAsia="Times New Roman" w:hAnsi="Times New Roman"/>
+          <w:b/>
+          <w:bCs/>
+          <w:sz w:val="22"/>
+          <w:szCs w:val="22"/>
+        </w:rPr>
+        <w:t xml:space="preserve">Databases: </w:t>
+      </w:r>
+      <w:r>
+        <w:rPr>
+          <w:rFonts w:ascii="Times New Roman" w:cs="Times New Roman" w:eastAsia="Times New Roman" w:hAnsi="Times New Roman"/>
+          <w:sz w:val="22"/>
+          <w:szCs w:val="22"/>
+        </w:rPr>
+        <w:t xml:space="preserve">PostgreSQL, MySQL, Oracle, MongoDB, Redis, SQL, PL/SQL</w:t>
+      </w:r>
+    </w:p>
+    <w:p>
+      <w:pPr>
+        <w:spacing w:after="40"/>
+      </w:pPr>
+      <w:r>
+        <w:rPr>
+          <w:rFonts w:ascii="Times New Roman" w:cs="Times New Roman" w:eastAsia="Times New Roman" w:hAnsi="Times New Roman"/>
+          <w:b/>
+          <w:bCs/>
+          <w:sz w:val="22"/>
+          <w:szCs w:val="22"/>
+        </w:rPr>
+        <w:t xml:space="preserve">DevOps &amp; Cloud: </w:t>
+      </w:r>
+      <w:r>
+        <w:rPr>
+          <w:rFonts w:ascii="Times New Roman" w:cs="Times New Roman" w:eastAsia="Times New Roman" w:hAnsi="Times New Roman"/>
+          <w:sz w:val="22"/>
+          <w:szCs w:val="22"/>
+        </w:rPr>
+        <w:t xml:space="preserve">Jenkins, Docker, Kubernetes, Maven, Git, Terraform, AWS (EC2, S3, RDS, Lambda)</w:t>
+      </w:r>
+    </w:p>
+    <w:p>
+      <w:pPr>
+        <w:spacing w:after="40"/>
+      </w:pPr>
+      <w:r>
+        <w:rPr>
+          <w:rFonts w:ascii="Times New Roman" w:cs="Times New Roman" w:eastAsia="Times New Roman" w:hAnsi="Times New Roman"/>
+          <w:b/>
+          <w:bCs/>
+          <w:sz w:val="22"/>
+          <w:szCs w:val="22"/>
+        </w:rPr>
+        <w:t xml:space="preserve">Messaging: </w:t>
+      </w:r>
+      <w:r>
+        <w:rPr>
+          <w:rFonts w:ascii="Times New Roman" w:cs="Times New Roman" w:eastAsia="Times New Roman" w:hAnsi="Times New Roman"/>
+          <w:sz w:val="22"/>
+          <w:szCs w:val="22"/>
+        </w:rPr>
+        <w:t xml:space="preserve">Kafka, RabbitMQ</w:t>
+      </w:r>
+    </w:p>
+    <w:p>
+      <w:pPr>
+        <w:spacing w:after="40"/>
+      </w:pPr>
+      <w:r>
+        <w:rPr>
+          <w:rFonts w:ascii="Times New Roman" w:cs="Times New Roman" w:eastAsia="Times New Roman" w:hAnsi="Times New Roman"/>
+          <w:b/>
+          <w:bCs/>
+          <w:sz w:val="22"/>
+          <w:szCs w:val="22"/>
+        </w:rPr>
+        <w:t xml:space="preserve">Testing: </w:t>
+      </w:r>
+      <w:r>
+        <w:rPr>
+          <w:rFonts w:ascii="Times New Roman" w:cs="Times New Roman" w:eastAsia="Times New Roman" w:hAnsi="Times New Roman"/>
+          <w:sz w:val="22"/>
+          <w:szCs w:val="22"/>
+        </w:rPr>
+        <w:t xml:space="preserve">JUnit, Mockito, Selenium, Cypress, Postman</w:t>
       </w:r>
     </w:p>
     <w:p>
@@ -164,10 +338,33 @@
       <w:r>
         <w:rPr>
           <w:rFonts w:ascii="Times New Roman" w:cs="Times New Roman" w:eastAsia="Times New Roman" w:hAnsi="Times New Roman"/>
-          <w:sz w:val="22"/>
-          <w:szCs w:val="22"/>
-        </w:rPr>
-        <w:t xml:space="preserve">Messaging: Kafka, RabbitMQ | Cloud: AWS (EC2, S3, RDS, Lambda) | Testing: JUnit, Mockito, Selenium, Cypress | Tools: JIRA, Swagger, Prometheus, Grafana</w:t>
+          <w:b/>
+          <w:bCs/>
+          <w:sz w:val="22"/>
+          <w:szCs w:val="22"/>
+        </w:rPr>
+        <w:t xml:space="preserve">Tools: </w:t>
+      </w:r>
+      <w:r>
+        <w:rPr>
+          <w:rFonts w:ascii="Times New Roman" w:cs="Times New Roman" w:eastAsia="Times New Roman" w:hAnsi="Times New Roman"/>
+          <w:sz w:val="22"/>
+          <w:szCs w:val="22"/>
+        </w:rPr>
+        <w:t xml:space="preserve">JIRA, Swagger, Prometheus, Grafana, IntelliJ IDEA, VSCode, Eclipse</w:t>
+      </w:r>
+    </w:p>
+    <w:p>
+      <w:pPr>
+        <w:spacing w:after="80"/>
+      </w:pPr>
+      <w:r>
+        <w:rPr>
+          <w:rFonts w:ascii="Times New Roman" w:cs="Times New Roman" w:eastAsia="Times New Roman" w:hAnsi="Times New Roman"/>
+          <w:sz w:val="22"/>
+          <w:szCs w:val="22"/>
+        </w:rPr>
+        <w:t xml:space="preserve"/>
       </w:r>
     </w:p>
     <w:p>
@@ -185,46 +382,78 @@
           <w:sz w:val="24"/>
           <w:szCs w:val="24"/>
         </w:rPr>
-        <w:t xml:space="preserve">Professional Experience</w:t>
-      </w:r>
-    </w:p>
-    <w:p>
-      <w:pPr>
-        <w:keepLines/>
-        <w:spacing w:after="60"/>
-      </w:pPr>
-      <w:r>
-        <w:rPr>
-          <w:rFonts w:ascii="Times New Roman" w:cs="Times New Roman" w:eastAsia="Times New Roman" w:hAnsi="Times New Roman"/>
-          <w:b/>
-          <w:bCs/>
-          <w:sz w:val="22"/>
-          <w:szCs w:val="22"/>
-        </w:rPr>
-        <w:t xml:space="preserve">Full Stack Engineer</w:t>
-      </w:r>
-      <w:r>
-        <w:rPr>
-          <w:rFonts w:ascii="Times New Roman" w:cs="Times New Roman" w:eastAsia="Times New Roman" w:hAnsi="Times New Roman"/>
-          <w:sz w:val="22"/>
-          <w:szCs w:val="22"/>
-        </w:rPr>
-        <w:t xml:space="preserve">, Mad Mobile</w:t>
-      </w:r>
-      <w:r>
-        <w:rPr>
-          <w:rFonts w:ascii="Times New Roman" w:cs="Times New Roman" w:eastAsia="Times New Roman" w:hAnsi="Times New Roman"/>
-          <w:i/>
-          <w:iCs/>
-          <w:sz w:val="22"/>
-          <w:szCs w:val="22"/>
-        </w:rPr>
-        <w:t xml:space="preserve">	Nov 2025 – Present</w:t>
-      </w:r>
-    </w:p>
-    <w:p>
-      <w:pPr>
-        <w:spacing w:after="40"/>
+        <w:t xml:space="preserve">WORK EXPERIENCE</w:t>
+      </w:r>
+    </w:p>
+    <w:p>
+      <w:pPr>
+        <w:spacing w:after="40"/>
+      </w:pPr>
+      <w:r>
+        <w:rPr>
+          <w:rFonts w:ascii="Times New Roman" w:cs="Times New Roman" w:eastAsia="Times New Roman" w:hAnsi="Times New Roman"/>
+          <w:b/>
+          <w:bCs/>
+          <w:sz w:val="22"/>
+          <w:szCs w:val="22"/>
+        </w:rPr>
+        <w:t xml:space="preserve">Mad Mobile | Tampa, FL, USA</w:t>
+      </w:r>
+    </w:p>
+    <w:p>
+      <w:pPr>
+        <w:spacing w:after="40"/>
+      </w:pPr>
+      <w:r>
+        <w:rPr>
+          <w:rFonts w:ascii="Times New Roman" w:cs="Times New Roman" w:eastAsia="Times New Roman" w:hAnsi="Times New Roman"/>
+          <w:sz w:val="22"/>
+          <w:szCs w:val="22"/>
+        </w:rPr>
+        <w:t xml:space="preserve">Full Stack Engineer | Nov 2025 – Present</w:t>
+      </w:r>
+    </w:p>
+    <w:p>
+      <w:pPr>
+        <w:spacing w:after="40"/>
+      </w:pPr>
+      <w:r>
+        <w:rPr>
+          <w:rFonts w:ascii="Times New Roman" w:cs="Times New Roman" w:eastAsia="Times New Roman" w:hAnsi="Times New Roman"/>
+          <w:b/>
+          <w:bCs/>
+          <w:sz w:val="22"/>
+          <w:szCs w:val="22"/>
+        </w:rPr>
+        <w:t xml:space="preserve">Description: </w:t>
+      </w:r>
+      <w:r>
+        <w:rPr>
+          <w:rFonts w:ascii="Times New Roman" w:cs="Times New Roman" w:eastAsia="Times New Roman" w:hAnsi="Times New Roman"/>
+          <w:sz w:val="22"/>
+          <w:szCs w:val="22"/>
+        </w:rPr>
+        <w:t xml:space="preserve">Modernizing legacy Spring MVC systems with Java 17 / Spring Boot microservices. Building event-driven architecture and cloud-native applications.</w:t>
+      </w:r>
+    </w:p>
+    <w:p>
+      <w:pPr>
+        <w:spacing w:after="20"/>
+      </w:pPr>
+      <w:r>
+        <w:rPr>
+          <w:rFonts w:ascii="Times New Roman" w:cs="Times New Roman" w:eastAsia="Times New Roman" w:hAnsi="Times New Roman"/>
+          <w:b/>
+          <w:bCs/>
+          <w:sz w:val="22"/>
+          <w:szCs w:val="22"/>
+        </w:rPr>
+        <w:t xml:space="preserve">Responsibilities:</w:t>
+      </w:r>
+    </w:p>
+    <w:p>
+      <w:pPr>
+        <w:spacing w:after="20"/>
       </w:pPr>
       <w:r>
         <w:rPr>
@@ -237,7 +466,7 @@
     </w:p>
     <w:p>
       <w:pPr>
-        <w:spacing w:after="40"/>
+        <w:spacing w:after="20"/>
       </w:pPr>
       <w:r>
         <w:rPr>
@@ -250,7 +479,7 @@
     </w:p>
     <w:p>
       <w:pPr>
-        <w:spacing w:after="40"/>
+        <w:spacing w:after="20"/>
       </w:pPr>
       <w:r>
         <w:rPr>
@@ -263,7 +492,7 @@
     </w:p>
     <w:p>
       <w:pPr>
-        <w:spacing w:after="40"/>
+        <w:spacing w:after="20"/>
       </w:pPr>
       <w:r>
         <w:rPr>
@@ -276,7 +505,7 @@
     </w:p>
     <w:p>
       <w:pPr>
-        <w:spacing w:after="40"/>
+        <w:spacing w:after="20"/>
       </w:pPr>
       <w:r>
         <w:rPr>
@@ -289,54 +518,109 @@
     </w:p>
     <w:p>
       <w:pPr>
+        <w:spacing w:after="20"/>
+      </w:pPr>
+      <w:r>
+        <w:rPr>
+          <w:rFonts w:ascii="Times New Roman" w:cs="Times New Roman" w:eastAsia="Times New Roman" w:hAnsi="Times New Roman"/>
+          <w:sz w:val="22"/>
+          <w:szCs w:val="22"/>
+        </w:rPr>
+        <w:t xml:space="preserve">• Delivered full-stack features with Angular 17 / React; leveraged GitHub Copilot and OpenAI APIs to accelerate development velocity.</w:t>
+      </w:r>
+    </w:p>
+    <w:p>
+      <w:pPr>
         <w:spacing w:after="80"/>
       </w:pPr>
       <w:r>
         <w:rPr>
           <w:rFonts w:ascii="Times New Roman" w:cs="Times New Roman" w:eastAsia="Times New Roman" w:hAnsi="Times New Roman"/>
-          <w:sz w:val="22"/>
-          <w:szCs w:val="22"/>
-        </w:rPr>
-        <w:t xml:space="preserve">• Delivered full-stack features with Angular 17 / React; leveraged GitHub Copilot and OpenAI APIs to accelerate development velocity.</w:t>
-      </w:r>
-    </w:p>
-    <w:p>
-      <w:pPr>
-        <w:keepLines/>
-        <w:spacing w:after="60"/>
-      </w:pPr>
-      <w:r>
-        <w:rPr>
-          <w:rFonts w:ascii="Times New Roman" w:cs="Times New Roman" w:eastAsia="Times New Roman" w:hAnsi="Times New Roman"/>
-          <w:b/>
-          <w:bCs/>
-          <w:sz w:val="22"/>
-          <w:szCs w:val="22"/>
-        </w:rPr>
-        <w:t xml:space="preserve">Java Full Stack Developer</w:t>
-      </w:r>
-      <w:r>
-        <w:rPr>
-          <w:rFonts w:ascii="Times New Roman" w:cs="Times New Roman" w:eastAsia="Times New Roman" w:hAnsi="Times New Roman"/>
-          <w:sz w:val="22"/>
-          <w:szCs w:val="22"/>
-        </w:rPr>
-        <w:t xml:space="preserve">, Corebridge Financial</w:t>
-      </w:r>
-      <w:r>
-        <w:rPr>
-          <w:rFonts w:ascii="Times New Roman" w:cs="Times New Roman" w:eastAsia="Times New Roman" w:hAnsi="Times New Roman"/>
-          <w:i/>
-          <w:iCs/>
-          <w:sz w:val="22"/>
-          <w:szCs w:val="22"/>
-        </w:rPr>
-        <w:t xml:space="preserve">	Feb 2025 – Oct 2025</w:t>
-      </w:r>
-    </w:p>
-    <w:p>
-      <w:pPr>
-        <w:spacing w:after="40"/>
+          <w:b/>
+          <w:bCs/>
+          <w:sz w:val="22"/>
+          <w:szCs w:val="22"/>
+        </w:rPr>
+        <w:t xml:space="preserve">Environment: </w:t>
+      </w:r>
+      <w:r>
+        <w:rPr>
+          <w:rFonts w:ascii="Times New Roman" w:cs="Times New Roman" w:eastAsia="Times New Roman" w:hAnsi="Times New Roman"/>
+          <w:sz w:val="22"/>
+          <w:szCs w:val="22"/>
+        </w:rPr>
+        <w:t xml:space="preserve">Java 17, Spring Boot, Redis, RabbitMQ, Kafka, Oracle, MongoDB, AWS ECS, Docker, Kubernetes, Bitbucket Pipelines, Angular 17, React</w:t>
+      </w:r>
+    </w:p>
+    <w:p>
+      <w:pPr>
+        <w:spacing w:after="40"/>
+      </w:pPr>
+      <w:r>
+        <w:rPr>
+          <w:rFonts w:ascii="Times New Roman" w:cs="Times New Roman" w:eastAsia="Times New Roman" w:hAnsi="Times New Roman"/>
+          <w:b/>
+          <w:bCs/>
+          <w:sz w:val="22"/>
+          <w:szCs w:val="22"/>
+        </w:rPr>
+        <w:t xml:space="preserve">Corebridge Financial | Houston, TX, USA</w:t>
+      </w:r>
+    </w:p>
+    <w:p>
+      <w:pPr>
+        <w:spacing w:after="40"/>
+      </w:pPr>
+      <w:r>
+        <w:rPr>
+          <w:rFonts w:ascii="Times New Roman" w:cs="Times New Roman" w:eastAsia="Times New Roman" w:hAnsi="Times New Roman"/>
+          <w:sz w:val="22"/>
+          <w:szCs w:val="22"/>
+        </w:rPr>
+        <w:t xml:space="preserve">Java Full Stack Developer | Feb 2025 – Oct 2025</w:t>
+      </w:r>
+    </w:p>
+    <w:p>
+      <w:pPr>
+        <w:spacing w:after="40"/>
+      </w:pPr>
+      <w:r>
+        <w:rPr>
+          <w:rFonts w:ascii="Times New Roman" w:cs="Times New Roman" w:eastAsia="Times New Roman" w:hAnsi="Times New Roman"/>
+          <w:b/>
+          <w:bCs/>
+          <w:sz w:val="22"/>
+          <w:szCs w:val="22"/>
+        </w:rPr>
+        <w:t xml:space="preserve">Description: </w:t>
+      </w:r>
+      <w:r>
+        <w:rPr>
+          <w:rFonts w:ascii="Times New Roman" w:cs="Times New Roman" w:eastAsia="Times New Roman" w:hAnsi="Times New Roman"/>
+          <w:sz w:val="22"/>
+          <w:szCs w:val="22"/>
+        </w:rPr>
+        <w:t xml:space="preserve">Leading financial services company specializing in retirement solutions, life insurance, and asset management. Creating user-friendly interfaces for customer portals and agent dashboards.</w:t>
+      </w:r>
+    </w:p>
+    <w:p>
+      <w:pPr>
+        <w:spacing w:after="20"/>
+      </w:pPr>
+      <w:r>
+        <w:rPr>
+          <w:rFonts w:ascii="Times New Roman" w:cs="Times New Roman" w:eastAsia="Times New Roman" w:hAnsi="Times New Roman"/>
+          <w:b/>
+          <w:bCs/>
+          <w:sz w:val="22"/>
+          <w:szCs w:val="22"/>
+        </w:rPr>
+        <w:t xml:space="preserve">Responsibilities:</w:t>
+      </w:r>
+    </w:p>
+    <w:p>
+      <w:pPr>
+        <w:spacing w:after="20"/>
       </w:pPr>
       <w:r>
         <w:rPr>
@@ -349,7 +633,7 @@
     </w:p>
     <w:p>
       <w:pPr>
-        <w:spacing w:after="40"/>
+        <w:spacing w:after="20"/>
       </w:pPr>
       <w:r>
         <w:rPr>
@@ -362,7 +646,7 @@
     </w:p>
     <w:p>
       <w:pPr>
-        <w:spacing w:after="40"/>
+        <w:spacing w:after="20"/>
       </w:pPr>
       <w:r>
         <w:rPr>
@@ -375,7 +659,7 @@
     </w:p>
     <w:p>
       <w:pPr>
-        <w:spacing w:after="40"/>
+        <w:spacing w:after="20"/>
       </w:pPr>
       <w:r>
         <w:rPr>
@@ -388,7 +672,7 @@
     </w:p>
     <w:p>
       <w:pPr>
-        <w:spacing w:after="40"/>
+        <w:spacing w:after="20"/>
       </w:pPr>
       <w:r>
         <w:rPr>
@@ -401,54 +685,109 @@
     </w:p>
     <w:p>
       <w:pPr>
+        <w:spacing w:after="20"/>
+      </w:pPr>
+      <w:r>
+        <w:rPr>
+          <w:rFonts w:ascii="Times New Roman" w:cs="Times New Roman" w:eastAsia="Times New Roman" w:hAnsi="Times New Roman"/>
+          <w:sz w:val="22"/>
+          <w:szCs w:val="22"/>
+        </w:rPr>
+        <w:t xml:space="preserve">• Implemented Jenkins CI/CD pipelines and unit tests with JUnit and Mockito; managed Kafka and RabbitMQ for event-driven processing.</w:t>
+      </w:r>
+    </w:p>
+    <w:p>
+      <w:pPr>
         <w:spacing w:after="80"/>
       </w:pPr>
       <w:r>
         <w:rPr>
           <w:rFonts w:ascii="Times New Roman" w:cs="Times New Roman" w:eastAsia="Times New Roman" w:hAnsi="Times New Roman"/>
-          <w:sz w:val="22"/>
-          <w:szCs w:val="22"/>
-        </w:rPr>
-        <w:t xml:space="preserve">• Implemented Jenkins CI/CD pipelines and unit tests with JUnit and Mockito; managed Kafka and RabbitMQ for event-driven processing.</w:t>
-      </w:r>
-    </w:p>
-    <w:p>
-      <w:pPr>
-        <w:keepLines/>
-        <w:spacing w:after="60"/>
-      </w:pPr>
-      <w:r>
-        <w:rPr>
-          <w:rFonts w:ascii="Times New Roman" w:cs="Times New Roman" w:eastAsia="Times New Roman" w:hAnsi="Times New Roman"/>
-          <w:b/>
-          <w:bCs/>
-          <w:sz w:val="22"/>
-          <w:szCs w:val="22"/>
-        </w:rPr>
-        <w:t xml:space="preserve">Java Full Stack Developer</w:t>
-      </w:r>
-      <w:r>
-        <w:rPr>
-          <w:rFonts w:ascii="Times New Roman" w:cs="Times New Roman" w:eastAsia="Times New Roman" w:hAnsi="Times New Roman"/>
-          <w:sz w:val="22"/>
-          <w:szCs w:val="22"/>
-        </w:rPr>
-        <w:t xml:space="preserve">, ConocoPhillips</w:t>
-      </w:r>
-      <w:r>
-        <w:rPr>
-          <w:rFonts w:ascii="Times New Roman" w:cs="Times New Roman" w:eastAsia="Times New Roman" w:hAnsi="Times New Roman"/>
-          <w:i/>
-          <w:iCs/>
-          <w:sz w:val="22"/>
-          <w:szCs w:val="22"/>
-        </w:rPr>
-        <w:t xml:space="preserve">	Feb 2024 – Dec 2024</w:t>
-      </w:r>
-    </w:p>
-    <w:p>
-      <w:pPr>
-        <w:spacing w:after="40"/>
+          <w:b/>
+          <w:bCs/>
+          <w:sz w:val="22"/>
+          <w:szCs w:val="22"/>
+        </w:rPr>
+        <w:t xml:space="preserve">Environment: </w:t>
+      </w:r>
+      <w:r>
+        <w:rPr>
+          <w:rFonts w:ascii="Times New Roman" w:cs="Times New Roman" w:eastAsia="Times New Roman" w:hAnsi="Times New Roman"/>
+          <w:sz w:val="22"/>
+          <w:szCs w:val="22"/>
+        </w:rPr>
+        <w:t xml:space="preserve">Java, Spring Boot, Hibernate, Angular, React, RESTful APIs, MySQL, PostgreSQL, Docker, Kubernetes, AWS EC2, S3, RDS, Lambda, Jenkins, OAuth2, JWT, Redis, Kafka, RabbitMQ, JUnit, Mockito</w:t>
+      </w:r>
+    </w:p>
+    <w:p>
+      <w:pPr>
+        <w:spacing w:after="40"/>
+      </w:pPr>
+      <w:r>
+        <w:rPr>
+          <w:rFonts w:ascii="Times New Roman" w:cs="Times New Roman" w:eastAsia="Times New Roman" w:hAnsi="Times New Roman"/>
+          <w:b/>
+          <w:bCs/>
+          <w:sz w:val="22"/>
+          <w:szCs w:val="22"/>
+        </w:rPr>
+        <w:t xml:space="preserve">ConocoPhillips | Houston, TX, USA</w:t>
+      </w:r>
+    </w:p>
+    <w:p>
+      <w:pPr>
+        <w:spacing w:after="40"/>
+      </w:pPr>
+      <w:r>
+        <w:rPr>
+          <w:rFonts w:ascii="Times New Roman" w:cs="Times New Roman" w:eastAsia="Times New Roman" w:hAnsi="Times New Roman"/>
+          <w:sz w:val="22"/>
+          <w:szCs w:val="22"/>
+        </w:rPr>
+        <w:t xml:space="preserve">Java Full Stack Developer | Feb 2024 – Dec 2024</w:t>
+      </w:r>
+    </w:p>
+    <w:p>
+      <w:pPr>
+        <w:spacing w:after="40"/>
+      </w:pPr>
+      <w:r>
+        <w:rPr>
+          <w:rFonts w:ascii="Times New Roman" w:cs="Times New Roman" w:eastAsia="Times New Roman" w:hAnsi="Times New Roman"/>
+          <w:b/>
+          <w:bCs/>
+          <w:sz w:val="22"/>
+          <w:szCs w:val="22"/>
+        </w:rPr>
+        <w:t xml:space="preserve">Description: </w:t>
+      </w:r>
+      <w:r>
+        <w:rPr>
+          <w:rFonts w:ascii="Times New Roman" w:cs="Times New Roman" w:eastAsia="Times New Roman" w:hAnsi="Times New Roman"/>
+          <w:sz w:val="22"/>
+          <w:szCs w:val="22"/>
+        </w:rPr>
+        <w:t xml:space="preserve">Leading energy company specializing in hydrocarbon exploration and production. Implementing server-side logic and RESTful APIs for portfolio and asset tracking.</w:t>
+      </w:r>
+    </w:p>
+    <w:p>
+      <w:pPr>
+        <w:spacing w:after="20"/>
+      </w:pPr>
+      <w:r>
+        <w:rPr>
+          <w:rFonts w:ascii="Times New Roman" w:cs="Times New Roman" w:eastAsia="Times New Roman" w:hAnsi="Times New Roman"/>
+          <w:b/>
+          <w:bCs/>
+          <w:sz w:val="22"/>
+          <w:szCs w:val="22"/>
+        </w:rPr>
+        <w:t xml:space="preserve">Responsibilities:</w:t>
+      </w:r>
+    </w:p>
+    <w:p>
+      <w:pPr>
+        <w:spacing w:after="20"/>
       </w:pPr>
       <w:r>
         <w:rPr>
@@ -461,7 +800,7 @@
     </w:p>
     <w:p>
       <w:pPr>
-        <w:spacing w:after="40"/>
+        <w:spacing w:after="20"/>
       </w:pPr>
       <w:r>
         <w:rPr>
@@ -474,7 +813,7 @@
     </w:p>
     <w:p>
       <w:pPr>
-        <w:spacing w:after="40"/>
+        <w:spacing w:after="20"/>
       </w:pPr>
       <w:r>
         <w:rPr>
@@ -487,54 +826,109 @@
     </w:p>
     <w:p>
       <w:pPr>
+        <w:spacing w:after="20"/>
+      </w:pPr>
+      <w:r>
+        <w:rPr>
+          <w:rFonts w:ascii="Times New Roman" w:cs="Times New Roman" w:eastAsia="Times New Roman" w:hAnsi="Times New Roman"/>
+          <w:sz w:val="22"/>
+          <w:szCs w:val="22"/>
+        </w:rPr>
+        <w:t xml:space="preserve">• Utilized Kubernetes for container orchestration; implemented GraphQL APIs and WebSocket for real-time data flow.</w:t>
+      </w:r>
+    </w:p>
+    <w:p>
+      <w:pPr>
         <w:spacing w:after="80"/>
       </w:pPr>
       <w:r>
         <w:rPr>
           <w:rFonts w:ascii="Times New Roman" w:cs="Times New Roman" w:eastAsia="Times New Roman" w:hAnsi="Times New Roman"/>
-          <w:sz w:val="22"/>
-          <w:szCs w:val="22"/>
-        </w:rPr>
-        <w:t xml:space="preserve">• Utilized Kubernetes for container orchestration; implemented GraphQL APIs and WebSocket for real-time data flow.</w:t>
-      </w:r>
-    </w:p>
-    <w:p>
-      <w:pPr>
-        <w:keepLines/>
-        <w:spacing w:after="60"/>
-      </w:pPr>
-      <w:r>
-        <w:rPr>
-          <w:rFonts w:ascii="Times New Roman" w:cs="Times New Roman" w:eastAsia="Times New Roman" w:hAnsi="Times New Roman"/>
-          <w:b/>
-          <w:bCs/>
-          <w:sz w:val="22"/>
-          <w:szCs w:val="22"/>
-        </w:rPr>
-        <w:t xml:space="preserve">Java Developer</w:t>
-      </w:r>
-      <w:r>
-        <w:rPr>
-          <w:rFonts w:ascii="Times New Roman" w:cs="Times New Roman" w:eastAsia="Times New Roman" w:hAnsi="Times New Roman"/>
-          <w:sz w:val="22"/>
-          <w:szCs w:val="22"/>
-        </w:rPr>
-        <w:t xml:space="preserve">, Infosys (HDFC Life)</w:t>
-      </w:r>
-      <w:r>
-        <w:rPr>
-          <w:rFonts w:ascii="Times New Roman" w:cs="Times New Roman" w:eastAsia="Times New Roman" w:hAnsi="Times New Roman"/>
-          <w:i/>
-          <w:iCs/>
-          <w:sz w:val="22"/>
-          <w:szCs w:val="22"/>
-        </w:rPr>
-        <w:t xml:space="preserve">	Dec 2020 – Dec 2022</w:t>
-      </w:r>
-    </w:p>
-    <w:p>
-      <w:pPr>
-        <w:spacing w:after="40"/>
+          <w:b/>
+          <w:bCs/>
+          <w:sz w:val="22"/>
+          <w:szCs w:val="22"/>
+        </w:rPr>
+        <w:t xml:space="preserve">Environment: </w:t>
+      </w:r>
+      <w:r>
+        <w:rPr>
+          <w:rFonts w:ascii="Times New Roman" w:cs="Times New Roman" w:eastAsia="Times New Roman" w:hAnsi="Times New Roman"/>
+          <w:sz w:val="22"/>
+          <w:szCs w:val="22"/>
+        </w:rPr>
+        <w:t xml:space="preserve">Spring Boot, RESTful APIs, React, HTML5, Angular, Jenkins, JUnit, Mockito, Selenium, Docker, Terraform, Ansible, Kubernetes, Oracle, MySQL, GraphQL, WebSocket</w:t>
+      </w:r>
+    </w:p>
+    <w:p>
+      <w:pPr>
+        <w:spacing w:after="40"/>
+      </w:pPr>
+      <w:r>
+        <w:rPr>
+          <w:rFonts w:ascii="Times New Roman" w:cs="Times New Roman" w:eastAsia="Times New Roman" w:hAnsi="Times New Roman"/>
+          <w:b/>
+          <w:bCs/>
+          <w:sz w:val="22"/>
+          <w:szCs w:val="22"/>
+        </w:rPr>
+        <w:t xml:space="preserve">Infosys (HDFC Life) | Mumbai, India</w:t>
+      </w:r>
+    </w:p>
+    <w:p>
+      <w:pPr>
+        <w:spacing w:after="40"/>
+      </w:pPr>
+      <w:r>
+        <w:rPr>
+          <w:rFonts w:ascii="Times New Roman" w:cs="Times New Roman" w:eastAsia="Times New Roman" w:hAnsi="Times New Roman"/>
+          <w:sz w:val="22"/>
+          <w:szCs w:val="22"/>
+        </w:rPr>
+        <w:t xml:space="preserve">Java Developer | Dec 2020 – Dec 2022</w:t>
+      </w:r>
+    </w:p>
+    <w:p>
+      <w:pPr>
+        <w:spacing w:after="40"/>
+      </w:pPr>
+      <w:r>
+        <w:rPr>
+          <w:rFonts w:ascii="Times New Roman" w:cs="Times New Roman" w:eastAsia="Times New Roman" w:hAnsi="Times New Roman"/>
+          <w:b/>
+          <w:bCs/>
+          <w:sz w:val="22"/>
+          <w:szCs w:val="22"/>
+        </w:rPr>
+        <w:t xml:space="preserve">Description: </w:t>
+      </w:r>
+      <w:r>
+        <w:rPr>
+          <w:rFonts w:ascii="Times New Roman" w:cs="Times New Roman" w:eastAsia="Times New Roman" w:hAnsi="Times New Roman"/>
+          <w:sz w:val="22"/>
+          <w:szCs w:val="22"/>
+        </w:rPr>
+        <w:t xml:space="preserve">Leading life insurance provider. Developing RESTful services and MVC modules for insurance policy and claims processing.</w:t>
+      </w:r>
+    </w:p>
+    <w:p>
+      <w:pPr>
+        <w:spacing w:after="20"/>
+      </w:pPr>
+      <w:r>
+        <w:rPr>
+          <w:rFonts w:ascii="Times New Roman" w:cs="Times New Roman" w:eastAsia="Times New Roman" w:hAnsi="Times New Roman"/>
+          <w:b/>
+          <w:bCs/>
+          <w:sz w:val="22"/>
+          <w:szCs w:val="22"/>
+        </w:rPr>
+        <w:t xml:space="preserve">Responsibilities:</w:t>
+      </w:r>
+    </w:p>
+    <w:p>
+      <w:pPr>
+        <w:spacing w:after="20"/>
       </w:pPr>
       <w:r>
         <w:rPr>
@@ -547,7 +941,7 @@
     </w:p>
     <w:p>
       <w:pPr>
-        <w:spacing w:after="40"/>
+        <w:spacing w:after="20"/>
       </w:pPr>
       <w:r>
         <w:rPr>
@@ -560,7 +954,7 @@
     </w:p>
     <w:p>
       <w:pPr>
-        <w:spacing w:after="40"/>
+        <w:spacing w:after="20"/>
       </w:pPr>
       <w:r>
         <w:rPr>
@@ -573,7 +967,7 @@
     </w:p>
     <w:p>
       <w:pPr>
-        <w:spacing w:after="40"/>
+        <w:spacing w:after="20"/>
       </w:pPr>
       <w:r>
         <w:rPr>
@@ -586,54 +980,109 @@
     </w:p>
     <w:p>
       <w:pPr>
+        <w:spacing w:after="20"/>
+      </w:pPr>
+      <w:r>
+        <w:rPr>
+          <w:rFonts w:ascii="Times New Roman" w:cs="Times New Roman" w:eastAsia="Times New Roman" w:hAnsi="Times New Roman"/>
+          <w:sz w:val="22"/>
+          <w:szCs w:val="22"/>
+        </w:rPr>
+        <w:t xml:space="preserve">• Developed unit and integration tests with JUnit, TestNG, and Mockito; built dashboards with Microsoft Power BI.</w:t>
+      </w:r>
+    </w:p>
+    <w:p>
+      <w:pPr>
         <w:spacing w:after="80"/>
       </w:pPr>
       <w:r>
         <w:rPr>
           <w:rFonts w:ascii="Times New Roman" w:cs="Times New Roman" w:eastAsia="Times New Roman" w:hAnsi="Times New Roman"/>
-          <w:sz w:val="22"/>
-          <w:szCs w:val="22"/>
-        </w:rPr>
-        <w:t xml:space="preserve">• Developed unit and integration tests with JUnit, TestNG, and Mockito; built dashboards with Microsoft Power BI.</w:t>
-      </w:r>
-    </w:p>
-    <w:p>
-      <w:pPr>
-        <w:keepLines/>
-        <w:spacing w:after="60"/>
-      </w:pPr>
-      <w:r>
-        <w:rPr>
-          <w:rFonts w:ascii="Times New Roman" w:cs="Times New Roman" w:eastAsia="Times New Roman" w:hAnsi="Times New Roman"/>
-          <w:b/>
-          <w:bCs/>
-          <w:sz w:val="22"/>
-          <w:szCs w:val="22"/>
-        </w:rPr>
-        <w:t xml:space="preserve">Java Full Stack Developer</w:t>
-      </w:r>
-      <w:r>
-        <w:rPr>
-          <w:rFonts w:ascii="Times New Roman" w:cs="Times New Roman" w:eastAsia="Times New Roman" w:hAnsi="Times New Roman"/>
-          <w:sz w:val="22"/>
-          <w:szCs w:val="22"/>
-        </w:rPr>
-        <w:t xml:space="preserve">, Elder Pharmaceuticals</w:t>
-      </w:r>
-      <w:r>
-        <w:rPr>
-          <w:rFonts w:ascii="Times New Roman" w:cs="Times New Roman" w:eastAsia="Times New Roman" w:hAnsi="Times New Roman"/>
-          <w:i/>
-          <w:iCs/>
-          <w:sz w:val="22"/>
-          <w:szCs w:val="22"/>
-        </w:rPr>
-        <w:t xml:space="preserve">	Jun 2019 – Dec 2020</w:t>
-      </w:r>
-    </w:p>
-    <w:p>
-      <w:pPr>
-        <w:spacing w:after="40"/>
+          <w:b/>
+          <w:bCs/>
+          <w:sz w:val="22"/>
+          <w:szCs w:val="22"/>
+        </w:rPr>
+        <w:t xml:space="preserve">Environment: </w:t>
+      </w:r>
+      <w:r>
+        <w:rPr>
+          <w:rFonts w:ascii="Times New Roman" w:cs="Times New Roman" w:eastAsia="Times New Roman" w:hAnsi="Times New Roman"/>
+          <w:sz w:val="22"/>
+          <w:szCs w:val="22"/>
+        </w:rPr>
+        <w:t xml:space="preserve">Spring MVC, Servlet/JSP, Hibernate, AngularJS, React, Node.js, ASP.NET Web API, Oracle, Redis, Memcached, Docker, Jenkins, Kubernetes, OAuth2, JWT, JUnit, TestNG, Mockito, Power BI</w:t>
+      </w:r>
+    </w:p>
+    <w:p>
+      <w:pPr>
+        <w:spacing w:after="40"/>
+      </w:pPr>
+      <w:r>
+        <w:rPr>
+          <w:rFonts w:ascii="Times New Roman" w:cs="Times New Roman" w:eastAsia="Times New Roman" w:hAnsi="Times New Roman"/>
+          <w:b/>
+          <w:bCs/>
+          <w:sz w:val="22"/>
+          <w:szCs w:val="22"/>
+        </w:rPr>
+        <w:t xml:space="preserve">Elder Pharmaceuticals | Mumbai, India</w:t>
+      </w:r>
+    </w:p>
+    <w:p>
+      <w:pPr>
+        <w:spacing w:after="40"/>
+      </w:pPr>
+      <w:r>
+        <w:rPr>
+          <w:rFonts w:ascii="Times New Roman" w:cs="Times New Roman" w:eastAsia="Times New Roman" w:hAnsi="Times New Roman"/>
+          <w:sz w:val="22"/>
+          <w:szCs w:val="22"/>
+        </w:rPr>
+        <w:t xml:space="preserve">Java Full Stack Developer | Jun 2019 – Dec 2020</w:t>
+      </w:r>
+    </w:p>
+    <w:p>
+      <w:pPr>
+        <w:spacing w:after="40"/>
+      </w:pPr>
+      <w:r>
+        <w:rPr>
+          <w:rFonts w:ascii="Times New Roman" w:cs="Times New Roman" w:eastAsia="Times New Roman" w:hAnsi="Times New Roman"/>
+          <w:b/>
+          <w:bCs/>
+          <w:sz w:val="22"/>
+          <w:szCs w:val="22"/>
+        </w:rPr>
+        <w:t xml:space="preserve">Description: </w:t>
+      </w:r>
+      <w:r>
+        <w:rPr>
+          <w:rFonts w:ascii="Times New Roman" w:cs="Times New Roman" w:eastAsia="Times New Roman" w:hAnsi="Times New Roman"/>
+          <w:sz w:val="22"/>
+          <w:szCs w:val="22"/>
+        </w:rPr>
+        <w:t xml:space="preserve">Pharmaceutical company manufacturing and marketing pharmaceutical products. Developing APIs and web services for ERP integration and production monitoring.</w:t>
+      </w:r>
+    </w:p>
+    <w:p>
+      <w:pPr>
+        <w:spacing w:after="20"/>
+      </w:pPr>
+      <w:r>
+        <w:rPr>
+          <w:rFonts w:ascii="Times New Roman" w:cs="Times New Roman" w:eastAsia="Times New Roman" w:hAnsi="Times New Roman"/>
+          <w:b/>
+          <w:bCs/>
+          <w:sz w:val="22"/>
+          <w:szCs w:val="22"/>
+        </w:rPr>
+        <w:t xml:space="preserve">Responsibilities:</w:t>
+      </w:r>
+    </w:p>
+    <w:p>
+      <w:pPr>
+        <w:spacing w:after="20"/>
       </w:pPr>
       <w:r>
         <w:rPr>
@@ -646,7 +1095,7 @@
     </w:p>
     <w:p>
       <w:pPr>
-        <w:spacing w:after="40"/>
+        <w:spacing w:after="20"/>
       </w:pPr>
       <w:r>
         <w:rPr>
@@ -659,7 +1108,7 @@
     </w:p>
     <w:p>
       <w:pPr>
-        <w:spacing w:after="40"/>
+        <w:spacing w:after="20"/>
       </w:pPr>
       <w:r>
         <w:rPr>
@@ -672,7 +1121,7 @@
     </w:p>
     <w:p>
       <w:pPr>
-        <w:spacing w:after="40"/>
+        <w:spacing w:after="20"/>
       </w:pPr>
       <w:r>
         <w:rPr>
@@ -685,15 +1134,38 @@
     </w:p>
     <w:p>
       <w:pPr>
+        <w:spacing w:after="20"/>
+      </w:pPr>
+      <w:r>
+        <w:rPr>
+          <w:rFonts w:ascii="Times New Roman" w:cs="Times New Roman" w:eastAsia="Times New Roman" w:hAnsi="Times New Roman"/>
+          <w:sz w:val="22"/>
+          <w:szCs w:val="22"/>
+        </w:rPr>
+        <w:t xml:space="preserve">• Automated CI/CD with Jenkins, Git, JUnit, Selenium, and Maven for pharmaceutical compliance systems.</w:t>
+      </w:r>
+    </w:p>
+    <w:p>
+      <w:pPr>
         <w:spacing w:after="80"/>
       </w:pPr>
       <w:r>
         <w:rPr>
           <w:rFonts w:ascii="Times New Roman" w:cs="Times New Roman" w:eastAsia="Times New Roman" w:hAnsi="Times New Roman"/>
-          <w:sz w:val="22"/>
-          <w:szCs w:val="22"/>
-        </w:rPr>
-        <w:t xml:space="preserve">• Automated CI/CD with Jenkins, Git, JUnit, Selenium, and Maven for pharmaceutical compliance systems.</w:t>
+          <w:b/>
+          <w:bCs/>
+          <w:sz w:val="22"/>
+          <w:szCs w:val="22"/>
+        </w:rPr>
+        <w:t xml:space="preserve">Environment: </w:t>
+      </w:r>
+      <w:r>
+        <w:rPr>
+          <w:rFonts w:ascii="Times New Roman" w:cs="Times New Roman" w:eastAsia="Times New Roman" w:hAnsi="Times New Roman"/>
+          <w:sz w:val="22"/>
+          <w:szCs w:val="22"/>
+        </w:rPr>
+        <w:t xml:space="preserve">Spring Boot, Node.js, AngularJS, React, HTML5, CSS3, Bootstrap, RESTful APIs, OAuth2, JWT, Oracle, DB2, PostgreSQL, Apache Kafka, Apache NiFi, Jenkins, Git, JUnit, Selenium, Maven, Power BI</w:t>
       </w:r>
     </w:p>
     <w:p>
@@ -711,7 +1183,7 @@
           <w:sz w:val="24"/>
           <w:szCs w:val="24"/>
         </w:rPr>
-        <w:t xml:space="preserve">Certifications</w:t>
+        <w:t xml:space="preserve">CERTIFICATIONS</w:t>
       </w:r>
     </w:p>
     <w:p>
@@ -822,7 +1294,7 @@
           <w:sz w:val="24"/>
           <w:szCs w:val="24"/>
         </w:rPr>
-        <w:t xml:space="preserve">Education</w:t>
+        <w:t xml:space="preserve">EDUCATION</w:t>
       </w:r>
     </w:p>
     <w:p>
@@ -912,7 +1384,7 @@
           <w:sz w:val="24"/>
           <w:szCs w:val="24"/>
         </w:rPr>
-        <w:t xml:space="preserve">Key Projects</w:t>
+        <w:t xml:space="preserve">KEY PROJECTS</w:t>
       </w:r>
     </w:p>
     <w:p>

</xml_diff>

<commit_message>
Production-ready refactor: centralize data, add validation, fix scripts, ESLint
- Single source of truth: Education, Certifications, Projects, Contact from resume-data.js
- Contact form: validation (name 2-100, email, message 10-2000), better error handling
- DOCX script: dynamic education loop, use data.header for location/links
- PDF script: null checks for optional fields
- Remove dead code: technicalSkillsGrid, unused color/cardColor
- Add ESLint config, use next/link for internal routes
- Add REVIEW.md with full code review

Made-with: Cursor
</commit_message>
<xml_diff>
--- a/public/resume.docx
+++ b/public/resume.docx
@@ -67,7 +67,7 @@
         </w:rPr>
         <w:t xml:space="preserve">Tampa, FL, USA  |  </w:t>
       </w:r>
-      <w:hyperlink w:history="1" r:id="rIdivwmtmbw0se0s6tb4jpty">
+      <w:hyperlink w:history="1" r:id="rIdvzojjdh3fkzxtdnb2qug9">
         <w:r>
           <w:rPr>
             <w:rStyle w:val="Hyperlink"/>
@@ -75,7 +75,7 @@
             <w:sz w:val="22"/>
             <w:szCs w:val="22"/>
           </w:rPr>
-          <w:t xml:space="preserve">linkedin.com/in/ganeshg7</w:t>
+          <w:t xml:space="preserve">www.linkedin.com/in/ganeshg7</w:t>
         </w:r>
       </w:hyperlink>
       <w:r>
@@ -86,7 +86,7 @@
         </w:rPr>
         <w:t xml:space="preserve">  |  </w:t>
       </w:r>
-      <w:hyperlink w:history="1" r:id="rIddzgkocg-tsxgew-iog3rj">
+      <w:hyperlink w:history="1" r:id="rIdxu0xsmjcw2qpgdzrb_w01">
         <w:r>
           <w:rPr>
             <w:rStyle w:val="Hyperlink"/>
@@ -717,15 +717,15 @@
           <w:sz w:val="22"/>
           <w:szCs w:val="22"/>
         </w:rPr>
-        <w:t xml:space="preserve">Master of Science, Information Technology Management</w:t>
-      </w:r>
-      <w:r>
-        <w:rPr>
-          <w:rFonts w:ascii="Times New Roman" w:cs="Times New Roman" w:eastAsia="Times New Roman" w:hAnsi="Times New Roman"/>
-          <w:sz w:val="22"/>
-          <w:szCs w:val="22"/>
-        </w:rPr>
-        <w:t xml:space="preserve">, Indiana Wesleyan University, IN</w:t>
+        <w:t xml:space="preserve">Master's Degree, Information Technology Management</w:t>
+      </w:r>
+      <w:r>
+        <w:rPr>
+          <w:rFonts w:ascii="Times New Roman" w:cs="Times New Roman" w:eastAsia="Times New Roman" w:hAnsi="Times New Roman"/>
+          <w:sz w:val="22"/>
+          <w:szCs w:val="22"/>
+        </w:rPr>
+        <w:t xml:space="preserve">, Indiana Wesleyan University</w:t>
       </w:r>
     </w:p>
     <w:p>
@@ -753,15 +753,15 @@
           <w:sz w:val="22"/>
           <w:szCs w:val="22"/>
         </w:rPr>
-        <w:t xml:space="preserve">Bachelor of Engineering, Electronics and Communication Engineering</w:t>
-      </w:r>
-      <w:r>
-        <w:rPr>
-          <w:rFonts w:ascii="Times New Roman" w:cs="Times New Roman" w:eastAsia="Times New Roman" w:hAnsi="Times New Roman"/>
-          <w:sz w:val="22"/>
-          <w:szCs w:val="22"/>
-        </w:rPr>
-        <w:t xml:space="preserve">, Karunya Institute of Technology, Coimbatore, India</w:t>
+        <w:t xml:space="preserve">Bachelor's Degree, Electrical, Electronics and Communications Engineering</w:t>
+      </w:r>
+      <w:r>
+        <w:rPr>
+          <w:rFonts w:ascii="Times New Roman" w:cs="Times New Roman" w:eastAsia="Times New Roman" w:hAnsi="Times New Roman"/>
+          <w:sz w:val="22"/>
+          <w:szCs w:val="22"/>
+        </w:rPr>
+        <w:t xml:space="preserve">, Karunya Institute of Technology and Sciences</w:t>
       </w:r>
     </w:p>
     <w:p>
@@ -846,6 +846,37 @@
           <w:sz w:val="22"/>
           <w:szCs w:val="22"/>
         </w:rPr>
+        <w:t xml:space="preserve">Investment Portfolio Manager</w:t>
+      </w:r>
+      <w:r>
+        <w:rPr>
+          <w:rFonts w:ascii="Times New Roman" w:cs="Times New Roman" w:eastAsia="Times New Roman" w:hAnsi="Times New Roman"/>
+          <w:sz w:val="22"/>
+          <w:szCs w:val="22"/>
+        </w:rPr>
+        <w:t xml:space="preserve"> — Full stack investment portfolio management system for tracking assets, monitoring portfolio performance, and analyzing financial data using Spring Boot and React.</w:t>
+      </w:r>
+    </w:p>
+    <w:p>
+      <w:pPr>
+        <w:spacing w:after="60"/>
+      </w:pPr>
+      <w:r>
+        <w:rPr>
+          <w:rFonts w:ascii="Times New Roman" w:cs="Times New Roman" w:eastAsia="Times New Roman" w:hAnsi="Times New Roman"/>
+          <w:sz w:val="22"/>
+          <w:szCs w:val="22"/>
+        </w:rPr>
+        <w:t xml:space="preserve">• </w:t>
+      </w:r>
+      <w:r>
+        <w:rPr>
+          <w:rFonts w:ascii="Times New Roman" w:cs="Times New Roman" w:eastAsia="Times New Roman" w:hAnsi="Times New Roman"/>
+          <w:b/>
+          <w:bCs/>
+          <w:sz w:val="22"/>
+          <w:szCs w:val="22"/>
+        </w:rPr>
         <w:t xml:space="preserve">Smart Restaurant Platform</w:t>
       </w:r>
       <w:r>
@@ -854,7 +885,7 @@
           <w:sz w:val="22"/>
           <w:szCs w:val="22"/>
         </w:rPr>
-        <w:t xml:space="preserve"> — Built full-stack restaurant management platform handling menu, orders, inventory, and sales analytics using Spring Boot, React, and MySQL.</w:t>
+        <w:t xml:space="preserve"> — Full-stack web application for managing restaurant operations: menu management, order processing, inventory tracking, and sales analytics. Built with Spring Boot, React, and MySQL.</w:t>
       </w:r>
     </w:p>
     <w:p>
@@ -885,7 +916,38 @@
           <w:sz w:val="22"/>
           <w:szCs w:val="22"/>
         </w:rPr>
-        <w:t xml:space="preserve"> — Built REST API for user management and authentication with Spring Boot, JPA, and H2.</w:t>
+        <w:t xml:space="preserve"> — REST API for user management with authentication and role-based access. Built with Spring Boot, JPA, and H2.</w:t>
+      </w:r>
+    </w:p>
+    <w:p>
+      <w:pPr>
+        <w:spacing w:after="60"/>
+      </w:pPr>
+      <w:r>
+        <w:rPr>
+          <w:rFonts w:ascii="Times New Roman" w:cs="Times New Roman" w:eastAsia="Times New Roman" w:hAnsi="Times New Roman"/>
+          <w:sz w:val="22"/>
+          <w:szCs w:val="22"/>
+        </w:rPr>
+        <w:t xml:space="preserve">• </w:t>
+      </w:r>
+      <w:r>
+        <w:rPr>
+          <w:rFonts w:ascii="Times New Roman" w:cs="Times New Roman" w:eastAsia="Times New Roman" w:hAnsi="Times New Roman"/>
+          <w:b/>
+          <w:bCs/>
+          <w:sz w:val="22"/>
+          <w:szCs w:val="22"/>
+        </w:rPr>
+        <w:t xml:space="preserve">Restaurant Order Service</w:t>
+      </w:r>
+      <w:r>
+        <w:rPr>
+          <w:rFonts w:ascii="Times New Roman" w:cs="Times New Roman" w:eastAsia="Times New Roman" w:hAnsi="Times New Roman"/>
+          <w:sz w:val="22"/>
+          <w:szCs w:val="22"/>
+        </w:rPr>
+        <w:t xml:space="preserve"> — Spring Boot microservice for restaurant order management. Handles order lifecycle and integration with other services.</w:t>
       </w:r>
     </w:p>
     <w:sectPr>

</xml_diff>